<commit_message>
2.1 Justificativa das melhorias
</commit_message>
<xml_diff>
--- a/Engenharia_de_Software/Trabalho_m1/Docs_V2/Trabalho_V2.docx
+++ b/Engenharia_de_Software/Trabalho_m1/Docs_V2/Trabalho_V2.docx
@@ -16,6 +16,7 @@
       <w:r>
         <w:rPr>
           <w:noProof/>
+          <w:lang w:val="pt-BR" w:eastAsia="pt-BR"/>
         </w:rPr>
         <w:drawing>
           <wp:inline distT="114300" distB="114300" distL="114300" distR="114300" wp14:anchorId="0E28F064" wp14:editId="539AF2FC">
@@ -2407,21 +2408,12 @@
     </w:p>
     <w:p>
       <w:r>
-        <w:t>As unidades públicas de saúde frequentemente enfrentam dificuldades relacionadas ao gerenciamento de filas de atendimento, principalmente em horários de maior</w:t>
-      </w:r>
-      <w:r>
-        <w:t xml:space="preserve"> demanda. Em muitos casos, pacientes aguardam longos períodos sem uma organização adequada baseada na gravidade clínica, o que pode comprometer a qualidade do atendimento e aumentar riscos para casos urgentes. Além disso, a ausência de transparência no pro</w:t>
-      </w:r>
-      <w:r>
-        <w:t>cesso gera insegurança tanto para pacientes quanto para profissionais de saúde.</w:t>
+        <w:t>As unidades públicas de saúde frequentemente enfrentam dificuldades relacionadas ao gerenciamento de filas de atendimento, principalmente em horários de maior demanda. Em muitos casos, pacientes aguardam longos períodos sem uma organização adequada baseada na gravidade clínica, o que pode comprometer a qualidade do atendimento e aumentar riscos para casos urgentes. Além disso, a ausência de transparência no processo gera insegurança tanto para pacientes quanto para profissionais de saúde.</w:t>
       </w:r>
     </w:p>
     <w:p>
       <w:r>
-        <w:t>Diante desse cenário, o projeto propõe o desenvolvimento do KGE System, um sistema de apoio ao atendimento comunitário em unidades públicas de saúde. A solução busca auxiliar p</w:t>
-      </w:r>
-      <w:r>
-        <w:t>rofissionais na organização da fila de atendimento, priorizando pacientes conforme critérios clínicos e reduzindo o tempo de espera em situações críticas.</w:t>
+        <w:t>Diante desse cenário, o projeto propõe o desenvolvimento do KGE System, um sistema de apoio ao atendimento comunitário em unidades públicas de saúde. A solução busca auxiliar profissionais na organização da fila de atendimento, priorizando pacientes conforme critérios clínicos e reduzindo o tempo de espera em situações críticas.</w:t>
       </w:r>
     </w:p>
     <w:p>
@@ -2434,13 +2426,7 @@
     </w:p>
     <w:p>
       <w:r>
-        <w:t>O objetivo do KGE System é auxiliar unidades públicas de saúde no gerenciamen</w:t>
-      </w:r>
-      <w:r>
-        <w:t>to da fila de atendimento de pacientes, organizando os atendimentos conforme níveis de prioridade clínica definidos durante a triagem. O sistema pretende melhorar a eficiência do processo de atendimento, reduzir o tempo de espera para casos graves e fornec</w:t>
-      </w:r>
-      <w:r>
-        <w:t>er maior transparência sobre a fila e o tempo estimado de atendimento.</w:t>
+        <w:t>O objetivo do KGE System é auxiliar unidades públicas de saúde no gerenciamento da fila de atendimento de pacientes, organizando os atendimentos conforme níveis de prioridade clínica definidos durante a triagem. O sistema pretende melhorar a eficiência do processo de atendimento, reduzir o tempo de espera para casos graves e fornecer maior transparência sobre a fila e o tempo estimado de atendimento.</w:t>
       </w:r>
     </w:p>
     <w:p>
@@ -2461,10 +2447,7 @@
         <w:pStyle w:val="Commarcadores"/>
       </w:pPr>
       <w:r>
-        <w:t>P</w:t>
-      </w:r>
-      <w:r>
-        <w:t>úblico-alvo:</w:t>
+        <w:t>Público-alvo:</w:t>
       </w:r>
     </w:p>
     <w:p>
@@ -2545,10 +2528,7 @@
         <w:pStyle w:val="Commarcadores2"/>
       </w:pPr>
       <w:r>
-        <w:t xml:space="preserve">Universidade e </w:t>
-      </w:r>
-      <w:r>
-        <w:t>equipe do projeto de extensão</w:t>
+        <w:t>Universidade e equipe do projeto de extensão</w:t>
       </w:r>
     </w:p>
     <w:p>
@@ -2815,12 +2795,30 @@
     </w:p>
     <w:p>
       <w:pPr>
+        <w:pStyle w:val="Ttulo2"/>
+      </w:pPr>
+      <w:r>
+        <w:lastRenderedPageBreak/>
+        <w:t>2.1 Justificativa das melhorias</w:t>
+      </w:r>
+    </w:p>
+    <w:p>
+      <w:pPr>
+        <w:pStyle w:val="NormalWeb"/>
+      </w:pPr>
+      <w:r>
+        <w:t>O processo proposto busca melhorar a organização do atendimento em unidades públicas de saúde por meio da priorização dinâmica de pacientes conforme critérios clínicos definidos durante a triagem. Diferente de processos tradicionais baseados apenas em ordem de chegada, o sistema organiza automaticamente a fila conforme o nível de risco do paciente, reduzindo o tempo de espera para casos graves. Além disso, o processo aumenta a transparência do atendimento ao disponibilizar informações sobre a fila e o tempo estimado de espera. A utilização de um fluxo padronizado também contribui para maior controle operacional e apoio à tomada de decisão pelos profissionais da unidade.</w:t>
+      </w:r>
+    </w:p>
+    <w:p>
+      <w:pPr>
         <w:pStyle w:val="Ttulo1"/>
         <w:keepNext w:val="0"/>
         <w:keepLines w:val="0"/>
       </w:pPr>
+      <w:bookmarkStart w:id="1" w:name="_GoBack"/>
+      <w:bookmarkEnd w:id="1"/>
       <w:r>
-        <w:lastRenderedPageBreak/>
         <w:t>3. REQUISITOS (máx. 2 páginas)</w:t>
       </w:r>
     </w:p>
@@ -2830,8 +2828,8 @@
         <w:keepNext w:val="0"/>
         <w:keepLines w:val="0"/>
       </w:pPr>
-      <w:bookmarkStart w:id="1" w:name="_656pbtmwrgxa" w:colFirst="0" w:colLast="0"/>
-      <w:bookmarkEnd w:id="1"/>
+      <w:bookmarkStart w:id="2" w:name="_656pbtmwrgxa" w:colFirst="0" w:colLast="0"/>
+      <w:bookmarkEnd w:id="2"/>
       <w:r>
         <w:t>3.1 Requisitos Funcionais (RF) — 10 a 12 (testáveis)</w:t>
       </w:r>
@@ -2850,8 +2848,8 @@
         <w:keepNext w:val="0"/>
         <w:keepLines w:val="0"/>
       </w:pPr>
-      <w:bookmarkStart w:id="2" w:name="_qmldiq7pqgpa" w:colFirst="0" w:colLast="0"/>
-      <w:bookmarkEnd w:id="2"/>
+      <w:bookmarkStart w:id="3" w:name="_qmldiq7pqgpa" w:colFirst="0" w:colLast="0"/>
+      <w:bookmarkEnd w:id="3"/>
       <w:r>
         <w:t>3.2 Requisitos Não Funcionais (RNF) — 6 (inclui 1 acessibilidade)</w:t>
       </w:r>
@@ -2870,8 +2868,8 @@
         <w:keepNext w:val="0"/>
         <w:keepLines w:val="0"/>
       </w:pPr>
-      <w:bookmarkStart w:id="3" w:name="_o62vlyehbcbr" w:colFirst="0" w:colLast="0"/>
-      <w:bookmarkEnd w:id="3"/>
+      <w:bookmarkStart w:id="4" w:name="_o62vlyehbcbr" w:colFirst="0" w:colLast="0"/>
+      <w:bookmarkEnd w:id="4"/>
       <w:r>
         <w:t>3.3 Regras de negócio (RN) — 6 a 10</w:t>
       </w:r>
@@ -2891,8 +2889,8 @@
         <w:keepLines w:val="0"/>
         <w:ind w:left="720" w:hanging="360"/>
       </w:pPr>
-      <w:bookmarkStart w:id="4" w:name="_mat5lqmlm4e2" w:colFirst="0" w:colLast="0"/>
-      <w:bookmarkEnd w:id="4"/>
+      <w:bookmarkStart w:id="5" w:name="_mat5lqmlm4e2" w:colFirst="0" w:colLast="0"/>
+      <w:bookmarkEnd w:id="5"/>
       <w:r>
         <w:t>4. CASOS DE USO (V1)</w:t>
       </w:r>
@@ -2903,8 +2901,8 @@
         <w:keepNext w:val="0"/>
         <w:keepLines w:val="0"/>
       </w:pPr>
-      <w:bookmarkStart w:id="5" w:name="_y1vilklbtfdm" w:colFirst="0" w:colLast="0"/>
-      <w:bookmarkEnd w:id="5"/>
+      <w:bookmarkStart w:id="6" w:name="_y1vilklbtfdm" w:colFirst="0" w:colLast="0"/>
+      <w:bookmarkEnd w:id="6"/>
       <w:r>
         <w:t>4.1 Diagrama de casos de uso (1 página)</w:t>
       </w:r>
@@ -2915,8 +2913,8 @@
         <w:keepNext w:val="0"/>
         <w:keepLines w:val="0"/>
       </w:pPr>
-      <w:bookmarkStart w:id="6" w:name="_shwfi58e0sv4" w:colFirst="0" w:colLast="0"/>
-      <w:bookmarkEnd w:id="6"/>
+      <w:bookmarkStart w:id="7" w:name="_shwfi58e0sv4" w:colFirst="0" w:colLast="0"/>
+      <w:bookmarkEnd w:id="7"/>
       <w:r>
         <w:t>4.2 Especificação detalhada de 3 UCs (obrigatório)</w:t>
       </w:r>
@@ -3004,8 +3002,6 @@
       <w:r>
         <w:t>Autor / Revisor</w:t>
       </w:r>
-      <w:bookmarkStart w:id="7" w:name="_GoBack"/>
-      <w:bookmarkEnd w:id="7"/>
     </w:p>
     <w:p>
       <w:pPr>
@@ -3040,6 +3036,7 @@
         <w:spacing w:after="0"/>
       </w:pPr>
       <w:r>
+        <w:lastRenderedPageBreak/>
         <w:t>Pré-condições / Pós-condições</w:t>
       </w:r>
     </w:p>
@@ -14927,6 +14924,23 @@
       <w:u w:val="single"/>
     </w:rPr>
   </w:style>
+  <w:style w:type="paragraph" w:styleId="NormalWeb">
+    <w:name w:val="Normal (Web)"/>
+    <w:basedOn w:val="Normal"/>
+    <w:uiPriority w:val="99"/>
+    <w:semiHidden/>
+    <w:unhideWhenUsed/>
+    <w:rsid w:val="00C62087"/>
+    <w:pPr>
+      <w:spacing w:before="100" w:beforeAutospacing="1" w:after="100" w:afterAutospacing="1" w:line="240" w:lineRule="auto"/>
+    </w:pPr>
+    <w:rPr>
+      <w:rFonts w:ascii="Times New Roman" w:eastAsia="Times New Roman" w:hAnsi="Times New Roman" w:cs="Times New Roman"/>
+      <w:sz w:val="24"/>
+      <w:szCs w:val="24"/>
+      <w:lang w:val="pt-BR" w:eastAsia="pt-BR"/>
+    </w:rPr>
+  </w:style>
 </w:styles>
 </file>
 
@@ -15255,7 +15269,7 @@
 </file>
 
 <file path=customXml/itemProps1.xml><?xml version="1.0" encoding="utf-8"?>
-<ds:datastoreItem xmlns:ds="http://schemas.openxmlformats.org/officeDocument/2006/customXml" ds:itemID="{31A3F008-C577-4B2B-9652-7AC48A3434B9}">
+<ds:datastoreItem xmlns:ds="http://schemas.openxmlformats.org/officeDocument/2006/customXml" ds:itemID="{CC8A2444-8CA1-4448-A6CE-8064BF0305B0}">
   <ds:schemaRefs>
     <ds:schemaRef ds:uri="http://schemas.openxmlformats.org/officeDocument/2006/bibliography"/>
   </ds:schemaRefs>

</xml_diff>

<commit_message>
Inserido no docs diagrama atualizado
</commit_message>
<xml_diff>
--- a/Engenharia_de_Software/Trabalho_m1/Docs_V2/Trabalho_V2.docx
+++ b/Engenharia_de_Software/Trabalho_m1/Docs_V2/Trabalho_V2.docx
@@ -136,6 +136,9 @@
     <w:p>
       <w:pPr>
         <w:jc w:val="center"/>
+        <w:rPr>
+          <w:lang w:val="pt-BR"/>
+        </w:rPr>
       </w:pPr>
       <w:r>
         <w:rPr>
@@ -144,8 +147,19 @@
         <w:t xml:space="preserve">Profa. </w:t>
       </w:r>
       <w:r>
-        <w:t>Adriana Gomes Alves, Dra</w:t>
-      </w:r>
+        <w:rPr>
+          <w:lang w:val="pt-BR"/>
+        </w:rPr>
+        <w:t xml:space="preserve">Adriana Gomes Alves, </w:t>
+      </w:r>
+      <w:proofErr w:type="spellStart"/>
+      <w:r>
+        <w:rPr>
+          <w:lang w:val="pt-BR"/>
+        </w:rPr>
+        <w:t>Dra</w:t>
+      </w:r>
+      <w:proofErr w:type="spellEnd"/>
     </w:p>
     <w:p>
       <w:pPr>
@@ -166,56 +180,24 @@
     <w:p>
       <w:pPr>
         <w:jc w:val="center"/>
-        <w:rPr>
-          <w:lang w:val="pt-BR"/>
-        </w:rPr>
-      </w:pPr>
-      <w:r>
-        <w:rPr>
-          <w:lang w:val="pt-BR"/>
-        </w:rPr>
-        <w:t xml:space="preserve">Eduardo </w:t>
+      </w:pPr>
+      <w:r>
+        <w:t>Eduardo Fabeni Johannsen –&gt; eduardofabenijohannsen@edu.univali.br</w:t>
+      </w:r>
+    </w:p>
+    <w:p>
+      <w:pPr>
+        <w:jc w:val="center"/>
+      </w:pPr>
+      <w:r>
+        <w:t xml:space="preserve">Gustavo </w:t>
       </w:r>
       <w:proofErr w:type="spellStart"/>
       <w:r>
-        <w:rPr>
-          <w:lang w:val="pt-BR"/>
-        </w:rPr>
-        <w:t>Fabeni</w:t>
+        <w:t>Bormanieri</w:t>
       </w:r>
       <w:proofErr w:type="spellEnd"/>
       <w:r>
-        <w:rPr>
-          <w:lang w:val="pt-BR"/>
-        </w:rPr>
-        <w:t xml:space="preserve"> Johannsen –&gt; eduardofabenijohannsen@edu.univali.br</w:t>
-      </w:r>
-    </w:p>
-    <w:p>
-      <w:pPr>
-        <w:jc w:val="center"/>
-        <w:rPr>
-          <w:lang w:val="pt-BR"/>
-        </w:rPr>
-      </w:pPr>
-      <w:r>
-        <w:rPr>
-          <w:lang w:val="pt-BR"/>
-        </w:rPr>
-        <w:t xml:space="preserve">Gustavo </w:t>
-      </w:r>
-      <w:proofErr w:type="spellStart"/>
-      <w:r>
-        <w:rPr>
-          <w:lang w:val="pt-BR"/>
-        </w:rPr>
-        <w:t>Bormanieri</w:t>
-      </w:r>
-      <w:proofErr w:type="spellEnd"/>
-      <w:r>
-        <w:rPr>
-          <w:lang w:val="pt-BR"/>
-        </w:rPr>
         <w:t xml:space="preserve"> –&gt; gustavo.8286043@edu.univali.br</w:t>
       </w:r>
     </w:p>
@@ -5163,10 +5145,10 @@
           <w:lang w:val="pt-BR"/>
         </w:rPr>
         <w:drawing>
-          <wp:inline distT="0" distB="0" distL="0" distR="0" wp14:anchorId="3CD2A8C1" wp14:editId="3C2739F7">
-            <wp:extent cx="5486400" cy="3657600"/>
+          <wp:inline distT="0" distB="0" distL="0" distR="0" wp14:anchorId="50236A16" wp14:editId="04F342BC">
+            <wp:extent cx="5607050" cy="3735070"/>
             <wp:effectExtent l="0" t="0" r="0" b="0"/>
-            <wp:docPr id="470361843" name="Imagem 1"/>
+            <wp:docPr id="874408794" name="Imagem 1"/>
             <wp:cNvGraphicFramePr>
               <a:graphicFrameLocks xmlns:a="http://schemas.openxmlformats.org/drawingml/2006/main" noChangeAspect="1"/>
             </wp:cNvGraphicFramePr>
@@ -5174,7 +5156,7 @@
               <a:graphicData uri="http://schemas.openxmlformats.org/drawingml/2006/picture">
                 <pic:pic xmlns:pic="http://schemas.openxmlformats.org/drawingml/2006/picture">
                   <pic:nvPicPr>
-                    <pic:cNvPr id="0" name="Picture 1"/>
+                    <pic:cNvPr id="0" name="Picture 3"/>
                     <pic:cNvPicPr>
                       <a:picLocks noChangeAspect="1" noChangeArrowheads="1"/>
                     </pic:cNvPicPr>
@@ -5195,7 +5177,7 @@
                   <pic:spPr bwMode="auto">
                     <a:xfrm>
                       <a:off x="0" y="0"/>
-                      <a:ext cx="5486400" cy="3657600"/>
+                      <a:ext cx="5607050" cy="3735070"/>
                     </a:xfrm>
                     <a:prstGeom prst="rect">
                       <a:avLst/>
@@ -5999,7 +5981,7 @@
           <w:lang w:val="pt-BR"/>
         </w:rPr>
         <w:pict w14:anchorId="787D7188">
-          <v:rect id="_x0000_i1062" style="width:0;height:1.5pt" o:hralign="center" o:hrstd="t" o:hr="t" fillcolor="#a0a0a0" stroked="f"/>
+          <v:rect id="_x0000_i1025" style="width:0;height:1.5pt" o:hralign="center" o:hrstd="t" o:hr="t" fillcolor="#a0a0a0" stroked="f"/>
         </w:pict>
       </w:r>
     </w:p>
@@ -6022,6 +6004,7 @@
           <w:szCs w:val="28"/>
           <w:lang w:val="pt-BR"/>
         </w:rPr>
+        <w:lastRenderedPageBreak/>
         <w:t>UC02 — Registrar triagem</w:t>
       </w:r>
     </w:p>
@@ -6627,7 +6610,7 @@
           <w:lang w:val="pt-BR"/>
         </w:rPr>
         <w:pict w14:anchorId="7F796AA2">
-          <v:rect id="_x0000_i1063" style="width:0;height:1.5pt" o:hralign="center" o:hrstd="t" o:hr="t" fillcolor="#a0a0a0" stroked="f"/>
+          <v:rect id="_x0000_i1026" style="width:0;height:1.5pt" o:hralign="center" o:hrstd="t" o:hr="t" fillcolor="#a0a0a0" stroked="f"/>
         </w:pict>
       </w:r>
     </w:p>
@@ -6690,19 +6673,7 @@
         <w:rPr>
           <w:lang w:val="pt-BR"/>
         </w:rPr>
-        <w:t xml:space="preserve"> Johannsen</w:t>
-      </w:r>
-      <w:r>
-        <w:rPr>
-          <w:lang w:val="pt-BR"/>
-        </w:rPr>
-        <w:t xml:space="preserve"> </w:t>
-      </w:r>
-      <w:r>
-        <w:rPr>
-          <w:lang w:val="pt-BR"/>
-        </w:rPr>
-        <w:t xml:space="preserve">/ Gustavo </w:t>
+        <w:t xml:space="preserve"> Johannsen / Gustavo </w:t>
       </w:r>
       <w:proofErr w:type="spellStart"/>
       <w:r>

</xml_diff>

<commit_message>
Ajuste no  digrama de casos de uso
</commit_message>
<xml_diff>
--- a/Engenharia_de_Software/Trabalho_m1/Docs_V2/Trabalho_V2.docx
+++ b/Engenharia_de_Software/Trabalho_m1/Docs_V2/Trabalho_V2.docx
@@ -2003,7 +2003,48 @@
               <w:spacing w:before="240" w:after="240"/>
               <w:ind w:left="720" w:hanging="360"/>
               <w:jc w:val="center"/>
+              <w:rPr>
+                <w:lang w:val="pt-BR"/>
+              </w:rPr>
             </w:pPr>
+            <w:r>
+              <w:rPr>
+                <w:lang w:val="pt-BR"/>
+              </w:rPr>
+              <w:t xml:space="preserve">Link do </w:t>
+            </w:r>
+            <w:proofErr w:type="spellStart"/>
+            <w:r>
+              <w:rPr>
+                <w:lang w:val="pt-BR"/>
+              </w:rPr>
+              <w:t>commit</w:t>
+            </w:r>
+            <w:proofErr w:type="spellEnd"/>
+            <w:r>
+              <w:rPr>
+                <w:lang w:val="pt-BR"/>
+              </w:rPr>
+              <w:t>:</w:t>
+            </w:r>
+          </w:p>
+          <w:p>
+            <w:pPr>
+              <w:spacing w:before="240" w:after="240"/>
+              <w:ind w:left="720" w:hanging="360"/>
+              <w:jc w:val="center"/>
+              <w:rPr>
+                <w:lang w:val="pt-BR"/>
+              </w:rPr>
+            </w:pPr>
+            <w:r>
+              <w:rPr>
+                <w:sz w:val="12"/>
+                <w:szCs w:val="12"/>
+                <w:lang w:val="pt-BR"/>
+              </w:rPr>
+              <w:t>https://github.com/EduardoFabeniJohannsen/Ciencia_da_Computacao_UNIVALI/commit/80154e7d44d953acf2464dd420d224e521d0fdcb</w:t>
+            </w:r>
           </w:p>
         </w:tc>
       </w:tr>
@@ -2158,6 +2199,44 @@
                 <w:lang w:val="pt-BR"/>
               </w:rPr>
             </w:pPr>
+            <w:r>
+              <w:rPr>
+                <w:lang w:val="pt-BR"/>
+              </w:rPr>
+              <w:t xml:space="preserve">Link do </w:t>
+            </w:r>
+            <w:proofErr w:type="spellStart"/>
+            <w:r>
+              <w:rPr>
+                <w:lang w:val="pt-BR"/>
+              </w:rPr>
+              <w:t>commit</w:t>
+            </w:r>
+            <w:proofErr w:type="spellEnd"/>
+            <w:r>
+              <w:rPr>
+                <w:lang w:val="pt-BR"/>
+              </w:rPr>
+              <w:t>:</w:t>
+            </w:r>
+          </w:p>
+          <w:p>
+            <w:pPr>
+              <w:spacing w:before="240" w:after="240"/>
+              <w:ind w:left="720" w:hanging="360"/>
+              <w:jc w:val="center"/>
+              <w:rPr>
+                <w:lang w:val="pt-BR"/>
+              </w:rPr>
+            </w:pPr>
+            <w:r>
+              <w:rPr>
+                <w:sz w:val="12"/>
+                <w:szCs w:val="12"/>
+                <w:lang w:val="pt-BR"/>
+              </w:rPr>
+              <w:t>https://github.com/EduardoFabeniJohannsen/Ciencia_da_Computacao_UNIVALI/commit/80154e7d44d953acf2464dd420d224e521d0fdcb</w:t>
+            </w:r>
           </w:p>
         </w:tc>
       </w:tr>
@@ -2191,9 +2270,57 @@
             </w:pPr>
             <w:r>
               <w:rPr>
+                <w:noProof/>
                 <w:lang w:val="pt-BR"/>
               </w:rPr>
-              <w:t>(Somente V2) Classes do recorte</w:t>
+              <w:drawing>
+                <wp:inline distT="0" distB="0" distL="0" distR="0" wp14:anchorId="047FE9D3" wp14:editId="7FA2AC7C">
+                  <wp:extent cx="1562100" cy="1047750"/>
+                  <wp:effectExtent l="0" t="0" r="0" b="0"/>
+                  <wp:docPr id="1734532777" name="Imagem 1"/>
+                  <wp:cNvGraphicFramePr>
+                    <a:graphicFrameLocks xmlns:a="http://schemas.openxmlformats.org/drawingml/2006/main" noChangeAspect="1"/>
+                  </wp:cNvGraphicFramePr>
+                  <a:graphic xmlns:a="http://schemas.openxmlformats.org/drawingml/2006/main">
+                    <a:graphicData uri="http://schemas.openxmlformats.org/drawingml/2006/picture">
+                      <pic:pic xmlns:pic="http://schemas.openxmlformats.org/drawingml/2006/picture">
+                        <pic:nvPicPr>
+                          <pic:cNvPr id="0" name="Picture 3"/>
+                          <pic:cNvPicPr>
+                            <a:picLocks noChangeAspect="1" noChangeArrowheads="1"/>
+                          </pic:cNvPicPr>
+                        </pic:nvPicPr>
+                        <pic:blipFill>
+                          <a:blip r:embed="rId8">
+                            <a:extLst>
+                              <a:ext uri="{28A0092B-C50C-407E-A947-70E740481C1C}">
+                                <a14:useLocalDpi xmlns:a14="http://schemas.microsoft.com/office/drawing/2010/main" val="0"/>
+                              </a:ext>
+                            </a:extLst>
+                          </a:blip>
+                          <a:srcRect/>
+                          <a:stretch>
+                            <a:fillRect/>
+                          </a:stretch>
+                        </pic:blipFill>
+                        <pic:spPr bwMode="auto">
+                          <a:xfrm>
+                            <a:off x="0" y="0"/>
+                            <a:ext cx="1562100" cy="1047750"/>
+                          </a:xfrm>
+                          <a:prstGeom prst="rect">
+                            <a:avLst/>
+                          </a:prstGeom>
+                          <a:noFill/>
+                          <a:ln>
+                            <a:noFill/>
+                          </a:ln>
+                        </pic:spPr>
+                      </pic:pic>
+                    </a:graphicData>
+                  </a:graphic>
+                </wp:inline>
+              </w:drawing>
             </w:r>
           </w:p>
         </w:tc>
@@ -2303,6 +2430,44 @@
                 <w:lang w:val="pt-BR"/>
               </w:rPr>
             </w:pPr>
+            <w:r>
+              <w:rPr>
+                <w:lang w:val="pt-BR"/>
+              </w:rPr>
+              <w:t xml:space="preserve">Link do </w:t>
+            </w:r>
+            <w:proofErr w:type="spellStart"/>
+            <w:r>
+              <w:rPr>
+                <w:lang w:val="pt-BR"/>
+              </w:rPr>
+              <w:t>commit</w:t>
+            </w:r>
+            <w:proofErr w:type="spellEnd"/>
+            <w:r>
+              <w:rPr>
+                <w:lang w:val="pt-BR"/>
+              </w:rPr>
+              <w:t>:</w:t>
+            </w:r>
+          </w:p>
+          <w:p>
+            <w:pPr>
+              <w:spacing w:before="240" w:after="240"/>
+              <w:ind w:left="720" w:hanging="360"/>
+              <w:jc w:val="center"/>
+              <w:rPr>
+                <w:lang w:val="pt-BR"/>
+              </w:rPr>
+            </w:pPr>
+            <w:r>
+              <w:rPr>
+                <w:sz w:val="12"/>
+                <w:szCs w:val="12"/>
+                <w:lang w:val="pt-BR"/>
+              </w:rPr>
+              <w:t>https://github.com/EduardoFabeniJohannsen/Ciencia_da_Computacao_UNIVALI/commit/80154e7d44d953acf2464dd420d224e521d0fdcb</w:t>
+            </w:r>
           </w:p>
         </w:tc>
       </w:tr>
@@ -2474,7 +2639,48 @@
               <w:spacing w:before="240" w:after="240"/>
               <w:ind w:left="720" w:hanging="360"/>
               <w:jc w:val="center"/>
+              <w:rPr>
+                <w:lang w:val="pt-BR"/>
+              </w:rPr>
             </w:pPr>
+            <w:r>
+              <w:rPr>
+                <w:lang w:val="pt-BR"/>
+              </w:rPr>
+              <w:t xml:space="preserve">Link do </w:t>
+            </w:r>
+            <w:proofErr w:type="spellStart"/>
+            <w:r>
+              <w:rPr>
+                <w:lang w:val="pt-BR"/>
+              </w:rPr>
+              <w:t>commit</w:t>
+            </w:r>
+            <w:proofErr w:type="spellEnd"/>
+            <w:r>
+              <w:rPr>
+                <w:lang w:val="pt-BR"/>
+              </w:rPr>
+              <w:t>:</w:t>
+            </w:r>
+          </w:p>
+          <w:p>
+            <w:pPr>
+              <w:spacing w:before="240" w:after="240"/>
+              <w:ind w:left="720" w:hanging="360"/>
+              <w:jc w:val="center"/>
+              <w:rPr>
+                <w:lang w:val="pt-BR"/>
+              </w:rPr>
+            </w:pPr>
+            <w:r>
+              <w:rPr>
+                <w:sz w:val="12"/>
+                <w:szCs w:val="12"/>
+                <w:lang w:val="pt-BR"/>
+              </w:rPr>
+              <w:t>https://github.com/EduardoFabeniJohannsen/Ciencia_da_Computacao_UNIVALI/commit/80154e7d44d953acf2464dd420d224e521d0fdcb</w:t>
+            </w:r>
           </w:p>
         </w:tc>
       </w:tr>
@@ -2490,6 +2696,7 @@
           <w:b w:val="0"/>
           <w:bCs w:val="0"/>
           <w:color w:val="auto"/>
+          <w:lang w:val="pt-BR"/>
         </w:rPr>
       </w:pPr>
     </w:p>
@@ -2902,7 +3109,14 @@
               <w:rPr>
                 <w:lang w:val="pt-BR"/>
               </w:rPr>
-              <w:t>Adequação ao padrão UML e melhoria da coerência dos artefatos.</w:t>
+              <w:t xml:space="preserve">Adequação ao padrão UML e melhoria da coerência dos </w:t>
+            </w:r>
+            <w:r>
+              <w:rPr>
+                <w:lang w:val="pt-BR"/>
+              </w:rPr>
+              <w:lastRenderedPageBreak/>
+              <w:t>artefatos.</w:t>
             </w:r>
           </w:p>
         </w:tc>
@@ -2914,6 +3128,7 @@
           </w:tcPr>
           <w:p>
             <w:r>
+              <w:lastRenderedPageBreak/>
               <w:t>Anexo A</w:t>
             </w:r>
           </w:p>
@@ -2966,7 +3181,6 @@
         <w:rPr>
           <w:lang w:val="pt-BR"/>
         </w:rPr>
-        <w:lastRenderedPageBreak/>
         <w:br/>
         <w:t>Observação: O GitHub será utilizado como evidência de versionamento e autoria do projeto, enquanto o documento PDF/Word será considerado a entrega formal da disciplina.</w:t>
       </w:r>
@@ -3181,6 +3395,7 @@
         <w:rPr>
           <w:lang w:val="pt-BR"/>
         </w:rPr>
+        <w:lastRenderedPageBreak/>
         <w:t>Pacientes de unidades públicas de saúde</w:t>
       </w:r>
     </w:p>
@@ -3218,7 +3433,6 @@
       </w:pPr>
       <w:proofErr w:type="spellStart"/>
       <w:r>
-        <w:lastRenderedPageBreak/>
         <w:t>Recepcionistas</w:t>
       </w:r>
       <w:proofErr w:type="spellEnd"/>
@@ -3677,6 +3891,7 @@
           <w:szCs w:val="32"/>
           <w:lang w:val="pt-BR" w:eastAsia="pt-BR"/>
         </w:rPr>
+        <w:lastRenderedPageBreak/>
         <w:drawing>
           <wp:anchor distT="0" distB="0" distL="114300" distR="114300" simplePos="0" relativeHeight="251658240" behindDoc="0" locked="0" layoutInCell="1" allowOverlap="1" wp14:anchorId="7D1F9CCF" wp14:editId="40CFA4E4">
             <wp:simplePos x="0" y="0"/>
@@ -3703,7 +3918,7 @@
                     </pic:cNvPicPr>
                   </pic:nvPicPr>
                   <pic:blipFill>
-                    <a:blip r:embed="rId8">
+                    <a:blip r:embed="rId9">
                       <a:extLst>
                         <a:ext uri="{28A0092B-C50C-407E-A947-70E740481C1C}">
                           <a14:useLocalDpi xmlns:a14="http://schemas.microsoft.com/office/drawing/2010/main" val="0"/>
@@ -3754,7 +3969,6 @@
         <w:pStyle w:val="Ttulo2"/>
       </w:pPr>
       <w:r>
-        <w:lastRenderedPageBreak/>
         <w:t xml:space="preserve">2.1 </w:t>
       </w:r>
       <w:proofErr w:type="spellStart"/>
@@ -4115,6 +4329,7 @@
           <w:bCs/>
           <w:lang w:val="pt-BR"/>
         </w:rPr>
+        <w:lastRenderedPageBreak/>
         <w:t>RF05 — Ajuste manual de prioridade</w:t>
       </w:r>
     </w:p>
@@ -4552,7 +4767,6 @@
           <w:bCs/>
           <w:lang w:val="pt-BR"/>
         </w:rPr>
-        <w:lastRenderedPageBreak/>
         <w:t>RNF03 — Segurança</w:t>
       </w:r>
     </w:p>
@@ -4798,6 +5012,7 @@
         <w:rPr>
           <w:lang w:val="pt-BR"/>
         </w:rPr>
+        <w:lastRenderedPageBreak/>
         <w:t>O paciente somente poderá entrar na fila após realização da triagem.</w:t>
       </w:r>
     </w:p>
@@ -5137,6 +5352,7 @@
         <w:rPr>
           <w:lang w:val="pt-BR"/>
         </w:rPr>
+        <w:lastRenderedPageBreak/>
         <w:t xml:space="preserve">4.1 Diagrama de casos de uso </w:t>
       </w:r>
       <w:r>
@@ -5162,7 +5378,7 @@
                     </pic:cNvPicPr>
                   </pic:nvPicPr>
                   <pic:blipFill>
-                    <a:blip r:embed="rId9">
+                    <a:blip r:embed="rId10">
                       <a:extLst>
                         <a:ext uri="{28A0092B-C50C-407E-A947-70E740481C1C}">
                           <a14:useLocalDpi xmlns:a14="http://schemas.microsoft.com/office/drawing/2010/main" val="0"/>
@@ -5330,6 +5546,7 @@
         <w:rPr>
           <w:lang w:val="pt-BR"/>
         </w:rPr>
+        <w:lastRenderedPageBreak/>
         <w:t xml:space="preserve">4.2 Especificação detalhada de 3 UCs </w:t>
       </w:r>
     </w:p>
@@ -6004,7 +6221,6 @@
           <w:szCs w:val="28"/>
           <w:lang w:val="pt-BR"/>
         </w:rPr>
-        <w:lastRenderedPageBreak/>
         <w:t>UC02 — Registrar triagem</w:t>
       </w:r>
     </w:p>
@@ -6195,6 +6411,7 @@
           <w:bCs/>
           <w:lang w:val="pt-BR"/>
         </w:rPr>
+        <w:lastRenderedPageBreak/>
         <w:t>Pós-condições</w:t>
       </w:r>
     </w:p>
@@ -7061,6 +7278,7 @@
         <w:rPr>
           <w:lang w:val="pt-BR"/>
         </w:rPr>
+        <w:lastRenderedPageBreak/>
         <w:t xml:space="preserve">A1. O enfermeiro pode alterar manualmente a prioridade definida. </w:t>
       </w:r>
     </w:p>
@@ -11404,6 +11622,7 @@
   <w:style w:type="character" w:default="1" w:styleId="Fontepargpadro">
     <w:name w:val="Default Paragraph Font"/>
     <w:uiPriority w:val="1"/>
+    <w:semiHidden/>
     <w:unhideWhenUsed/>
   </w:style>
   <w:style w:type="table" w:default="1" w:styleId="Tabelanormal">

</xml_diff>

<commit_message>
Apenas adicionado a apresentação das telas
</commit_message>
<xml_diff>
--- a/Engenharia_de_Software/Trabalho_m1/Docs_V2/Trabalho_V2.docx
+++ b/Engenharia_de_Software/Trabalho_m1/Docs_V2/Trabalho_V2.docx
@@ -150,16 +150,8 @@
         <w:rPr>
           <w:lang w:val="pt-BR"/>
         </w:rPr>
-        <w:t xml:space="preserve">Adriana Gomes Alves, </w:t>
+        <w:t>Adriana Gomes Alves, Dra</w:t>
       </w:r>
-      <w:proofErr w:type="spellStart"/>
-      <w:r>
-        <w:rPr>
-          <w:lang w:val="pt-BR"/>
-        </w:rPr>
-        <w:t>Dra</w:t>
-      </w:r>
-      <w:proofErr w:type="spellEnd"/>
     </w:p>
     <w:p>
       <w:pPr>
@@ -190,15 +182,7 @@
         <w:jc w:val="center"/>
       </w:pPr>
       <w:r>
-        <w:t xml:space="preserve">Gustavo </w:t>
-      </w:r>
-      <w:proofErr w:type="spellStart"/>
-      <w:r>
-        <w:t>Bormanieri</w:t>
-      </w:r>
-      <w:proofErr w:type="spellEnd"/>
-      <w:r>
-        <w:t xml:space="preserve"> –&gt; gustavo.8286043@edu.univali.br</w:t>
+        <w:t>Gustavo Bormanieri –&gt; gustavo.8286043@edu.univali.br</w:t>
       </w:r>
     </w:p>
     <w:p>
@@ -225,16 +209,8 @@
         <w:rPr>
           <w:b/>
         </w:rPr>
-        <w:t xml:space="preserve">Link </w:t>
+        <w:t>Link Repositório</w:t>
       </w:r>
-      <w:proofErr w:type="spellStart"/>
-      <w:r>
-        <w:rPr>
-          <w:b/>
-        </w:rPr>
-        <w:t>Repositório</w:t>
-      </w:r>
-      <w:proofErr w:type="spellEnd"/>
     </w:p>
     <w:p>
       <w:pPr>
@@ -446,23 +422,7 @@
                 <w:b/>
                 <w:bCs/>
               </w:rPr>
-              <w:t xml:space="preserve">IA </w:t>
-            </w:r>
-            <w:proofErr w:type="spellStart"/>
-            <w:r>
-              <w:rPr>
-                <w:b/>
-                <w:bCs/>
-              </w:rPr>
-              <w:t>usada</w:t>
-            </w:r>
-            <w:proofErr w:type="spellEnd"/>
-            <w:r>
-              <w:rPr>
-                <w:b/>
-                <w:bCs/>
-              </w:rPr>
-              <w:t>? (S/N)</w:t>
+              <w:t>IA usada? (S/N)</w:t>
             </w:r>
           </w:p>
         </w:tc>
@@ -488,37 +448,12 @@
               <w:ind w:left="141"/>
               <w:jc w:val="center"/>
             </w:pPr>
-            <w:proofErr w:type="spellStart"/>
             <w:r>
               <w:rPr>
                 <w:b/>
                 <w:bCs/>
               </w:rPr>
-              <w:t>Evidência</w:t>
-            </w:r>
-            <w:proofErr w:type="spellEnd"/>
-            <w:r>
-              <w:rPr>
-                <w:b/>
-                <w:bCs/>
-              </w:rPr>
-              <w:t xml:space="preserve"> </w:t>
-            </w:r>
-            <w:proofErr w:type="spellStart"/>
-            <w:r>
-              <w:rPr>
-                <w:b/>
-                <w:bCs/>
-              </w:rPr>
-              <w:t>mínima</w:t>
-            </w:r>
-            <w:proofErr w:type="spellEnd"/>
-            <w:r>
-              <w:rPr>
-                <w:b/>
-                <w:bCs/>
-              </w:rPr>
-              <w:t xml:space="preserve"> (link/ID)</w:t>
+              <w:t>Evidência mínima (link/ID)</w:t>
             </w:r>
           </w:p>
         </w:tc>
@@ -548,27 +483,9 @@
             <w:pPr>
               <w:spacing w:before="240" w:after="240"/>
             </w:pPr>
-            <w:proofErr w:type="spellStart"/>
             <w:r>
-              <w:t>Visão</w:t>
+              <w:t>Visão geral + escopo</w:t>
             </w:r>
-            <w:proofErr w:type="spellEnd"/>
-            <w:r>
-              <w:t xml:space="preserve"> </w:t>
-            </w:r>
-            <w:proofErr w:type="spellStart"/>
-            <w:r>
-              <w:t>geral</w:t>
-            </w:r>
-            <w:proofErr w:type="spellEnd"/>
-            <w:r>
-              <w:t xml:space="preserve"> + </w:t>
-            </w:r>
-            <w:proofErr w:type="spellStart"/>
-            <w:r>
-              <w:t>escopo</w:t>
-            </w:r>
-            <w:proofErr w:type="spellEnd"/>
           </w:p>
         </w:tc>
         <w:tc>
@@ -687,21 +604,7 @@
               <w:rPr>
                 <w:lang w:val="pt-BR"/>
               </w:rPr>
-              <w:t xml:space="preserve">Link do </w:t>
-            </w:r>
-            <w:proofErr w:type="spellStart"/>
-            <w:r>
-              <w:rPr>
-                <w:lang w:val="pt-BR"/>
-              </w:rPr>
-              <w:t>commit</w:t>
-            </w:r>
-            <w:proofErr w:type="spellEnd"/>
-            <w:r>
-              <w:rPr>
-                <w:lang w:val="pt-BR"/>
-              </w:rPr>
-              <w:t>:</w:t>
+              <w:t>Link do commit:</w:t>
             </w:r>
           </w:p>
           <w:p>
@@ -753,21 +656,8 @@
               <w:spacing w:before="240" w:after="240"/>
             </w:pPr>
             <w:r>
-              <w:t xml:space="preserve">BPMN </w:t>
+              <w:t>BPMN processo proposto</w:t>
             </w:r>
-            <w:proofErr w:type="spellStart"/>
-            <w:r>
-              <w:t>processo</w:t>
-            </w:r>
-            <w:proofErr w:type="spellEnd"/>
-            <w:r>
-              <w:t xml:space="preserve"> </w:t>
-            </w:r>
-            <w:proofErr w:type="spellStart"/>
-            <w:r>
-              <w:t>proposto</w:t>
-            </w:r>
-            <w:proofErr w:type="spellEnd"/>
           </w:p>
         </w:tc>
         <w:tc>
@@ -883,21 +773,7 @@
               <w:rPr>
                 <w:lang w:val="pt-BR"/>
               </w:rPr>
-              <w:t xml:space="preserve">Link do </w:t>
-            </w:r>
-            <w:proofErr w:type="spellStart"/>
-            <w:r>
-              <w:rPr>
-                <w:lang w:val="pt-BR"/>
-              </w:rPr>
-              <w:t>commit</w:t>
-            </w:r>
-            <w:proofErr w:type="spellEnd"/>
-            <w:r>
-              <w:rPr>
-                <w:lang w:val="pt-BR"/>
-              </w:rPr>
-              <w:t>:</w:t>
+              <w:t>Link do commit:</w:t>
             </w:r>
           </w:p>
           <w:p>
@@ -1063,21 +939,7 @@
               <w:rPr>
                 <w:lang w:val="pt-BR"/>
               </w:rPr>
-              <w:t xml:space="preserve">Link do </w:t>
-            </w:r>
-            <w:proofErr w:type="spellStart"/>
-            <w:r>
-              <w:rPr>
-                <w:lang w:val="pt-BR"/>
-              </w:rPr>
-              <w:t>commit</w:t>
-            </w:r>
-            <w:proofErr w:type="spellEnd"/>
-            <w:r>
-              <w:rPr>
-                <w:lang w:val="pt-BR"/>
-              </w:rPr>
-              <w:t>:</w:t>
+              <w:t>Link do commit:</w:t>
             </w:r>
           </w:p>
           <w:p>
@@ -1251,16 +1113,8 @@
               <w:rPr>
                 <w:lang w:val="pt-BR"/>
               </w:rPr>
-              <w:t xml:space="preserve">Link do </w:t>
+              <w:t>Link do commit</w:t>
             </w:r>
-            <w:proofErr w:type="spellStart"/>
-            <w:r>
-              <w:rPr>
-                <w:lang w:val="pt-BR"/>
-              </w:rPr>
-              <w:t>commit</w:t>
-            </w:r>
-            <w:proofErr w:type="spellEnd"/>
           </w:p>
           <w:p>
             <w:pPr>
@@ -1310,15 +1164,7 @@
               <w:spacing w:before="240" w:after="240"/>
             </w:pPr>
             <w:r>
-              <w:t xml:space="preserve">UC </w:t>
-            </w:r>
-            <w:proofErr w:type="spellStart"/>
-            <w:r>
-              <w:t>detalhado</w:t>
-            </w:r>
-            <w:proofErr w:type="spellEnd"/>
-            <w:r>
-              <w:t xml:space="preserve"> 1</w:t>
+              <w:t>UC detalhado 1</w:t>
             </w:r>
           </w:p>
         </w:tc>
@@ -1435,21 +1281,7 @@
               <w:rPr>
                 <w:lang w:val="pt-BR"/>
               </w:rPr>
-              <w:t xml:space="preserve">Link do </w:t>
-            </w:r>
-            <w:proofErr w:type="spellStart"/>
-            <w:r>
-              <w:rPr>
-                <w:lang w:val="pt-BR"/>
-              </w:rPr>
-              <w:t>commit</w:t>
-            </w:r>
-            <w:proofErr w:type="spellEnd"/>
-            <w:r>
-              <w:rPr>
-                <w:lang w:val="pt-BR"/>
-              </w:rPr>
-              <w:t>:</w:t>
+              <w:t>Link do commit:</w:t>
             </w:r>
           </w:p>
           <w:p>
@@ -1498,15 +1330,7 @@
               <w:spacing w:before="240" w:after="240"/>
             </w:pPr>
             <w:r>
-              <w:t xml:space="preserve">UC </w:t>
-            </w:r>
-            <w:proofErr w:type="spellStart"/>
-            <w:r>
-              <w:t>detalhado</w:t>
-            </w:r>
-            <w:proofErr w:type="spellEnd"/>
-            <w:r>
-              <w:t xml:space="preserve"> 2</w:t>
+              <w:t>UC detalhado 2</w:t>
             </w:r>
           </w:p>
         </w:tc>
@@ -1623,21 +1447,7 @@
               <w:rPr>
                 <w:lang w:val="pt-BR"/>
               </w:rPr>
-              <w:t xml:space="preserve">Link do </w:t>
-            </w:r>
-            <w:proofErr w:type="spellStart"/>
-            <w:r>
-              <w:rPr>
-                <w:lang w:val="pt-BR"/>
-              </w:rPr>
-              <w:t>commit</w:t>
-            </w:r>
-            <w:proofErr w:type="spellEnd"/>
-            <w:r>
-              <w:rPr>
-                <w:lang w:val="pt-BR"/>
-              </w:rPr>
-              <w:t>:</w:t>
+              <w:t>Link do commit:</w:t>
             </w:r>
           </w:p>
           <w:p>
@@ -1688,15 +1498,7 @@
               <w:spacing w:before="240" w:after="240"/>
             </w:pPr>
             <w:r>
-              <w:t xml:space="preserve">UC </w:t>
-            </w:r>
-            <w:proofErr w:type="spellStart"/>
-            <w:r>
-              <w:t>detalhado</w:t>
-            </w:r>
-            <w:proofErr w:type="spellEnd"/>
-            <w:r>
-              <w:t xml:space="preserve"> 3</w:t>
+              <w:t>UC detalhado 3</w:t>
             </w:r>
           </w:p>
         </w:tc>
@@ -1723,13 +1525,8 @@
               <w:jc w:val="center"/>
             </w:pPr>
             <w:r>
-              <w:t xml:space="preserve">Gustavo </w:t>
+              <w:t>Gustavo Bormanieri</w:t>
             </w:r>
-            <w:proofErr w:type="spellStart"/>
-            <w:r>
-              <w:t>Bormanieri</w:t>
-            </w:r>
-            <w:proofErr w:type="spellEnd"/>
           </w:p>
         </w:tc>
         <w:tc>
@@ -1818,21 +1615,7 @@
               <w:rPr>
                 <w:lang w:val="pt-BR"/>
               </w:rPr>
-              <w:t xml:space="preserve">Link do </w:t>
-            </w:r>
-            <w:proofErr w:type="spellStart"/>
-            <w:r>
-              <w:rPr>
-                <w:lang w:val="pt-BR"/>
-              </w:rPr>
-              <w:t>commit</w:t>
-            </w:r>
-            <w:proofErr w:type="spellEnd"/>
-            <w:r>
-              <w:rPr>
-                <w:lang w:val="pt-BR"/>
-              </w:rPr>
-              <w:t>:</w:t>
+              <w:t>Link do commit:</w:t>
             </w:r>
           </w:p>
           <w:p>
@@ -1884,23 +1667,7 @@
             </w:pPr>
             <w:r>
               <w:lastRenderedPageBreak/>
-              <w:t>(</w:t>
-            </w:r>
-            <w:proofErr w:type="spellStart"/>
-            <w:r>
-              <w:t>Somente</w:t>
-            </w:r>
-            <w:proofErr w:type="spellEnd"/>
-            <w:r>
-              <w:t xml:space="preserve"> V2) </w:t>
-            </w:r>
-            <w:proofErr w:type="spellStart"/>
-            <w:r>
-              <w:t>Rastreabilidade</w:t>
-            </w:r>
-            <w:proofErr w:type="spellEnd"/>
-            <w:r>
-              <w:t xml:space="preserve"> final</w:t>
+              <w:t>(Somente V2) Rastreabilidade final</w:t>
             </w:r>
           </w:p>
         </w:tc>
@@ -1953,6 +1720,9 @@
               <w:ind w:left="720" w:hanging="360"/>
               <w:jc w:val="center"/>
             </w:pPr>
+            <w:r>
+              <w:t>Gustavo</w:t>
+            </w:r>
           </w:p>
         </w:tc>
         <w:tc>
@@ -2011,21 +1781,7 @@
               <w:rPr>
                 <w:lang w:val="pt-BR"/>
               </w:rPr>
-              <w:t xml:space="preserve">Link do </w:t>
-            </w:r>
-            <w:proofErr w:type="spellStart"/>
-            <w:r>
-              <w:rPr>
-                <w:lang w:val="pt-BR"/>
-              </w:rPr>
-              <w:t>commit</w:t>
-            </w:r>
-            <w:proofErr w:type="spellEnd"/>
-            <w:r>
-              <w:rPr>
-                <w:lang w:val="pt-BR"/>
-              </w:rPr>
-              <w:t>:</w:t>
+              <w:t>Link do commit:</w:t>
             </w:r>
           </w:p>
           <w:p>
@@ -2139,6 +1895,12 @@
                 <w:lang w:val="pt-BR"/>
               </w:rPr>
             </w:pPr>
+            <w:r>
+              <w:rPr>
+                <w:lang w:val="pt-BR"/>
+              </w:rPr>
+              <w:t>Kauan</w:t>
+            </w:r>
           </w:p>
         </w:tc>
         <w:tc>
@@ -2203,252 +1965,7 @@
               <w:rPr>
                 <w:lang w:val="pt-BR"/>
               </w:rPr>
-              <w:t xml:space="preserve">Link do </w:t>
-            </w:r>
-            <w:proofErr w:type="spellStart"/>
-            <w:r>
-              <w:rPr>
-                <w:lang w:val="pt-BR"/>
-              </w:rPr>
-              <w:t>commit</w:t>
-            </w:r>
-            <w:proofErr w:type="spellEnd"/>
-            <w:r>
-              <w:rPr>
-                <w:lang w:val="pt-BR"/>
-              </w:rPr>
-              <w:t>:</w:t>
-            </w:r>
-          </w:p>
-          <w:p>
-            <w:pPr>
-              <w:spacing w:before="240" w:after="240"/>
-              <w:ind w:left="720" w:hanging="360"/>
-              <w:jc w:val="center"/>
-              <w:rPr>
-                <w:lang w:val="pt-BR"/>
-              </w:rPr>
-            </w:pPr>
-            <w:r>
-              <w:rPr>
-                <w:sz w:val="12"/>
-                <w:szCs w:val="12"/>
-                <w:lang w:val="pt-BR"/>
-              </w:rPr>
-              <w:t>https://github.com/EduardoFabeniJohannsen/Ciencia_da_Computacao_UNIVALI/commit/80154e7d44d953acf2464dd420d224e521d0fdcb</w:t>
-            </w:r>
-          </w:p>
-        </w:tc>
-      </w:tr>
-      <w:tr>
-        <w:trPr>
-          <w:trHeight w:val="785"/>
-          <w:jc w:val="center"/>
-        </w:trPr>
-        <w:tc>
-          <w:tcPr>
-            <w:tcW w:w="2681" w:type="dxa"/>
-            <w:tcBorders>
-              <w:top w:val="single" w:sz="8" w:space="0" w:color="000000"/>
-              <w:left w:val="single" w:sz="8" w:space="0" w:color="000000"/>
-              <w:bottom w:val="single" w:sz="8" w:space="0" w:color="000000"/>
-              <w:right w:val="single" w:sz="8" w:space="0" w:color="000000"/>
-            </w:tcBorders>
-            <w:tcMar>
-              <w:top w:w="100" w:type="dxa"/>
-              <w:left w:w="100" w:type="dxa"/>
-              <w:bottom w:w="100" w:type="dxa"/>
-              <w:right w:w="100" w:type="dxa"/>
-            </w:tcMar>
-          </w:tcPr>
-          <w:p>
-            <w:pPr>
-              <w:spacing w:before="240" w:after="240"/>
-              <w:rPr>
-                <w:lang w:val="pt-BR"/>
-              </w:rPr>
-            </w:pPr>
-            <w:r>
-              <w:rPr>
-                <w:noProof/>
-                <w:lang w:val="pt-BR"/>
-              </w:rPr>
-              <w:drawing>
-                <wp:inline distT="0" distB="0" distL="0" distR="0" wp14:anchorId="047FE9D3" wp14:editId="7FA2AC7C">
-                  <wp:extent cx="1562100" cy="1047750"/>
-                  <wp:effectExtent l="0" t="0" r="0" b="0"/>
-                  <wp:docPr id="1734532777" name="Imagem 1"/>
-                  <wp:cNvGraphicFramePr>
-                    <a:graphicFrameLocks xmlns:a="http://schemas.openxmlformats.org/drawingml/2006/main" noChangeAspect="1"/>
-                  </wp:cNvGraphicFramePr>
-                  <a:graphic xmlns:a="http://schemas.openxmlformats.org/drawingml/2006/main">
-                    <a:graphicData uri="http://schemas.openxmlformats.org/drawingml/2006/picture">
-                      <pic:pic xmlns:pic="http://schemas.openxmlformats.org/drawingml/2006/picture">
-                        <pic:nvPicPr>
-                          <pic:cNvPr id="0" name="Picture 3"/>
-                          <pic:cNvPicPr>
-                            <a:picLocks noChangeAspect="1" noChangeArrowheads="1"/>
-                          </pic:cNvPicPr>
-                        </pic:nvPicPr>
-                        <pic:blipFill>
-                          <a:blip r:embed="rId8">
-                            <a:extLst>
-                              <a:ext uri="{28A0092B-C50C-407E-A947-70E740481C1C}">
-                                <a14:useLocalDpi xmlns:a14="http://schemas.microsoft.com/office/drawing/2010/main" val="0"/>
-                              </a:ext>
-                            </a:extLst>
-                          </a:blip>
-                          <a:srcRect/>
-                          <a:stretch>
-                            <a:fillRect/>
-                          </a:stretch>
-                        </pic:blipFill>
-                        <pic:spPr bwMode="auto">
-                          <a:xfrm>
-                            <a:off x="0" y="0"/>
-                            <a:ext cx="1562100" cy="1047750"/>
-                          </a:xfrm>
-                          <a:prstGeom prst="rect">
-                            <a:avLst/>
-                          </a:prstGeom>
-                          <a:noFill/>
-                          <a:ln>
-                            <a:noFill/>
-                          </a:ln>
-                        </pic:spPr>
-                      </pic:pic>
-                    </a:graphicData>
-                  </a:graphic>
-                </wp:inline>
-              </w:drawing>
-            </w:r>
-          </w:p>
-        </w:tc>
-        <w:tc>
-          <w:tcPr>
-            <w:tcW w:w="2127" w:type="dxa"/>
-            <w:tcBorders>
-              <w:top w:val="single" w:sz="8" w:space="0" w:color="000000"/>
-              <w:left w:val="single" w:sz="8" w:space="0" w:color="000000"/>
-              <w:bottom w:val="single" w:sz="8" w:space="0" w:color="000000"/>
-              <w:right w:val="single" w:sz="8" w:space="0" w:color="000000"/>
-            </w:tcBorders>
-            <w:tcMar>
-              <w:top w:w="100" w:type="dxa"/>
-              <w:left w:w="100" w:type="dxa"/>
-              <w:bottom w:w="100" w:type="dxa"/>
-              <w:right w:w="100" w:type="dxa"/>
-            </w:tcMar>
-          </w:tcPr>
-          <w:p>
-            <w:pPr>
-              <w:spacing w:before="240" w:after="240"/>
-              <w:ind w:left="720" w:hanging="360"/>
-              <w:jc w:val="center"/>
-              <w:rPr>
-                <w:lang w:val="pt-BR"/>
-              </w:rPr>
-            </w:pPr>
-          </w:p>
-        </w:tc>
-        <w:tc>
-          <w:tcPr>
-            <w:tcW w:w="1427" w:type="dxa"/>
-            <w:tcBorders>
-              <w:top w:val="single" w:sz="8" w:space="0" w:color="000000"/>
-              <w:left w:val="single" w:sz="8" w:space="0" w:color="000000"/>
-              <w:bottom w:val="single" w:sz="8" w:space="0" w:color="000000"/>
-              <w:right w:val="single" w:sz="8" w:space="0" w:color="000000"/>
-            </w:tcBorders>
-            <w:tcMar>
-              <w:top w:w="100" w:type="dxa"/>
-              <w:left w:w="100" w:type="dxa"/>
-              <w:bottom w:w="100" w:type="dxa"/>
-              <w:right w:w="100" w:type="dxa"/>
-            </w:tcMar>
-          </w:tcPr>
-          <w:p>
-            <w:pPr>
-              <w:spacing w:before="240" w:after="240"/>
-              <w:ind w:left="720" w:hanging="360"/>
-              <w:jc w:val="center"/>
-              <w:rPr>
-                <w:lang w:val="pt-BR"/>
-              </w:rPr>
-            </w:pPr>
-          </w:p>
-        </w:tc>
-        <w:tc>
-          <w:tcPr>
-            <w:tcW w:w="1842" w:type="dxa"/>
-            <w:tcBorders>
-              <w:top w:val="single" w:sz="8" w:space="0" w:color="000000"/>
-              <w:left w:val="single" w:sz="8" w:space="0" w:color="000000"/>
-              <w:bottom w:val="single" w:sz="8" w:space="0" w:color="000000"/>
-              <w:right w:val="single" w:sz="8" w:space="0" w:color="000000"/>
-            </w:tcBorders>
-            <w:tcMar>
-              <w:top w:w="100" w:type="dxa"/>
-              <w:left w:w="100" w:type="dxa"/>
-              <w:bottom w:w="100" w:type="dxa"/>
-              <w:right w:w="100" w:type="dxa"/>
-            </w:tcMar>
-          </w:tcPr>
-          <w:p>
-            <w:pPr>
-              <w:spacing w:before="240" w:after="240"/>
-              <w:ind w:left="720" w:hanging="360"/>
-              <w:jc w:val="center"/>
-              <w:rPr>
-                <w:lang w:val="pt-BR"/>
-              </w:rPr>
-            </w:pPr>
-          </w:p>
-        </w:tc>
-        <w:tc>
-          <w:tcPr>
-            <w:tcW w:w="3402" w:type="dxa"/>
-            <w:tcBorders>
-              <w:top w:val="single" w:sz="8" w:space="0" w:color="000000"/>
-              <w:left w:val="single" w:sz="8" w:space="0" w:color="000000"/>
-              <w:bottom w:val="single" w:sz="8" w:space="0" w:color="000000"/>
-              <w:right w:val="single" w:sz="8" w:space="0" w:color="000000"/>
-            </w:tcBorders>
-            <w:tcMar>
-              <w:top w:w="100" w:type="dxa"/>
-              <w:left w:w="100" w:type="dxa"/>
-              <w:bottom w:w="100" w:type="dxa"/>
-              <w:right w:w="100" w:type="dxa"/>
-            </w:tcMar>
-          </w:tcPr>
-          <w:p>
-            <w:pPr>
-              <w:spacing w:before="240" w:after="240"/>
-              <w:ind w:left="720" w:hanging="360"/>
-              <w:jc w:val="center"/>
-              <w:rPr>
-                <w:lang w:val="pt-BR"/>
-              </w:rPr>
-            </w:pPr>
-            <w:r>
-              <w:rPr>
-                <w:lang w:val="pt-BR"/>
-              </w:rPr>
-              <w:t xml:space="preserve">Link do </w:t>
-            </w:r>
-            <w:proofErr w:type="spellStart"/>
-            <w:r>
-              <w:rPr>
-                <w:lang w:val="pt-BR"/>
-              </w:rPr>
-              <w:t>commit</w:t>
-            </w:r>
-            <w:proofErr w:type="spellEnd"/>
-            <w:r>
-              <w:rPr>
-                <w:lang w:val="pt-BR"/>
-              </w:rPr>
-              <w:t>:</w:t>
+              <w:t>Link do commit:</w:t>
             </w:r>
           </w:p>
           <w:p>
@@ -2497,21 +2014,8 @@
               <w:spacing w:before="240" w:after="240"/>
             </w:pPr>
             <w:r>
-              <w:t>(</w:t>
+              <w:t>(Somente V2) Protótipo</w:t>
             </w:r>
-            <w:proofErr w:type="spellStart"/>
-            <w:r>
-              <w:t>Somente</w:t>
-            </w:r>
-            <w:proofErr w:type="spellEnd"/>
-            <w:r>
-              <w:t xml:space="preserve"> V2) </w:t>
-            </w:r>
-            <w:proofErr w:type="spellStart"/>
-            <w:r>
-              <w:t>Protótipo</w:t>
-            </w:r>
-            <w:proofErr w:type="spellEnd"/>
           </w:p>
         </w:tc>
         <w:tc>
@@ -2647,21 +2151,7 @@
               <w:rPr>
                 <w:lang w:val="pt-BR"/>
               </w:rPr>
-              <w:t xml:space="preserve">Link do </w:t>
-            </w:r>
-            <w:proofErr w:type="spellStart"/>
-            <w:r>
-              <w:rPr>
-                <w:lang w:val="pt-BR"/>
-              </w:rPr>
-              <w:t>commit</w:t>
-            </w:r>
-            <w:proofErr w:type="spellEnd"/>
-            <w:r>
-              <w:rPr>
-                <w:lang w:val="pt-BR"/>
-              </w:rPr>
-              <w:t>:</w:t>
+              <w:t>Link do commit:</w:t>
             </w:r>
           </w:p>
           <w:p>
@@ -2753,19 +2243,9 @@
           <w:p>
             <w:bookmarkStart w:id="0" w:name="_6mcvd7ax9o4r" w:colFirst="0" w:colLast="0"/>
             <w:bookmarkEnd w:id="0"/>
-            <w:proofErr w:type="spellStart"/>
             <w:r>
-              <w:t>Seção</w:t>
+              <w:t>Seção alterada</w:t>
             </w:r>
-            <w:proofErr w:type="spellEnd"/>
-            <w:r>
-              <w:t xml:space="preserve"> </w:t>
-            </w:r>
-            <w:proofErr w:type="spellStart"/>
-            <w:r>
-              <w:t>alterada</w:t>
-            </w:r>
-            <w:proofErr w:type="spellEnd"/>
           </w:p>
         </w:tc>
         <w:tc>
@@ -2774,29 +2254,8 @@
           </w:tcPr>
           <w:p>
             <w:r>
-              <w:t xml:space="preserve">O </w:t>
+              <w:t>O que foi revisado</w:t>
             </w:r>
-            <w:proofErr w:type="spellStart"/>
-            <w:r>
-              <w:t>que</w:t>
-            </w:r>
-            <w:proofErr w:type="spellEnd"/>
-            <w:r>
-              <w:t xml:space="preserve"> </w:t>
-            </w:r>
-            <w:proofErr w:type="spellStart"/>
-            <w:r>
-              <w:t>foi</w:t>
-            </w:r>
-            <w:proofErr w:type="spellEnd"/>
-            <w:r>
-              <w:t xml:space="preserve"> </w:t>
-            </w:r>
-            <w:proofErr w:type="spellStart"/>
-            <w:r>
-              <w:t>revisado</w:t>
-            </w:r>
-            <w:proofErr w:type="spellEnd"/>
           </w:p>
         </w:tc>
         <w:tc>
@@ -2804,11 +2263,9 @@
             <w:tcW w:w="3119" w:type="dxa"/>
           </w:tcPr>
           <w:p>
-            <w:proofErr w:type="spellStart"/>
             <w:r>
               <w:t>Motivo</w:t>
             </w:r>
-            <w:proofErr w:type="spellEnd"/>
           </w:p>
         </w:tc>
       </w:tr>
@@ -2818,13 +2275,8 @@
             <w:tcW w:w="2694" w:type="dxa"/>
           </w:tcPr>
           <w:p>
-            <w:proofErr w:type="spellStart"/>
             <w:r>
-              <w:t>Visão</w:t>
-            </w:r>
-            <w:proofErr w:type="spellEnd"/>
-            <w:r>
-              <w:t xml:space="preserve"> Geral</w:t>
+              <w:t>Visão Geral</w:t>
             </w:r>
           </w:p>
         </w:tc>
@@ -2890,21 +2342,7 @@
               <w:rPr>
                 <w:lang w:val="pt-BR"/>
               </w:rPr>
-              <w:t xml:space="preserve">Refatoração completa do BPMN utilizando notação correta, </w:t>
-            </w:r>
-            <w:proofErr w:type="spellStart"/>
-            <w:r>
-              <w:rPr>
-                <w:lang w:val="pt-BR"/>
-              </w:rPr>
-              <w:t>swimlanes</w:t>
-            </w:r>
-            <w:proofErr w:type="spellEnd"/>
-            <w:r>
-              <w:rPr>
-                <w:lang w:val="pt-BR"/>
-              </w:rPr>
-              <w:t xml:space="preserve"> e gateways padronizados.</w:t>
+              <w:t>Refatoração completa do BPMN utilizando notação correta, swimlanes e gateways padronizados.</w:t>
             </w:r>
           </w:p>
         </w:tc>
@@ -2933,11 +2371,9 @@
             <w:tcW w:w="2694" w:type="dxa"/>
           </w:tcPr>
           <w:p>
-            <w:proofErr w:type="spellStart"/>
             <w:r>
               <w:t>Requisitos</w:t>
             </w:r>
-            <w:proofErr w:type="spellEnd"/>
           </w:p>
         </w:tc>
         <w:tc>
@@ -2954,21 +2390,7 @@
               <w:rPr>
                 <w:lang w:val="pt-BR"/>
               </w:rPr>
-              <w:t xml:space="preserve">Reescrita dos </w:t>
-            </w:r>
-            <w:proofErr w:type="spellStart"/>
-            <w:r>
-              <w:rPr>
-                <w:lang w:val="pt-BR"/>
-              </w:rPr>
-              <w:t>RFs</w:t>
-            </w:r>
-            <w:proofErr w:type="spellEnd"/>
-            <w:r>
-              <w:rPr>
-                <w:lang w:val="pt-BR"/>
-              </w:rPr>
-              <w:t xml:space="preserve"> com identificação explícita dos atores responsáveis pelas ações.</w:t>
+              <w:t>Reescrita dos RFs com identificação explícita dos atores responsáveis pelas ações.</w:t>
             </w:r>
           </w:p>
         </w:tc>
@@ -3024,21 +2446,7 @@
               <w:rPr>
                 <w:lang w:val="pt-BR"/>
               </w:rPr>
-              <w:t>Correção das relações include/</w:t>
-            </w:r>
-            <w:proofErr w:type="spellStart"/>
-            <w:r>
-              <w:rPr>
-                <w:lang w:val="pt-BR"/>
-              </w:rPr>
-              <w:t>extend</w:t>
-            </w:r>
-            <w:proofErr w:type="spellEnd"/>
-            <w:r>
-              <w:rPr>
-                <w:lang w:val="pt-BR"/>
-              </w:rPr>
-              <w:t xml:space="preserve"> e reorganização dos casos de uso.</w:t>
+              <w:t>Correção das relações include/extend e reorganização dos casos de uso.</w:t>
             </w:r>
           </w:p>
         </w:tc>
@@ -3068,13 +2476,8 @@
           </w:tcPr>
           <w:p>
             <w:r>
-              <w:t xml:space="preserve">UCs </w:t>
+              <w:t>UCs detalhados</w:t>
             </w:r>
-            <w:proofErr w:type="spellStart"/>
-            <w:r>
-              <w:t>detalhados</w:t>
-            </w:r>
-            <w:proofErr w:type="spellEnd"/>
           </w:p>
         </w:tc>
         <w:tc>
@@ -3109,14 +2512,7 @@
               <w:rPr>
                 <w:lang w:val="pt-BR"/>
               </w:rPr>
-              <w:t xml:space="preserve">Adequação ao padrão UML e melhoria da coerência dos </w:t>
-            </w:r>
-            <w:r>
-              <w:rPr>
-                <w:lang w:val="pt-BR"/>
-              </w:rPr>
-              <w:lastRenderedPageBreak/>
-              <w:t>artefatos.</w:t>
+              <w:t>Adequação ao padrão UML e melhoria da coerência dos artefatos.</w:t>
             </w:r>
           </w:p>
         </w:tc>
@@ -3128,7 +2524,6 @@
           </w:tcPr>
           <w:p>
             <w:r>
-              <w:lastRenderedPageBreak/>
               <w:t>Anexo A</w:t>
             </w:r>
           </w:p>
@@ -3181,6 +2576,7 @@
         <w:rPr>
           <w:lang w:val="pt-BR"/>
         </w:rPr>
+        <w:lastRenderedPageBreak/>
         <w:br/>
         <w:t>Observação: O GitHub será utilizado como evidência de versionamento e autoria do projeto, enquanto o documento PDF/Word será considerado a entrega formal da disciplina.</w:t>
       </w:r>
@@ -3357,45 +2753,28 @@
         <w:pStyle w:val="Ttulo2"/>
       </w:pPr>
       <w:r>
-        <w:t>1.3 Público-</w:t>
+        <w:t>1.3 Público-alvo e stakeholders</w:t>
       </w:r>
-      <w:proofErr w:type="spellStart"/>
+    </w:p>
+    <w:p>
+      <w:pPr>
+        <w:pStyle w:val="Commarcadores"/>
+      </w:pPr>
       <w:r>
-        <w:t>alvo</w:t>
+        <w:t>Público-alvo:</w:t>
       </w:r>
-      <w:proofErr w:type="spellEnd"/>
+    </w:p>
+    <w:p>
+      <w:pPr>
+        <w:pStyle w:val="Commarcadores2"/>
+        <w:rPr>
+          <w:lang w:val="pt-BR"/>
+        </w:rPr>
+      </w:pPr>
       <w:r>
-        <w:t xml:space="preserve"> e stakeholders</w:t>
-      </w:r>
-    </w:p>
-    <w:p>
-      <w:pPr>
-        <w:pStyle w:val="Commarcadores"/>
-      </w:pPr>
-      <w:r>
-        <w:t>Público-</w:t>
-      </w:r>
-      <w:proofErr w:type="spellStart"/>
-      <w:r>
-        <w:t>alvo</w:t>
-      </w:r>
-      <w:proofErr w:type="spellEnd"/>
-      <w:r>
-        <w:t>:</w:t>
-      </w:r>
-    </w:p>
-    <w:p>
-      <w:pPr>
-        <w:pStyle w:val="Commarcadores2"/>
-        <w:rPr>
-          <w:lang w:val="pt-BR"/>
-        </w:rPr>
-      </w:pPr>
-      <w:r>
-        <w:rPr>
-          <w:lang w:val="pt-BR"/>
-        </w:rPr>
-        <w:lastRenderedPageBreak/>
+        <w:rPr>
+          <w:lang w:val="pt-BR"/>
+        </w:rPr>
         <w:t>Pacientes de unidades públicas de saúde</w:t>
       </w:r>
     </w:p>
@@ -3403,57 +2782,34 @@
       <w:pPr>
         <w:pStyle w:val="Commarcadores2"/>
       </w:pPr>
-      <w:proofErr w:type="spellStart"/>
       <w:r>
-        <w:t>Profissionais</w:t>
+        <w:t>Profissionais de enfermagem</w:t>
       </w:r>
-      <w:proofErr w:type="spellEnd"/>
-      <w:r>
-        <w:t xml:space="preserve"> de </w:t>
-      </w:r>
-      <w:proofErr w:type="spellStart"/>
-      <w:r>
-        <w:t>enfermagem</w:t>
-      </w:r>
-      <w:proofErr w:type="spellEnd"/>
     </w:p>
     <w:p>
       <w:pPr>
         <w:pStyle w:val="Commarcadores2"/>
       </w:pPr>
-      <w:proofErr w:type="spellStart"/>
       <w:r>
         <w:t>Médicos</w:t>
       </w:r>
-      <w:proofErr w:type="spellEnd"/>
     </w:p>
     <w:p>
       <w:pPr>
         <w:pStyle w:val="Commarcadores2"/>
       </w:pPr>
-      <w:proofErr w:type="spellStart"/>
       <w:r>
+        <w:lastRenderedPageBreak/>
         <w:t>Recepcionistas</w:t>
       </w:r>
-      <w:proofErr w:type="spellEnd"/>
     </w:p>
     <w:p>
       <w:pPr>
         <w:pStyle w:val="Commarcadores2"/>
       </w:pPr>
-      <w:proofErr w:type="spellStart"/>
       <w:r>
-        <w:t>Gestores</w:t>
+        <w:t>Gestores da unidade</w:t>
       </w:r>
-      <w:proofErr w:type="spellEnd"/>
-      <w:r>
-        <w:t xml:space="preserve"> da </w:t>
-      </w:r>
-      <w:proofErr w:type="spellStart"/>
-      <w:r>
-        <w:t>unidade</w:t>
-      </w:r>
-      <w:proofErr w:type="spellEnd"/>
     </w:p>
     <w:p>
       <w:pPr>
@@ -3481,45 +2837,17 @@
       <w:pPr>
         <w:pStyle w:val="Commarcadores2"/>
       </w:pPr>
-      <w:proofErr w:type="spellStart"/>
       <w:r>
-        <w:t>Secretaria</w:t>
+        <w:t>Secretaria municipal de saúde</w:t>
       </w:r>
-      <w:proofErr w:type="spellEnd"/>
+    </w:p>
+    <w:p>
+      <w:pPr>
+        <w:pStyle w:val="Commarcadores2"/>
+      </w:pPr>
       <w:r>
-        <w:t xml:space="preserve"> municipal de </w:t>
+        <w:t>Profissionais da área da saúde</w:t>
       </w:r>
-      <w:proofErr w:type="spellStart"/>
-      <w:r>
-        <w:t>saúde</w:t>
-      </w:r>
-      <w:proofErr w:type="spellEnd"/>
-    </w:p>
-    <w:p>
-      <w:pPr>
-        <w:pStyle w:val="Commarcadores2"/>
-      </w:pPr>
-      <w:proofErr w:type="spellStart"/>
-      <w:r>
-        <w:t>Profissionais</w:t>
-      </w:r>
-      <w:proofErr w:type="spellEnd"/>
-      <w:r>
-        <w:t xml:space="preserve"> da </w:t>
-      </w:r>
-      <w:proofErr w:type="spellStart"/>
-      <w:r>
-        <w:t>área</w:t>
-      </w:r>
-      <w:proofErr w:type="spellEnd"/>
-      <w:r>
-        <w:t xml:space="preserve"> da </w:t>
-      </w:r>
-      <w:proofErr w:type="spellStart"/>
-      <w:r>
-        <w:t>saúde</w:t>
-      </w:r>
-      <w:proofErr w:type="spellEnd"/>
     </w:p>
     <w:p>
       <w:pPr>
@@ -3540,37 +2868,8 @@
         <w:pStyle w:val="Ttulo2"/>
       </w:pPr>
       <w:r>
-        <w:t xml:space="preserve">1.4 </w:t>
+        <w:t>1.4 Escopo: inclui / não inclui</w:t>
       </w:r>
-      <w:proofErr w:type="spellStart"/>
-      <w:r>
-        <w:t>Escopo</w:t>
-      </w:r>
-      <w:proofErr w:type="spellEnd"/>
-      <w:r>
-        <w:t xml:space="preserve">: </w:t>
-      </w:r>
-      <w:proofErr w:type="spellStart"/>
-      <w:r>
-        <w:t>inclui</w:t>
-      </w:r>
-      <w:proofErr w:type="spellEnd"/>
-      <w:r>
-        <w:t xml:space="preserve"> / </w:t>
-      </w:r>
-      <w:proofErr w:type="spellStart"/>
-      <w:r>
-        <w:t>não</w:t>
-      </w:r>
-      <w:proofErr w:type="spellEnd"/>
-      <w:r>
-        <w:t xml:space="preserve"> </w:t>
-      </w:r>
-      <w:proofErr w:type="spellStart"/>
-      <w:r>
-        <w:t>inclui</w:t>
-      </w:r>
-      <w:proofErr w:type="spellEnd"/>
     </w:p>
     <w:tbl>
       <w:tblPr>
@@ -3588,11 +2887,9 @@
             <w:tcW w:w="4320" w:type="dxa"/>
           </w:tcPr>
           <w:p>
-            <w:proofErr w:type="spellStart"/>
             <w:r>
               <w:t>Inclui</w:t>
             </w:r>
-            <w:proofErr w:type="spellEnd"/>
           </w:p>
         </w:tc>
         <w:tc>
@@ -3600,69 +2897,9 @@
             <w:tcW w:w="4320" w:type="dxa"/>
           </w:tcPr>
           <w:p>
-            <w:proofErr w:type="spellStart"/>
             <w:r>
-              <w:t>Não</w:t>
+              <w:t>Não inclui</w:t>
             </w:r>
-            <w:proofErr w:type="spellEnd"/>
-            <w:r>
-              <w:t xml:space="preserve"> </w:t>
-            </w:r>
-            <w:proofErr w:type="spellStart"/>
-            <w:r>
-              <w:t>inclui</w:t>
-            </w:r>
-            <w:proofErr w:type="spellEnd"/>
-          </w:p>
-        </w:tc>
-      </w:tr>
-      <w:tr>
-        <w:tc>
-          <w:tcPr>
-            <w:tcW w:w="4320" w:type="dxa"/>
-          </w:tcPr>
-          <w:p>
-            <w:proofErr w:type="spellStart"/>
-            <w:r>
-              <w:t>Cadastro</w:t>
-            </w:r>
-            <w:proofErr w:type="spellEnd"/>
-            <w:r>
-              <w:t xml:space="preserve"> de </w:t>
-            </w:r>
-            <w:proofErr w:type="spellStart"/>
-            <w:r>
-              <w:t>pacientes</w:t>
-            </w:r>
-            <w:proofErr w:type="spellEnd"/>
-          </w:p>
-        </w:tc>
-        <w:tc>
-          <w:tcPr>
-            <w:tcW w:w="4320" w:type="dxa"/>
-          </w:tcPr>
-          <w:p>
-            <w:proofErr w:type="spellStart"/>
-            <w:r>
-              <w:t>Prontuário</w:t>
-            </w:r>
-            <w:proofErr w:type="spellEnd"/>
-            <w:r>
-              <w:t xml:space="preserve"> </w:t>
-            </w:r>
-            <w:proofErr w:type="spellStart"/>
-            <w:r>
-              <w:t>eletrônico</w:t>
-            </w:r>
-            <w:proofErr w:type="spellEnd"/>
-            <w:r>
-              <w:t xml:space="preserve"> </w:t>
-            </w:r>
-            <w:proofErr w:type="spellStart"/>
-            <w:r>
-              <w:t>completo</w:t>
-            </w:r>
-            <w:proofErr w:type="spellEnd"/>
           </w:p>
         </w:tc>
       </w:tr>
@@ -3673,55 +2910,8 @@
           </w:tcPr>
           <w:p>
             <w:r>
-              <w:t xml:space="preserve">Registro de </w:t>
+              <w:t>Cadastro de pacientes</w:t>
             </w:r>
-            <w:proofErr w:type="spellStart"/>
-            <w:r>
-              <w:t>triagem</w:t>
-            </w:r>
-            <w:proofErr w:type="spellEnd"/>
-          </w:p>
-        </w:tc>
-        <w:tc>
-          <w:tcPr>
-            <w:tcW w:w="4320" w:type="dxa"/>
-          </w:tcPr>
-          <w:p>
-            <w:proofErr w:type="spellStart"/>
-            <w:r>
-              <w:t>Prescrição</w:t>
-            </w:r>
-            <w:proofErr w:type="spellEnd"/>
-            <w:r>
-              <w:t xml:space="preserve"> </w:t>
-            </w:r>
-            <w:proofErr w:type="spellStart"/>
-            <w:r>
-              <w:t>médica</w:t>
-            </w:r>
-            <w:proofErr w:type="spellEnd"/>
-          </w:p>
-        </w:tc>
-      </w:tr>
-      <w:tr>
-        <w:tc>
-          <w:tcPr>
-            <w:tcW w:w="4320" w:type="dxa"/>
-          </w:tcPr>
-          <w:p>
-            <w:proofErr w:type="spellStart"/>
-            <w:r>
-              <w:t>Classificação</w:t>
-            </w:r>
-            <w:proofErr w:type="spellEnd"/>
-            <w:r>
-              <w:t xml:space="preserve"> de </w:t>
-            </w:r>
-            <w:proofErr w:type="spellStart"/>
-            <w:r>
-              <w:t>prioridade</w:t>
-            </w:r>
-            <w:proofErr w:type="spellEnd"/>
           </w:p>
         </w:tc>
         <w:tc>
@@ -3730,66 +2920,8 @@
           </w:tcPr>
           <w:p>
             <w:r>
-              <w:t xml:space="preserve">Controle </w:t>
+              <w:t>Prontuário eletrônico completo</w:t>
             </w:r>
-            <w:proofErr w:type="spellStart"/>
-            <w:r>
-              <w:t>financeiro</w:t>
-            </w:r>
-            <w:proofErr w:type="spellEnd"/>
-          </w:p>
-        </w:tc>
-      </w:tr>
-      <w:tr>
-        <w:tc>
-          <w:tcPr>
-            <w:tcW w:w="4320" w:type="dxa"/>
-          </w:tcPr>
-          <w:p>
-            <w:proofErr w:type="spellStart"/>
-            <w:r>
-              <w:t>Organização</w:t>
-            </w:r>
-            <w:proofErr w:type="spellEnd"/>
-            <w:r>
-              <w:t xml:space="preserve"> </w:t>
-            </w:r>
-            <w:proofErr w:type="spellStart"/>
-            <w:r>
-              <w:t>dinâmica</w:t>
-            </w:r>
-            <w:proofErr w:type="spellEnd"/>
-            <w:r>
-              <w:t xml:space="preserve"> da fila</w:t>
-            </w:r>
-          </w:p>
-        </w:tc>
-        <w:tc>
-          <w:tcPr>
-            <w:tcW w:w="4320" w:type="dxa"/>
-          </w:tcPr>
-          <w:p>
-            <w:proofErr w:type="spellStart"/>
-            <w:r>
-              <w:t>Integração</w:t>
-            </w:r>
-            <w:proofErr w:type="spellEnd"/>
-            <w:r>
-              <w:t xml:space="preserve"> com </w:t>
-            </w:r>
-            <w:proofErr w:type="spellStart"/>
-            <w:r>
-              <w:t>sistemas</w:t>
-            </w:r>
-            <w:proofErr w:type="spellEnd"/>
-            <w:r>
-              <w:t xml:space="preserve"> </w:t>
-            </w:r>
-            <w:proofErr w:type="spellStart"/>
-            <w:r>
-              <w:t>externos</w:t>
-            </w:r>
-            <w:proofErr w:type="spellEnd"/>
           </w:p>
         </w:tc>
       </w:tr>
@@ -3800,13 +2932,8 @@
           </w:tcPr>
           <w:p>
             <w:r>
-              <w:t xml:space="preserve">Consulta do tempo </w:t>
+              <w:t>Registro de triagem</w:t>
             </w:r>
-            <w:proofErr w:type="spellStart"/>
-            <w:r>
-              <w:t>estimado</w:t>
-            </w:r>
-            <w:proofErr w:type="spellEnd"/>
           </w:p>
         </w:tc>
         <w:tc>
@@ -3814,27 +2941,75 @@
             <w:tcW w:w="4320" w:type="dxa"/>
           </w:tcPr>
           <w:p>
-            <w:proofErr w:type="spellStart"/>
             <w:r>
-              <w:t>Agendamento</w:t>
+              <w:t>Prescrição médica</w:t>
             </w:r>
-            <w:proofErr w:type="spellEnd"/>
+          </w:p>
+        </w:tc>
+      </w:tr>
+      <w:tr>
+        <w:tc>
+          <w:tcPr>
+            <w:tcW w:w="4320" w:type="dxa"/>
+          </w:tcPr>
+          <w:p>
             <w:r>
-              <w:t xml:space="preserve"> de </w:t>
+              <w:t>Classificação de prioridade</w:t>
             </w:r>
-            <w:proofErr w:type="spellStart"/>
+          </w:p>
+        </w:tc>
+        <w:tc>
+          <w:tcPr>
+            <w:tcW w:w="4320" w:type="dxa"/>
+          </w:tcPr>
+          <w:p>
             <w:r>
-              <w:t>consultas</w:t>
+              <w:t>Controle financeiro</w:t>
             </w:r>
-            <w:proofErr w:type="spellEnd"/>
+          </w:p>
+        </w:tc>
+      </w:tr>
+      <w:tr>
+        <w:tc>
+          <w:tcPr>
+            <w:tcW w:w="4320" w:type="dxa"/>
+          </w:tcPr>
+          <w:p>
             <w:r>
-              <w:t xml:space="preserve"> </w:t>
+              <w:t>Organização dinâmica da fila</w:t>
             </w:r>
-            <w:proofErr w:type="spellStart"/>
+          </w:p>
+        </w:tc>
+        <w:tc>
+          <w:tcPr>
+            <w:tcW w:w="4320" w:type="dxa"/>
+          </w:tcPr>
+          <w:p>
             <w:r>
-              <w:t>futuras</w:t>
+              <w:t>Integração com sistemas externos</w:t>
             </w:r>
-            <w:proofErr w:type="spellEnd"/>
+          </w:p>
+        </w:tc>
+      </w:tr>
+      <w:tr>
+        <w:tc>
+          <w:tcPr>
+            <w:tcW w:w="4320" w:type="dxa"/>
+          </w:tcPr>
+          <w:p>
+            <w:r>
+              <w:t>Consulta do tempo estimado</w:t>
+            </w:r>
+          </w:p>
+        </w:tc>
+        <w:tc>
+          <w:tcPr>
+            <w:tcW w:w="4320" w:type="dxa"/>
+          </w:tcPr>
+          <w:p>
+            <w:r>
+              <w:t>Agendamento de consultas futuras</w:t>
+            </w:r>
           </w:p>
         </w:tc>
       </w:tr>
@@ -3863,13 +3038,8 @@
           </w:tcPr>
           <w:p>
             <w:r>
-              <w:t xml:space="preserve">Controle de estoque </w:t>
+              <w:t>Controle de estoque hospitalar</w:t>
             </w:r>
-            <w:proofErr w:type="spellStart"/>
-            <w:r>
-              <w:t>hospitalar</w:t>
-            </w:r>
-            <w:proofErr w:type="spellEnd"/>
           </w:p>
         </w:tc>
       </w:tr>
@@ -3891,7 +3061,6 @@
           <w:szCs w:val="32"/>
           <w:lang w:val="pt-BR" w:eastAsia="pt-BR"/>
         </w:rPr>
-        <w:lastRenderedPageBreak/>
         <w:drawing>
           <wp:anchor distT="0" distB="0" distL="114300" distR="114300" simplePos="0" relativeHeight="251658240" behindDoc="0" locked="0" layoutInCell="1" allowOverlap="1" wp14:anchorId="7D1F9CCF" wp14:editId="40CFA4E4">
             <wp:simplePos x="0" y="0"/>
@@ -3918,7 +3087,7 @@
                     </pic:cNvPicPr>
                   </pic:nvPicPr>
                   <pic:blipFill>
-                    <a:blip r:embed="rId9">
+                    <a:blip r:embed="rId8">
                       <a:extLst>
                         <a:ext uri="{28A0092B-C50C-407E-A947-70E740481C1C}">
                           <a14:useLocalDpi xmlns:a14="http://schemas.microsoft.com/office/drawing/2010/main" val="0"/>
@@ -3969,21 +3138,9 @@
         <w:pStyle w:val="Ttulo2"/>
       </w:pPr>
       <w:r>
-        <w:t xml:space="preserve">2.1 </w:t>
+        <w:lastRenderedPageBreak/>
+        <w:t>2.1 Justificativa das melhorias</w:t>
       </w:r>
-      <w:proofErr w:type="spellStart"/>
-      <w:r>
-        <w:t>Justificativa</w:t>
-      </w:r>
-      <w:proofErr w:type="spellEnd"/>
-      <w:r>
-        <w:t xml:space="preserve"> das </w:t>
-      </w:r>
-      <w:proofErr w:type="spellStart"/>
-      <w:r>
-        <w:t>melhorias</w:t>
-      </w:r>
-      <w:proofErr w:type="spellEnd"/>
     </w:p>
     <w:p>
       <w:pPr>
@@ -4329,7 +3486,6 @@
           <w:bCs/>
           <w:lang w:val="pt-BR"/>
         </w:rPr>
-        <w:lastRenderedPageBreak/>
         <w:t>RF05 — Ajuste manual de prioridade</w:t>
       </w:r>
     </w:p>
@@ -4767,6 +3923,7 @@
           <w:bCs/>
           <w:lang w:val="pt-BR"/>
         </w:rPr>
+        <w:lastRenderedPageBreak/>
         <w:t>RNF03 — Segurança</w:t>
       </w:r>
     </w:p>
@@ -5012,7 +4169,6 @@
         <w:rPr>
           <w:lang w:val="pt-BR"/>
         </w:rPr>
-        <w:lastRenderedPageBreak/>
         <w:t>O paciente somente poderá entrar na fila após realização da triagem.</w:t>
       </w:r>
     </w:p>
@@ -5352,7 +4508,6 @@
         <w:rPr>
           <w:lang w:val="pt-BR"/>
         </w:rPr>
-        <w:lastRenderedPageBreak/>
         <w:t xml:space="preserve">4.1 Diagrama de casos de uso </w:t>
       </w:r>
       <w:r>
@@ -5378,7 +4533,7 @@
                     </pic:cNvPicPr>
                   </pic:nvPicPr>
                   <pic:blipFill>
-                    <a:blip r:embed="rId10">
+                    <a:blip r:embed="rId9">
                       <a:extLst>
                         <a:ext uri="{28A0092B-C50C-407E-A947-70E740481C1C}">
                           <a14:useLocalDpi xmlns:a14="http://schemas.microsoft.com/office/drawing/2010/main" val="0"/>
@@ -5546,7 +4701,6 @@
         <w:rPr>
           <w:lang w:val="pt-BR"/>
         </w:rPr>
-        <w:lastRenderedPageBreak/>
         <w:t xml:space="preserve">4.2 Especificação detalhada de 3 UCs </w:t>
       </w:r>
     </w:p>
@@ -5603,21 +4757,7 @@
         <w:rPr>
           <w:lang w:val="pt-BR"/>
         </w:rPr>
-        <w:t xml:space="preserve"> Eduardo </w:t>
-      </w:r>
-      <w:proofErr w:type="spellStart"/>
-      <w:r>
-        <w:rPr>
-          <w:lang w:val="pt-BR"/>
-        </w:rPr>
-        <w:t>Fabeni</w:t>
-      </w:r>
-      <w:proofErr w:type="spellEnd"/>
-      <w:r>
-        <w:rPr>
-          <w:lang w:val="pt-BR"/>
-        </w:rPr>
-        <w:t xml:space="preserve"> Johannsen / </w:t>
+        <w:t xml:space="preserve"> Eduardo Fabeni Johannsen / </w:t>
       </w:r>
       <w:r>
         <w:rPr>
@@ -6221,6 +5361,7 @@
           <w:szCs w:val="28"/>
           <w:lang w:val="pt-BR"/>
         </w:rPr>
+        <w:lastRenderedPageBreak/>
         <w:t>UC02 — Registrar triagem</w:t>
       </w:r>
     </w:p>
@@ -6247,21 +5388,7 @@
         <w:rPr>
           <w:lang w:val="pt-BR"/>
         </w:rPr>
-        <w:t xml:space="preserve"> Eduardo </w:t>
-      </w:r>
-      <w:proofErr w:type="spellStart"/>
-      <w:r>
-        <w:rPr>
-          <w:lang w:val="pt-BR"/>
-        </w:rPr>
-        <w:t>Fabeni</w:t>
-      </w:r>
-      <w:proofErr w:type="spellEnd"/>
-      <w:r>
-        <w:rPr>
-          <w:lang w:val="pt-BR"/>
-        </w:rPr>
-        <w:t xml:space="preserve"> Johannsen / Kauan </w:t>
+        <w:t xml:space="preserve"> Eduardo Fabeni Johannsen / Kauan </w:t>
       </w:r>
       <w:r>
         <w:rPr>
@@ -6411,7 +5538,6 @@
           <w:bCs/>
           <w:lang w:val="pt-BR"/>
         </w:rPr>
-        <w:lastRenderedPageBreak/>
         <w:t>Pós-condições</w:t>
       </w:r>
     </w:p>
@@ -6876,30 +6002,8 @@
         <w:rPr>
           <w:lang w:val="pt-BR"/>
         </w:rPr>
-        <w:t xml:space="preserve"> Eduardo </w:t>
+        <w:t xml:space="preserve"> Eduardo Fabeni Johannsen / Gustavo Bormanieri</w:t>
       </w:r>
-      <w:proofErr w:type="spellStart"/>
-      <w:r>
-        <w:rPr>
-          <w:lang w:val="pt-BR"/>
-        </w:rPr>
-        <w:t>Fabeni</w:t>
-      </w:r>
-      <w:proofErr w:type="spellEnd"/>
-      <w:r>
-        <w:rPr>
-          <w:lang w:val="pt-BR"/>
-        </w:rPr>
-        <w:t xml:space="preserve"> Johannsen / Gustavo </w:t>
-      </w:r>
-      <w:proofErr w:type="spellStart"/>
-      <w:r>
-        <w:rPr>
-          <w:lang w:val="pt-BR"/>
-        </w:rPr>
-        <w:t>Bormanieri</w:t>
-      </w:r>
-      <w:proofErr w:type="spellEnd"/>
     </w:p>
     <w:p>
       <w:pPr>
@@ -7278,7 +6382,6 @@
         <w:rPr>
           <w:lang w:val="pt-BR"/>
         </w:rPr>
-        <w:lastRenderedPageBreak/>
         <w:t xml:space="preserve">A1. O enfermeiro pode alterar manualmente a prioridade definida. </w:t>
       </w:r>
     </w:p>
@@ -7484,11 +6587,300 @@
     </w:p>
     <w:p>
       <w:pPr>
+        <w:pStyle w:val="Ttulo2"/>
+        <w:keepNext w:val="0"/>
+        <w:keepLines w:val="0"/>
+        <w:rPr>
+          <w:lang w:val="pt-BR"/>
+        </w:rPr>
+      </w:pPr>
+      <w:r>
+        <w:rPr>
+          <w:lang w:val="pt-BR"/>
+        </w:rPr>
+        <w:t>5.0 Demonstração da aplicação</w:t>
+      </w:r>
+    </w:p>
+    <w:p>
+      <w:pPr>
+        <w:pStyle w:val="Ttulo2"/>
+        <w:keepNext w:val="0"/>
+        <w:keepLines w:val="0"/>
+      </w:pPr>
+      <w:r>
+        <w:rPr>
+          <w:lang w:val="pt-BR"/>
+        </w:rPr>
+        <w:t>Link:</w:t>
+      </w:r>
+      <w:r>
+        <w:t xml:space="preserve"> </w:t>
+      </w:r>
+    </w:p>
+    <w:p>
+      <w:pPr>
+        <w:pStyle w:val="Ttulo2"/>
+        <w:keepNext w:val="0"/>
+        <w:keepLines w:val="0"/>
+        <w:rPr>
+          <w:color w:val="000000" w:themeColor="text1"/>
+          <w:sz w:val="20"/>
+          <w:szCs w:val="20"/>
+        </w:rPr>
+      </w:pPr>
+      <w:hyperlink r:id="rId10" w:history="1">
+        <w:r>
+          <w:rPr>
+            <w:rStyle w:val="Hyperlink"/>
+            <w:color w:val="000000" w:themeColor="text1"/>
+            <w:sz w:val="20"/>
+            <w:szCs w:val="20"/>
+          </w:rPr>
+          <w:t>https://www.figma.com/design/RfgMcuwERbsd0pOZW7tW7R/KGE-System?node-id=0-1&amp;p=f</w:t>
+        </w:r>
+      </w:hyperlink>
+    </w:p>
+    <w:p>
+      <w:pPr>
+        <w:pStyle w:val="Ttulo2"/>
+        <w:keepNext w:val="0"/>
+        <w:keepLines w:val="0"/>
+      </w:pPr>
+      <w:r>
+        <w:br/>
+      </w:r>
+      <w:r>
+        <w:t xml:space="preserve"> </w:t>
+      </w:r>
+    </w:p>
+    <w:p>
+      <w:pPr>
         <w:spacing w:before="240" w:after="240"/>
-        <w:rPr>
-          <w:lang w:val="pt-BR"/>
-        </w:rPr>
-      </w:pPr>
+      </w:pPr>
+      <w:r>
+        <w:rPr>
+          <w:noProof/>
+        </w:rPr>
+        <w:lastRenderedPageBreak/>
+        <w:drawing>
+          <wp:inline distT="0" distB="0" distL="0" distR="0" wp14:anchorId="59B765EA" wp14:editId="518F5F8E">
+            <wp:extent cx="5612130" cy="5626735"/>
+            <wp:effectExtent l="0" t="0" r="7620" b="0"/>
+            <wp:docPr id="1656741992" name="Imagem 1"/>
+            <wp:cNvGraphicFramePr>
+              <a:graphicFrameLocks xmlns:a="http://schemas.openxmlformats.org/drawingml/2006/main" noChangeAspect="1"/>
+            </wp:cNvGraphicFramePr>
+            <a:graphic xmlns:a="http://schemas.openxmlformats.org/drawingml/2006/main">
+              <a:graphicData uri="http://schemas.openxmlformats.org/drawingml/2006/picture">
+                <pic:pic xmlns:pic="http://schemas.openxmlformats.org/drawingml/2006/picture">
+                  <pic:nvPicPr>
+                    <pic:cNvPr id="1656741992" name=""/>
+                    <pic:cNvPicPr/>
+                  </pic:nvPicPr>
+                  <pic:blipFill>
+                    <a:blip r:embed="rId11"/>
+                    <a:stretch>
+                      <a:fillRect/>
+                    </a:stretch>
+                  </pic:blipFill>
+                  <pic:spPr>
+                    <a:xfrm>
+                      <a:off x="0" y="0"/>
+                      <a:ext cx="5612130" cy="5626735"/>
+                    </a:xfrm>
+                    <a:prstGeom prst="rect">
+                      <a:avLst/>
+                    </a:prstGeom>
+                  </pic:spPr>
+                </pic:pic>
+              </a:graphicData>
+            </a:graphic>
+          </wp:inline>
+        </w:drawing>
+      </w:r>
+      <w:r>
+        <w:rPr>
+          <w:noProof/>
+        </w:rPr>
+        <w:lastRenderedPageBreak/>
+        <w:drawing>
+          <wp:inline distT="0" distB="0" distL="0" distR="0" wp14:anchorId="109CF933" wp14:editId="6FD053D8">
+            <wp:extent cx="5612130" cy="3117850"/>
+            <wp:effectExtent l="0" t="0" r="7620" b="6350"/>
+            <wp:docPr id="511576747" name="Imagem 1"/>
+            <wp:cNvGraphicFramePr>
+              <a:graphicFrameLocks xmlns:a="http://schemas.openxmlformats.org/drawingml/2006/main" noChangeAspect="1"/>
+            </wp:cNvGraphicFramePr>
+            <a:graphic xmlns:a="http://schemas.openxmlformats.org/drawingml/2006/main">
+              <a:graphicData uri="http://schemas.openxmlformats.org/drawingml/2006/picture">
+                <pic:pic xmlns:pic="http://schemas.openxmlformats.org/drawingml/2006/picture">
+                  <pic:nvPicPr>
+                    <pic:cNvPr id="511576747" name=""/>
+                    <pic:cNvPicPr/>
+                  </pic:nvPicPr>
+                  <pic:blipFill>
+                    <a:blip r:embed="rId12"/>
+                    <a:stretch>
+                      <a:fillRect/>
+                    </a:stretch>
+                  </pic:blipFill>
+                  <pic:spPr>
+                    <a:xfrm>
+                      <a:off x="0" y="0"/>
+                      <a:ext cx="5612130" cy="3117850"/>
+                    </a:xfrm>
+                    <a:prstGeom prst="rect">
+                      <a:avLst/>
+                    </a:prstGeom>
+                  </pic:spPr>
+                </pic:pic>
+              </a:graphicData>
+            </a:graphic>
+          </wp:inline>
+        </w:drawing>
+      </w:r>
+    </w:p>
+    <w:p>
+      <w:pPr>
+        <w:spacing w:before="240" w:after="240"/>
+        <w:rPr>
+          <w:u w:val="single"/>
+        </w:rPr>
+      </w:pPr>
+      <w:r>
+        <w:rPr>
+          <w:noProof/>
+        </w:rPr>
+        <w:drawing>
+          <wp:inline distT="0" distB="0" distL="0" distR="0" wp14:anchorId="16AEDB16" wp14:editId="6E8C4A85">
+            <wp:extent cx="5612130" cy="3576955"/>
+            <wp:effectExtent l="0" t="0" r="7620" b="4445"/>
+            <wp:docPr id="525484355" name="Imagem 1"/>
+            <wp:cNvGraphicFramePr>
+              <a:graphicFrameLocks xmlns:a="http://schemas.openxmlformats.org/drawingml/2006/main" noChangeAspect="1"/>
+            </wp:cNvGraphicFramePr>
+            <a:graphic xmlns:a="http://schemas.openxmlformats.org/drawingml/2006/main">
+              <a:graphicData uri="http://schemas.openxmlformats.org/drawingml/2006/picture">
+                <pic:pic xmlns:pic="http://schemas.openxmlformats.org/drawingml/2006/picture">
+                  <pic:nvPicPr>
+                    <pic:cNvPr id="525484355" name=""/>
+                    <pic:cNvPicPr/>
+                  </pic:nvPicPr>
+                  <pic:blipFill>
+                    <a:blip r:embed="rId13"/>
+                    <a:stretch>
+                      <a:fillRect/>
+                    </a:stretch>
+                  </pic:blipFill>
+                  <pic:spPr>
+                    <a:xfrm>
+                      <a:off x="0" y="0"/>
+                      <a:ext cx="5612130" cy="3576955"/>
+                    </a:xfrm>
+                    <a:prstGeom prst="rect">
+                      <a:avLst/>
+                    </a:prstGeom>
+                  </pic:spPr>
+                </pic:pic>
+              </a:graphicData>
+            </a:graphic>
+          </wp:inline>
+        </w:drawing>
+      </w:r>
+    </w:p>
+    <w:p>
+      <w:pPr>
+        <w:spacing w:before="240" w:after="240"/>
+      </w:pPr>
+      <w:r>
+        <w:rPr>
+          <w:noProof/>
+        </w:rPr>
+        <w:lastRenderedPageBreak/>
+        <w:drawing>
+          <wp:inline distT="0" distB="0" distL="0" distR="0" wp14:anchorId="2EC2B67B" wp14:editId="72262885">
+            <wp:extent cx="5612130" cy="3194050"/>
+            <wp:effectExtent l="0" t="0" r="7620" b="6350"/>
+            <wp:docPr id="1636836042" name="Imagem 1"/>
+            <wp:cNvGraphicFramePr>
+              <a:graphicFrameLocks xmlns:a="http://schemas.openxmlformats.org/drawingml/2006/main" noChangeAspect="1"/>
+            </wp:cNvGraphicFramePr>
+            <a:graphic xmlns:a="http://schemas.openxmlformats.org/drawingml/2006/main">
+              <a:graphicData uri="http://schemas.openxmlformats.org/drawingml/2006/picture">
+                <pic:pic xmlns:pic="http://schemas.openxmlformats.org/drawingml/2006/picture">
+                  <pic:nvPicPr>
+                    <pic:cNvPr id="1636836042" name=""/>
+                    <pic:cNvPicPr/>
+                  </pic:nvPicPr>
+                  <pic:blipFill>
+                    <a:blip r:embed="rId14"/>
+                    <a:stretch>
+                      <a:fillRect/>
+                    </a:stretch>
+                  </pic:blipFill>
+                  <pic:spPr>
+                    <a:xfrm>
+                      <a:off x="0" y="0"/>
+                      <a:ext cx="5612130" cy="3194050"/>
+                    </a:xfrm>
+                    <a:prstGeom prst="rect">
+                      <a:avLst/>
+                    </a:prstGeom>
+                  </pic:spPr>
+                </pic:pic>
+              </a:graphicData>
+            </a:graphic>
+          </wp:inline>
+        </w:drawing>
+      </w:r>
+    </w:p>
+    <w:p>
+      <w:pPr>
+        <w:spacing w:before="240" w:after="240"/>
+        <w:rPr>
+          <w:u w:val="single"/>
+        </w:rPr>
+      </w:pPr>
+      <w:r>
+        <w:rPr>
+          <w:noProof/>
+        </w:rPr>
+        <w:drawing>
+          <wp:inline distT="0" distB="0" distL="0" distR="0" wp14:anchorId="72E88704" wp14:editId="661DC874">
+            <wp:extent cx="5612130" cy="3147695"/>
+            <wp:effectExtent l="0" t="0" r="7620" b="0"/>
+            <wp:docPr id="1475311632" name="Imagem 1"/>
+            <wp:cNvGraphicFramePr>
+              <a:graphicFrameLocks xmlns:a="http://schemas.openxmlformats.org/drawingml/2006/main" noChangeAspect="1"/>
+            </wp:cNvGraphicFramePr>
+            <a:graphic xmlns:a="http://schemas.openxmlformats.org/drawingml/2006/main">
+              <a:graphicData uri="http://schemas.openxmlformats.org/drawingml/2006/picture">
+                <pic:pic xmlns:pic="http://schemas.openxmlformats.org/drawingml/2006/picture">
+                  <pic:nvPicPr>
+                    <pic:cNvPr id="1475311632" name=""/>
+                    <pic:cNvPicPr/>
+                  </pic:nvPicPr>
+                  <pic:blipFill>
+                    <a:blip r:embed="rId15"/>
+                    <a:stretch>
+                      <a:fillRect/>
+                    </a:stretch>
+                  </pic:blipFill>
+                  <pic:spPr>
+                    <a:xfrm>
+                      <a:off x="0" y="0"/>
+                      <a:ext cx="5612130" cy="3147695"/>
+                    </a:xfrm>
+                    <a:prstGeom prst="rect">
+                      <a:avLst/>
+                    </a:prstGeom>
+                  </pic:spPr>
+                </pic:pic>
+              </a:graphicData>
+            </a:graphic>
+          </wp:inline>
+        </w:drawing>
+      </w:r>
     </w:p>
     <w:sectPr>
       <w:pgSz w:w="12240" w:h="15840"/>
@@ -22427,6 +21819,18 @@
       <w:lang w:val="pt-BR" w:eastAsia="pt-BR"/>
     </w:rPr>
   </w:style>
+  <w:style w:type="character" w:styleId="MenoPendente">
+    <w:name w:val="Unresolved Mention"/>
+    <w:basedOn w:val="Fontepargpadro"/>
+    <w:uiPriority w:val="99"/>
+    <w:semiHidden/>
+    <w:unhideWhenUsed/>
+    <w:rsid w:val="003D7807"/>
+    <w:rPr>
+      <w:color w:val="605E5C"/>
+      <w:shd w:val="clear" w:color="auto" w:fill="E1DFDD"/>
+    </w:rPr>
+  </w:style>
 </w:styles>
 </file>
 

</xml_diff>

<commit_message>
Feito correções passadas pela professora após apresentação
</commit_message>
<xml_diff>
--- a/Engenharia_de_Software/Trabalho_m1/Docs_V2/Trabalho_V2.docx
+++ b/Engenharia_de_Software/Trabalho_m1/Docs_V2/Trabalho_V2.docx
@@ -1,6 +1,6 @@
 
 <file path=word/document.xml><?xml version="1.0" encoding="utf-8"?>
-<w:document xmlns:wpc="http://schemas.microsoft.com/office/word/2010/wordprocessingCanvas" xmlns:cx="http://schemas.microsoft.com/office/drawing/2014/chartex" xmlns:cx1="http://schemas.microsoft.com/office/drawing/2015/9/8/chartex" xmlns:cx2="http://schemas.microsoft.com/office/drawing/2015/10/21/chartex" xmlns:cx3="http://schemas.microsoft.com/office/drawing/2016/5/9/chartex" xmlns:cx4="http://schemas.microsoft.com/office/drawing/2016/5/10/chartex" xmlns:cx5="http://schemas.microsoft.com/office/drawing/2016/5/11/chartex" xmlns:cx6="http://schemas.microsoft.com/office/drawing/2016/5/12/chartex" xmlns:cx7="http://schemas.microsoft.com/office/drawing/2016/5/13/chartex" xmlns:cx8="http://schemas.microsoft.com/office/drawing/2016/5/14/chartex" xmlns:mc="http://schemas.openxmlformats.org/markup-compatibility/2006" xmlns:aink="http://schemas.microsoft.com/office/drawing/2016/ink" xmlns:am3d="http://schemas.microsoft.com/office/drawing/2017/model3d" xmlns:o="urn:schemas-microsoft-com:office:office" xmlns:oel="http://schemas.microsoft.com/office/2019/extlst" xmlns:r="http://schemas.openxmlformats.org/officeDocument/2006/relationships" xmlns:m="http://schemas.openxmlformats.org/officeDocument/2006/math" xmlns:v="urn:schemas-microsoft-com:vml" xmlns:wp14="http://schemas.microsoft.com/office/word/2010/wordprocessingDrawing" xmlns:wp="http://schemas.openxmlformats.org/drawingml/2006/wordprocessingDrawing" xmlns:w10="urn:schemas-microsoft-com:office:word" xmlns:w="http://schemas.openxmlformats.org/wordprocessingml/2006/main" xmlns:w14="http://schemas.microsoft.com/office/word/2010/wordml" xmlns:w15="http://schemas.microsoft.com/office/word/2012/wordml" xmlns:w16cex="http://schemas.microsoft.com/office/word/2018/wordml/cex" xmlns:w16cid="http://schemas.microsoft.com/office/word/2016/wordml/cid" xmlns:w16="http://schemas.microsoft.com/office/word/2018/wordml" xmlns:w16du="http://schemas.microsoft.com/office/word/2023/wordml/word16du" xmlns:w16sdtdh="http://schemas.microsoft.com/office/word/2020/wordml/sdtdatahash" xmlns:w16sdtfl="http://schemas.microsoft.com/office/word/2024/wordml/sdtformatlock" xmlns:w16se="http://schemas.microsoft.com/office/word/2015/wordml/symex" xmlns:wpg="http://schemas.microsoft.com/office/word/2010/wordprocessingGroup" xmlns:wpi="http://schemas.microsoft.com/office/word/2010/wordprocessingInk" xmlns:wne="http://schemas.microsoft.com/office/word/2006/wordml" xmlns:wps="http://schemas.microsoft.com/office/word/2010/wordprocessingShape" mc:Ignorable="w14 w15 w16se w16cid w16 w16cex w16sdtdh w16sdtfl w16du wp14">
+<w:document xmlns:wpc="http://schemas.microsoft.com/office/word/2010/wordprocessingCanvas" xmlns:cx="http://schemas.microsoft.com/office/drawing/2014/chartex" xmlns:mc="http://schemas.openxmlformats.org/markup-compatibility/2006" xmlns:o="urn:schemas-microsoft-com:office:office" xmlns:r="http://schemas.openxmlformats.org/officeDocument/2006/relationships" xmlns:m="http://schemas.openxmlformats.org/officeDocument/2006/math" xmlns:v="urn:schemas-microsoft-com:vml" xmlns:wp14="http://schemas.microsoft.com/office/word/2010/wordprocessingDrawing" xmlns:wp="http://schemas.openxmlformats.org/drawingml/2006/wordprocessingDrawing" xmlns:w10="urn:schemas-microsoft-com:office:word" xmlns:w="http://schemas.openxmlformats.org/wordprocessingml/2006/main" xmlns:w14="http://schemas.microsoft.com/office/word/2010/wordml" xmlns:w15="http://schemas.microsoft.com/office/word/2012/wordml" xmlns:w16se="http://schemas.microsoft.com/office/word/2015/wordml/symex" xmlns:wpg="http://schemas.microsoft.com/office/word/2010/wordprocessingGroup" xmlns:wpi="http://schemas.microsoft.com/office/word/2010/wordprocessingInk" xmlns:wne="http://schemas.microsoft.com/office/word/2006/wordml" xmlns:wps="http://schemas.microsoft.com/office/word/2010/wordprocessingShape" mc:Ignorable="w14 w15 w16se wp14">
   <w:body>
     <w:p>
       <w:pPr>
@@ -80,36 +80,6 @@
         </w:rPr>
         <w:t xml:space="preserve">Escola Politécnica </w:t>
       </w:r>
-    </w:p>
-    <w:p>
-      <w:pPr>
-        <w:jc w:val="center"/>
-        <w:rPr>
-          <w:lang w:val="pt-BR"/>
-        </w:rPr>
-      </w:pPr>
-    </w:p>
-    <w:p>
-      <w:pPr>
-        <w:jc w:val="center"/>
-        <w:rPr>
-          <w:lang w:val="pt-BR"/>
-        </w:rPr>
-      </w:pPr>
-      <w:r>
-        <w:rPr>
-          <w:lang w:val="pt-BR"/>
-        </w:rPr>
-        <w:t>NÚCLEO DE ELETIVAS INTERESCOLAS DA ESCOLA POLITÉCNICA</w:t>
-      </w:r>
-    </w:p>
-    <w:p>
-      <w:pPr>
-        <w:jc w:val="center"/>
-        <w:rPr>
-          <w:lang w:val="pt-BR"/>
-        </w:rPr>
-      </w:pPr>
     </w:p>
     <w:p>
       <w:pPr>
@@ -328,7 +298,6 @@
                 <w:b/>
                 <w:bCs/>
               </w:rPr>
-              <w:lastRenderedPageBreak/>
               <w:t>Item</w:t>
             </w:r>
           </w:p>
@@ -484,6 +453,7 @@
               <w:spacing w:before="240" w:after="240"/>
             </w:pPr>
             <w:r>
+              <w:lastRenderedPageBreak/>
               <w:t>Visão geral + escopo</w:t>
             </w:r>
           </w:p>
@@ -1666,7 +1636,6 @@
               <w:spacing w:before="240" w:after="240"/>
             </w:pPr>
             <w:r>
-              <w:lastRenderedPageBreak/>
               <w:t>(Somente V2) Rastreabilidade final</w:t>
             </w:r>
           </w:p>
@@ -1799,7 +1768,16 @@
                 <w:szCs w:val="12"/>
                 <w:lang w:val="pt-BR"/>
               </w:rPr>
-              <w:t>https://github.com/EduardoFabeniJohannsen/Ciencia_da_Computacao_UNIVALI/commit/80154e7d44d953acf2464dd420d224e521d0fdcb</w:t>
+              <w:t>https://github.com/EduardoFabeniJohannsen/Ciencia_da_Computacao_UNIVALI/commit/80154e7d4</w:t>
+            </w:r>
+            <w:r>
+              <w:rPr>
+                <w:sz w:val="12"/>
+                <w:szCs w:val="12"/>
+                <w:lang w:val="pt-BR"/>
+              </w:rPr>
+              <w:lastRenderedPageBreak/>
+              <w:t>4d953acf2464dd420d224e521d0fdcb</w:t>
             </w:r>
           </w:p>
         </w:tc>
@@ -1836,6 +1814,7 @@
               <w:rPr>
                 <w:lang w:val="pt-BR"/>
               </w:rPr>
+              <w:lastRenderedPageBreak/>
               <w:t>(Somente V2) Modelo de domínio</w:t>
             </w:r>
           </w:p>
@@ -2576,7 +2555,6 @@
         <w:rPr>
           <w:lang w:val="pt-BR"/>
         </w:rPr>
-        <w:lastRenderedPageBreak/>
         <w:br/>
         <w:t>Observação: O GitHub será utilizado como evidência de versionamento e autoria do projeto, enquanto o documento PDF/Word será considerado a entrega formal da disciplina.</w:t>
       </w:r>
@@ -2799,7 +2777,6 @@
         <w:pStyle w:val="Commarcadores2"/>
       </w:pPr>
       <w:r>
-        <w:lastRenderedPageBreak/>
         <w:t>Recepcionistas</w:t>
       </w:r>
     </w:p>
@@ -2830,6 +2807,7 @@
         <w:rPr>
           <w:lang w:val="pt-BR"/>
         </w:rPr>
+        <w:lastRenderedPageBreak/>
         <w:t>Comunidade atendida pela unidade de saúde</w:t>
       </w:r>
     </w:p>
@@ -3138,7 +3116,6 @@
         <w:pStyle w:val="Ttulo2"/>
       </w:pPr>
       <w:r>
-        <w:lastRenderedPageBreak/>
         <w:t>2.1 Justificativa das melhorias</w:t>
       </w:r>
     </w:p>
@@ -3147,6 +3124,7 @@
         <w:pStyle w:val="NormalWeb"/>
       </w:pPr>
       <w:r>
+        <w:lastRenderedPageBreak/>
         <w:t>O processo proposto busca melhorar a organização do atendimento em unidades públicas de saúde por meio da priorização dinâmica de pacientes conforme critérios clínicos definidos durante a triagem. Diferente de processos tradicionais baseados apenas em ordem de chegada, o sistema organiza automaticamente a fila conforme o nível de risco do paciente, reduzindo o tempo de espera para casos graves. Além disso, o processo aumenta a transparência do atendimento ao disponibilizar informações sobre a fila e o tempo estimado de espera. A utilização de um fluxo padronizado também contribui para maior controle operacional e apoio à tomada de decisão pelos profissionais da unidade.</w:t>
       </w:r>
     </w:p>
@@ -3283,6 +3261,7 @@
         <w:rPr>
           <w:lang w:val="pt-BR"/>
         </w:rPr>
+        <w:lastRenderedPageBreak/>
         <w:t xml:space="preserve">3. REQUISITOS </w:t>
       </w:r>
     </w:p>
@@ -3923,7 +3902,6 @@
           <w:bCs/>
           <w:lang w:val="pt-BR"/>
         </w:rPr>
-        <w:lastRenderedPageBreak/>
         <w:t>RNF03 — Segurança</w:t>
       </w:r>
     </w:p>
@@ -3966,6 +3944,7 @@
           <w:bCs/>
           <w:lang w:val="pt-BR"/>
         </w:rPr>
+        <w:lastRenderedPageBreak/>
         <w:t>RNF04 — Integridade dos dados</w:t>
       </w:r>
     </w:p>
@@ -4513,13 +4492,13 @@
       <w:r>
         <w:rPr>
           <w:noProof/>
-          <w:lang w:val="pt-BR"/>
+          <w:lang w:val="pt-BR" w:eastAsia="pt-BR"/>
         </w:rPr>
         <w:drawing>
-          <wp:inline distT="0" distB="0" distL="0" distR="0" wp14:anchorId="50236A16" wp14:editId="04F342BC">
-            <wp:extent cx="5607050" cy="3735070"/>
-            <wp:effectExtent l="0" t="0" r="0" b="0"/>
-            <wp:docPr id="874408794" name="Imagem 1"/>
+          <wp:inline distT="0" distB="0" distL="0" distR="0" wp14:anchorId="69D19E03" wp14:editId="5F07D765">
+            <wp:extent cx="5612130" cy="3741420"/>
+            <wp:effectExtent l="0" t="0" r="7620" b="0"/>
+            <wp:docPr id="3" name="Imagem 3" descr="casos_de_uso.png"/>
             <wp:cNvGraphicFramePr>
               <a:graphicFrameLocks xmlns:a="http://schemas.openxmlformats.org/drawingml/2006/main" noChangeAspect="1"/>
             </wp:cNvGraphicFramePr>
@@ -4527,7 +4506,7 @@
               <a:graphicData uri="http://schemas.openxmlformats.org/drawingml/2006/picture">
                 <pic:pic xmlns:pic="http://schemas.openxmlformats.org/drawingml/2006/picture">
                   <pic:nvPicPr>
-                    <pic:cNvPr id="0" name="Picture 3"/>
+                    <pic:cNvPr id="0" name="Picture 3" descr="casos_de_uso.png"/>
                     <pic:cNvPicPr>
                       <a:picLocks noChangeAspect="1" noChangeArrowheads="1"/>
                     </pic:cNvPicPr>
@@ -4548,7 +4527,7 @@
                   <pic:spPr bwMode="auto">
                     <a:xfrm>
                       <a:off x="0" y="0"/>
-                      <a:ext cx="5607050" cy="3735070"/>
+                      <a:ext cx="5612130" cy="3741420"/>
                     </a:xfrm>
                     <a:prstGeom prst="rect">
                       <a:avLst/>
@@ -5361,7 +5340,6 @@
           <w:szCs w:val="28"/>
           <w:lang w:val="pt-BR"/>
         </w:rPr>
-        <w:lastRenderedPageBreak/>
         <w:t>UC02 — Registrar triagem</w:t>
       </w:r>
     </w:p>
@@ -5440,6 +5418,7 @@
           <w:bCs/>
           <w:lang w:val="pt-BR"/>
         </w:rPr>
+        <w:lastRenderedPageBreak/>
         <w:t>Objetivo:</w:t>
       </w:r>
       <w:r>
@@ -6264,6 +6243,7 @@
         <w:rPr>
           <w:lang w:val="pt-BR"/>
         </w:rPr>
+        <w:lastRenderedPageBreak/>
         <w:t xml:space="preserve">O sistema identifica o nível de gravidade do paciente. </w:t>
       </w:r>
     </w:p>
@@ -6591,6 +6571,7 @@
         <w:keepNext w:val="0"/>
         <w:keepLines w:val="0"/>
         <w:rPr>
+          <w:u w:val="single"/>
           <w:lang w:val="pt-BR"/>
         </w:rPr>
       </w:pPr>
@@ -6598,7 +6579,2277 @@
         <w:rPr>
           <w:lang w:val="pt-BR"/>
         </w:rPr>
-        <w:t>5.0 Demonstração da aplicação</w:t>
+        <w:t xml:space="preserve">5.0 </w:t>
+      </w:r>
+      <w:r>
+        <w:rPr>
+          <w:lang w:val="pt-BR"/>
+        </w:rPr>
+        <w:t>Rastreabilidade Final:</w:t>
+      </w:r>
+      <w:r>
+        <w:rPr>
+          <w:lang w:val="pt-BR"/>
+        </w:rPr>
+        <w:br/>
+      </w:r>
+    </w:p>
+    <w:tbl>
+      <w:tblPr>
+        <w:tblStyle w:val="Tabelacomgrade"/>
+        <w:tblW w:w="10207" w:type="dxa"/>
+        <w:tblInd w:w="-885" w:type="dxa"/>
+        <w:tblLook w:val="04A0" w:firstRow="1" w:lastRow="0" w:firstColumn="1" w:lastColumn="0" w:noHBand="0" w:noVBand="1"/>
+      </w:tblPr>
+      <w:tblGrid>
+        <w:gridCol w:w="3515"/>
+        <w:gridCol w:w="1394"/>
+        <w:gridCol w:w="1591"/>
+        <w:gridCol w:w="1719"/>
+        <w:gridCol w:w="1988"/>
+      </w:tblGrid>
+      <w:tr>
+        <w:tc>
+          <w:tcPr>
+            <w:tcW w:w="3970" w:type="dxa"/>
+            <w:vAlign w:val="center"/>
+          </w:tcPr>
+          <w:p>
+            <w:pPr>
+              <w:pStyle w:val="Ttulo2"/>
+              <w:keepNext w:val="0"/>
+              <w:keepLines w:val="0"/>
+              <w:jc w:val="center"/>
+              <w:outlineLvl w:val="1"/>
+              <w:rPr>
+                <w:color w:val="000000" w:themeColor="text1"/>
+                <w:sz w:val="24"/>
+                <w:szCs w:val="24"/>
+                <w:u w:val="single"/>
+                <w:lang w:val="pt-BR"/>
+              </w:rPr>
+            </w:pPr>
+            <w:bookmarkStart w:id="5" w:name="_GoBack"/>
+            <w:bookmarkEnd w:id="5"/>
+            <w:r>
+              <w:rPr>
+                <w:bCs w:val="0"/>
+                <w:color w:val="000000" w:themeColor="text1"/>
+                <w:sz w:val="24"/>
+                <w:szCs w:val="24"/>
+              </w:rPr>
+              <w:t>RF</w:t>
+            </w:r>
+          </w:p>
+        </w:tc>
+        <w:tc>
+          <w:tcPr>
+            <w:tcW w:w="748" w:type="dxa"/>
+            <w:vAlign w:val="center"/>
+          </w:tcPr>
+          <w:p>
+            <w:pPr>
+              <w:pStyle w:val="Ttulo2"/>
+              <w:keepNext w:val="0"/>
+              <w:keepLines w:val="0"/>
+              <w:jc w:val="center"/>
+              <w:outlineLvl w:val="1"/>
+              <w:rPr>
+                <w:color w:val="000000" w:themeColor="text1"/>
+                <w:sz w:val="24"/>
+                <w:szCs w:val="24"/>
+                <w:u w:val="single"/>
+                <w:lang w:val="pt-BR"/>
+              </w:rPr>
+            </w:pPr>
+            <w:r>
+              <w:rPr>
+                <w:bCs w:val="0"/>
+                <w:color w:val="000000" w:themeColor="text1"/>
+                <w:sz w:val="24"/>
+                <w:szCs w:val="24"/>
+              </w:rPr>
+              <w:t>UC relacionado</w:t>
+            </w:r>
+          </w:p>
+        </w:tc>
+        <w:tc>
+          <w:tcPr>
+            <w:tcW w:w="1681" w:type="dxa"/>
+            <w:vAlign w:val="center"/>
+          </w:tcPr>
+          <w:p>
+            <w:pPr>
+              <w:pStyle w:val="Ttulo2"/>
+              <w:keepNext w:val="0"/>
+              <w:keepLines w:val="0"/>
+              <w:jc w:val="center"/>
+              <w:outlineLvl w:val="1"/>
+              <w:rPr>
+                <w:color w:val="000000" w:themeColor="text1"/>
+                <w:sz w:val="24"/>
+                <w:szCs w:val="24"/>
+                <w:u w:val="single"/>
+                <w:lang w:val="pt-BR"/>
+              </w:rPr>
+            </w:pPr>
+            <w:r>
+              <w:rPr>
+                <w:bCs w:val="0"/>
+                <w:color w:val="000000" w:themeColor="text1"/>
+                <w:sz w:val="24"/>
+                <w:szCs w:val="24"/>
+              </w:rPr>
+              <w:t>RN aplicáveis</w:t>
+            </w:r>
+          </w:p>
+        </w:tc>
+        <w:tc>
+          <w:tcPr>
+            <w:tcW w:w="1753" w:type="dxa"/>
+            <w:vAlign w:val="center"/>
+          </w:tcPr>
+          <w:p>
+            <w:pPr>
+              <w:pStyle w:val="Ttulo2"/>
+              <w:keepNext w:val="0"/>
+              <w:keepLines w:val="0"/>
+              <w:jc w:val="center"/>
+              <w:outlineLvl w:val="1"/>
+              <w:rPr>
+                <w:color w:val="000000" w:themeColor="text1"/>
+                <w:sz w:val="24"/>
+                <w:szCs w:val="24"/>
+                <w:u w:val="single"/>
+                <w:lang w:val="pt-BR"/>
+              </w:rPr>
+            </w:pPr>
+            <w:r>
+              <w:rPr>
+                <w:bCs w:val="0"/>
+                <w:color w:val="000000" w:themeColor="text1"/>
+                <w:sz w:val="24"/>
+                <w:szCs w:val="24"/>
+              </w:rPr>
+              <w:t>Classes principais</w:t>
+            </w:r>
+          </w:p>
+        </w:tc>
+        <w:tc>
+          <w:tcPr>
+            <w:tcW w:w="2055" w:type="dxa"/>
+            <w:vAlign w:val="center"/>
+          </w:tcPr>
+          <w:p>
+            <w:pPr>
+              <w:pStyle w:val="Ttulo2"/>
+              <w:keepNext w:val="0"/>
+              <w:keepLines w:val="0"/>
+              <w:jc w:val="center"/>
+              <w:outlineLvl w:val="1"/>
+              <w:rPr>
+                <w:color w:val="000000" w:themeColor="text1"/>
+                <w:sz w:val="24"/>
+                <w:szCs w:val="24"/>
+                <w:u w:val="single"/>
+                <w:lang w:val="pt-BR"/>
+              </w:rPr>
+            </w:pPr>
+            <w:r>
+              <w:rPr>
+                <w:bCs w:val="0"/>
+                <w:color w:val="000000" w:themeColor="text1"/>
+                <w:sz w:val="24"/>
+                <w:szCs w:val="24"/>
+              </w:rPr>
+              <w:t>Tela/Protótipo</w:t>
+            </w:r>
+          </w:p>
+        </w:tc>
+      </w:tr>
+      <w:tr>
+        <w:tc>
+          <w:tcPr>
+            <w:tcW w:w="3970" w:type="dxa"/>
+            <w:vAlign w:val="center"/>
+          </w:tcPr>
+          <w:p>
+            <w:pPr>
+              <w:pStyle w:val="Ttulo2"/>
+              <w:keepNext w:val="0"/>
+              <w:keepLines w:val="0"/>
+              <w:jc w:val="center"/>
+              <w:outlineLvl w:val="1"/>
+              <w:rPr>
+                <w:b w:val="0"/>
+                <w:color w:val="000000" w:themeColor="text1"/>
+                <w:sz w:val="24"/>
+                <w:szCs w:val="24"/>
+                <w:u w:val="single"/>
+                <w:lang w:val="pt-BR"/>
+              </w:rPr>
+            </w:pPr>
+            <w:r>
+              <w:rPr>
+                <w:b w:val="0"/>
+                <w:color w:val="000000" w:themeColor="text1"/>
+                <w:sz w:val="24"/>
+                <w:szCs w:val="24"/>
+              </w:rPr>
+              <w:t>RF01 — Cadastro de pacientes</w:t>
+            </w:r>
+          </w:p>
+        </w:tc>
+        <w:tc>
+          <w:tcPr>
+            <w:tcW w:w="748" w:type="dxa"/>
+            <w:vAlign w:val="center"/>
+          </w:tcPr>
+          <w:p>
+            <w:pPr>
+              <w:pStyle w:val="Ttulo2"/>
+              <w:keepNext w:val="0"/>
+              <w:keepLines w:val="0"/>
+              <w:jc w:val="center"/>
+              <w:outlineLvl w:val="1"/>
+              <w:rPr>
+                <w:b w:val="0"/>
+                <w:color w:val="000000" w:themeColor="text1"/>
+                <w:sz w:val="24"/>
+                <w:szCs w:val="24"/>
+                <w:u w:val="single"/>
+                <w:lang w:val="pt-BR"/>
+              </w:rPr>
+            </w:pPr>
+            <w:r>
+              <w:rPr>
+                <w:b w:val="0"/>
+                <w:color w:val="000000" w:themeColor="text1"/>
+                <w:sz w:val="24"/>
+                <w:szCs w:val="24"/>
+              </w:rPr>
+              <w:t>UC01</w:t>
+            </w:r>
+          </w:p>
+        </w:tc>
+        <w:tc>
+          <w:tcPr>
+            <w:tcW w:w="1681" w:type="dxa"/>
+            <w:vAlign w:val="center"/>
+          </w:tcPr>
+          <w:p>
+            <w:pPr>
+              <w:pStyle w:val="Ttulo2"/>
+              <w:keepNext w:val="0"/>
+              <w:keepLines w:val="0"/>
+              <w:jc w:val="center"/>
+              <w:outlineLvl w:val="1"/>
+              <w:rPr>
+                <w:b w:val="0"/>
+                <w:color w:val="000000" w:themeColor="text1"/>
+                <w:sz w:val="24"/>
+                <w:szCs w:val="24"/>
+                <w:u w:val="single"/>
+                <w:lang w:val="pt-BR"/>
+              </w:rPr>
+            </w:pPr>
+            <w:r>
+              <w:rPr>
+                <w:b w:val="0"/>
+                <w:color w:val="000000" w:themeColor="text1"/>
+                <w:sz w:val="24"/>
+                <w:szCs w:val="24"/>
+              </w:rPr>
+              <w:t>RN08</w:t>
+            </w:r>
+          </w:p>
+        </w:tc>
+        <w:tc>
+          <w:tcPr>
+            <w:tcW w:w="1753" w:type="dxa"/>
+            <w:vAlign w:val="center"/>
+          </w:tcPr>
+          <w:p>
+            <w:pPr>
+              <w:pStyle w:val="Ttulo2"/>
+              <w:keepNext w:val="0"/>
+              <w:keepLines w:val="0"/>
+              <w:jc w:val="center"/>
+              <w:outlineLvl w:val="1"/>
+              <w:rPr>
+                <w:b w:val="0"/>
+                <w:color w:val="000000" w:themeColor="text1"/>
+                <w:sz w:val="24"/>
+                <w:szCs w:val="24"/>
+                <w:u w:val="single"/>
+                <w:lang w:val="pt-BR"/>
+              </w:rPr>
+            </w:pPr>
+            <w:r>
+              <w:rPr>
+                <w:b w:val="0"/>
+                <w:color w:val="000000" w:themeColor="text1"/>
+                <w:sz w:val="24"/>
+                <w:szCs w:val="24"/>
+              </w:rPr>
+              <w:t>Paciente</w:t>
+            </w:r>
+          </w:p>
+        </w:tc>
+        <w:tc>
+          <w:tcPr>
+            <w:tcW w:w="2055" w:type="dxa"/>
+            <w:vAlign w:val="center"/>
+          </w:tcPr>
+          <w:p>
+            <w:pPr>
+              <w:pStyle w:val="Ttulo2"/>
+              <w:keepNext w:val="0"/>
+              <w:keepLines w:val="0"/>
+              <w:jc w:val="center"/>
+              <w:outlineLvl w:val="1"/>
+              <w:rPr>
+                <w:b w:val="0"/>
+                <w:color w:val="000000" w:themeColor="text1"/>
+                <w:sz w:val="24"/>
+                <w:szCs w:val="24"/>
+                <w:u w:val="single"/>
+                <w:lang w:val="pt-BR"/>
+              </w:rPr>
+            </w:pPr>
+            <w:r>
+              <w:rPr>
+                <w:b w:val="0"/>
+                <w:color w:val="000000" w:themeColor="text1"/>
+                <w:sz w:val="24"/>
+                <w:szCs w:val="24"/>
+              </w:rPr>
+              <w:t>Tela de cadastro</w:t>
+            </w:r>
+          </w:p>
+        </w:tc>
+      </w:tr>
+      <w:tr>
+        <w:tc>
+          <w:tcPr>
+            <w:tcW w:w="3970" w:type="dxa"/>
+            <w:vAlign w:val="center"/>
+          </w:tcPr>
+          <w:p>
+            <w:pPr>
+              <w:pStyle w:val="Ttulo2"/>
+              <w:keepNext w:val="0"/>
+              <w:keepLines w:val="0"/>
+              <w:jc w:val="center"/>
+              <w:outlineLvl w:val="1"/>
+              <w:rPr>
+                <w:b w:val="0"/>
+                <w:color w:val="000000" w:themeColor="text1"/>
+                <w:sz w:val="24"/>
+                <w:szCs w:val="24"/>
+                <w:u w:val="single"/>
+                <w:lang w:val="pt-BR"/>
+              </w:rPr>
+            </w:pPr>
+            <w:r>
+              <w:rPr>
+                <w:b w:val="0"/>
+                <w:color w:val="000000" w:themeColor="text1"/>
+                <w:sz w:val="24"/>
+                <w:szCs w:val="24"/>
+              </w:rPr>
+              <w:t>RF02 — Atualização de cadastro</w:t>
+            </w:r>
+          </w:p>
+        </w:tc>
+        <w:tc>
+          <w:tcPr>
+            <w:tcW w:w="748" w:type="dxa"/>
+            <w:vAlign w:val="center"/>
+          </w:tcPr>
+          <w:p>
+            <w:pPr>
+              <w:pStyle w:val="Ttulo2"/>
+              <w:keepNext w:val="0"/>
+              <w:keepLines w:val="0"/>
+              <w:jc w:val="center"/>
+              <w:outlineLvl w:val="1"/>
+              <w:rPr>
+                <w:b w:val="0"/>
+                <w:color w:val="000000" w:themeColor="text1"/>
+                <w:sz w:val="24"/>
+                <w:szCs w:val="24"/>
+                <w:u w:val="single"/>
+                <w:lang w:val="pt-BR"/>
+              </w:rPr>
+            </w:pPr>
+            <w:r>
+              <w:rPr>
+                <w:b w:val="0"/>
+                <w:color w:val="000000" w:themeColor="text1"/>
+                <w:sz w:val="24"/>
+                <w:szCs w:val="24"/>
+              </w:rPr>
+              <w:t>UC01</w:t>
+            </w:r>
+          </w:p>
+        </w:tc>
+        <w:tc>
+          <w:tcPr>
+            <w:tcW w:w="1681" w:type="dxa"/>
+            <w:vAlign w:val="center"/>
+          </w:tcPr>
+          <w:p>
+            <w:pPr>
+              <w:pStyle w:val="Ttulo2"/>
+              <w:keepNext w:val="0"/>
+              <w:keepLines w:val="0"/>
+              <w:jc w:val="center"/>
+              <w:outlineLvl w:val="1"/>
+              <w:rPr>
+                <w:b w:val="0"/>
+                <w:color w:val="000000" w:themeColor="text1"/>
+                <w:sz w:val="24"/>
+                <w:szCs w:val="24"/>
+                <w:u w:val="single"/>
+                <w:lang w:val="pt-BR"/>
+              </w:rPr>
+            </w:pPr>
+            <w:r>
+              <w:rPr>
+                <w:b w:val="0"/>
+                <w:color w:val="000000" w:themeColor="text1"/>
+                <w:sz w:val="24"/>
+                <w:szCs w:val="24"/>
+              </w:rPr>
+              <w:t>RN08</w:t>
+            </w:r>
+          </w:p>
+        </w:tc>
+        <w:tc>
+          <w:tcPr>
+            <w:tcW w:w="1753" w:type="dxa"/>
+            <w:vAlign w:val="center"/>
+          </w:tcPr>
+          <w:p>
+            <w:pPr>
+              <w:pStyle w:val="Ttulo2"/>
+              <w:keepNext w:val="0"/>
+              <w:keepLines w:val="0"/>
+              <w:jc w:val="center"/>
+              <w:outlineLvl w:val="1"/>
+              <w:rPr>
+                <w:b w:val="0"/>
+                <w:color w:val="000000" w:themeColor="text1"/>
+                <w:sz w:val="24"/>
+                <w:szCs w:val="24"/>
+                <w:u w:val="single"/>
+                <w:lang w:val="pt-BR"/>
+              </w:rPr>
+            </w:pPr>
+            <w:r>
+              <w:rPr>
+                <w:b w:val="0"/>
+                <w:color w:val="000000" w:themeColor="text1"/>
+                <w:sz w:val="24"/>
+                <w:szCs w:val="24"/>
+              </w:rPr>
+              <w:t>Paciente</w:t>
+            </w:r>
+          </w:p>
+        </w:tc>
+        <w:tc>
+          <w:tcPr>
+            <w:tcW w:w="2055" w:type="dxa"/>
+            <w:vAlign w:val="center"/>
+          </w:tcPr>
+          <w:p>
+            <w:pPr>
+              <w:pStyle w:val="Ttulo2"/>
+              <w:keepNext w:val="0"/>
+              <w:keepLines w:val="0"/>
+              <w:jc w:val="center"/>
+              <w:outlineLvl w:val="1"/>
+              <w:rPr>
+                <w:b w:val="0"/>
+                <w:color w:val="000000" w:themeColor="text1"/>
+                <w:sz w:val="24"/>
+                <w:szCs w:val="24"/>
+                <w:u w:val="single"/>
+                <w:lang w:val="pt-BR"/>
+              </w:rPr>
+            </w:pPr>
+            <w:r>
+              <w:rPr>
+                <w:b w:val="0"/>
+                <w:color w:val="000000" w:themeColor="text1"/>
+                <w:sz w:val="24"/>
+                <w:szCs w:val="24"/>
+              </w:rPr>
+              <w:t>Tela de cadastro</w:t>
+            </w:r>
+          </w:p>
+        </w:tc>
+      </w:tr>
+      <w:tr>
+        <w:tc>
+          <w:tcPr>
+            <w:tcW w:w="3970" w:type="dxa"/>
+            <w:vAlign w:val="center"/>
+          </w:tcPr>
+          <w:p>
+            <w:pPr>
+              <w:pStyle w:val="Ttulo2"/>
+              <w:keepNext w:val="0"/>
+              <w:keepLines w:val="0"/>
+              <w:jc w:val="center"/>
+              <w:outlineLvl w:val="1"/>
+              <w:rPr>
+                <w:b w:val="0"/>
+                <w:color w:val="000000" w:themeColor="text1"/>
+                <w:sz w:val="24"/>
+                <w:szCs w:val="24"/>
+                <w:u w:val="single"/>
+                <w:lang w:val="pt-BR"/>
+              </w:rPr>
+            </w:pPr>
+            <w:r>
+              <w:rPr>
+                <w:b w:val="0"/>
+                <w:color w:val="000000" w:themeColor="text1"/>
+                <w:sz w:val="24"/>
+                <w:szCs w:val="24"/>
+              </w:rPr>
+              <w:t>RF03 — Registro de triagem</w:t>
+            </w:r>
+          </w:p>
+        </w:tc>
+        <w:tc>
+          <w:tcPr>
+            <w:tcW w:w="748" w:type="dxa"/>
+            <w:vAlign w:val="center"/>
+          </w:tcPr>
+          <w:p>
+            <w:pPr>
+              <w:pStyle w:val="Ttulo2"/>
+              <w:keepNext w:val="0"/>
+              <w:keepLines w:val="0"/>
+              <w:jc w:val="center"/>
+              <w:outlineLvl w:val="1"/>
+              <w:rPr>
+                <w:b w:val="0"/>
+                <w:color w:val="000000" w:themeColor="text1"/>
+                <w:sz w:val="24"/>
+                <w:szCs w:val="24"/>
+                <w:u w:val="single"/>
+                <w:lang w:val="pt-BR"/>
+              </w:rPr>
+            </w:pPr>
+            <w:r>
+              <w:rPr>
+                <w:b w:val="0"/>
+                <w:color w:val="000000" w:themeColor="text1"/>
+                <w:sz w:val="24"/>
+                <w:szCs w:val="24"/>
+              </w:rPr>
+              <w:t>UC02</w:t>
+            </w:r>
+          </w:p>
+        </w:tc>
+        <w:tc>
+          <w:tcPr>
+            <w:tcW w:w="1681" w:type="dxa"/>
+            <w:vAlign w:val="center"/>
+          </w:tcPr>
+          <w:p>
+            <w:pPr>
+              <w:pStyle w:val="Ttulo2"/>
+              <w:keepNext w:val="0"/>
+              <w:keepLines w:val="0"/>
+              <w:jc w:val="center"/>
+              <w:outlineLvl w:val="1"/>
+              <w:rPr>
+                <w:b w:val="0"/>
+                <w:color w:val="000000" w:themeColor="text1"/>
+                <w:sz w:val="24"/>
+                <w:szCs w:val="24"/>
+                <w:u w:val="single"/>
+                <w:lang w:val="pt-BR"/>
+              </w:rPr>
+            </w:pPr>
+            <w:r>
+              <w:rPr>
+                <w:b w:val="0"/>
+                <w:color w:val="000000" w:themeColor="text1"/>
+                <w:sz w:val="24"/>
+                <w:szCs w:val="24"/>
+              </w:rPr>
+              <w:t>RN02, RN08</w:t>
+            </w:r>
+          </w:p>
+        </w:tc>
+        <w:tc>
+          <w:tcPr>
+            <w:tcW w:w="1753" w:type="dxa"/>
+            <w:vAlign w:val="center"/>
+          </w:tcPr>
+          <w:p>
+            <w:pPr>
+              <w:pStyle w:val="Ttulo2"/>
+              <w:keepNext w:val="0"/>
+              <w:keepLines w:val="0"/>
+              <w:jc w:val="center"/>
+              <w:outlineLvl w:val="1"/>
+              <w:rPr>
+                <w:b w:val="0"/>
+                <w:color w:val="000000" w:themeColor="text1"/>
+                <w:sz w:val="24"/>
+                <w:szCs w:val="24"/>
+                <w:u w:val="single"/>
+                <w:lang w:val="pt-BR"/>
+              </w:rPr>
+            </w:pPr>
+            <w:r>
+              <w:rPr>
+                <w:b w:val="0"/>
+                <w:color w:val="000000" w:themeColor="text1"/>
+                <w:sz w:val="24"/>
+                <w:szCs w:val="24"/>
+              </w:rPr>
+              <w:t>Triagem, Enfermeiro</w:t>
+            </w:r>
+          </w:p>
+        </w:tc>
+        <w:tc>
+          <w:tcPr>
+            <w:tcW w:w="2055" w:type="dxa"/>
+            <w:vAlign w:val="center"/>
+          </w:tcPr>
+          <w:p>
+            <w:pPr>
+              <w:pStyle w:val="Ttulo2"/>
+              <w:keepNext w:val="0"/>
+              <w:keepLines w:val="0"/>
+              <w:jc w:val="center"/>
+              <w:outlineLvl w:val="1"/>
+              <w:rPr>
+                <w:b w:val="0"/>
+                <w:color w:val="000000" w:themeColor="text1"/>
+                <w:sz w:val="24"/>
+                <w:szCs w:val="24"/>
+                <w:u w:val="single"/>
+                <w:lang w:val="pt-BR"/>
+              </w:rPr>
+            </w:pPr>
+            <w:r>
+              <w:rPr>
+                <w:b w:val="0"/>
+                <w:color w:val="000000" w:themeColor="text1"/>
+                <w:sz w:val="24"/>
+                <w:szCs w:val="24"/>
+              </w:rPr>
+              <w:t>Tela de triagem</w:t>
+            </w:r>
+          </w:p>
+        </w:tc>
+      </w:tr>
+      <w:tr>
+        <w:tc>
+          <w:tcPr>
+            <w:tcW w:w="3970" w:type="dxa"/>
+            <w:vAlign w:val="center"/>
+          </w:tcPr>
+          <w:p>
+            <w:pPr>
+              <w:pStyle w:val="Ttulo2"/>
+              <w:keepNext w:val="0"/>
+              <w:keepLines w:val="0"/>
+              <w:jc w:val="center"/>
+              <w:outlineLvl w:val="1"/>
+              <w:rPr>
+                <w:b w:val="0"/>
+                <w:color w:val="000000" w:themeColor="text1"/>
+                <w:sz w:val="24"/>
+                <w:szCs w:val="24"/>
+                <w:u w:val="single"/>
+                <w:lang w:val="pt-BR"/>
+              </w:rPr>
+            </w:pPr>
+            <w:r>
+              <w:rPr>
+                <w:b w:val="0"/>
+                <w:color w:val="000000" w:themeColor="text1"/>
+                <w:sz w:val="24"/>
+                <w:szCs w:val="24"/>
+              </w:rPr>
+              <w:t>RF04 — Classificação automática de prioridade</w:t>
+            </w:r>
+          </w:p>
+        </w:tc>
+        <w:tc>
+          <w:tcPr>
+            <w:tcW w:w="748" w:type="dxa"/>
+            <w:vAlign w:val="center"/>
+          </w:tcPr>
+          <w:p>
+            <w:pPr>
+              <w:pStyle w:val="Ttulo2"/>
+              <w:keepNext w:val="0"/>
+              <w:keepLines w:val="0"/>
+              <w:jc w:val="center"/>
+              <w:outlineLvl w:val="1"/>
+              <w:rPr>
+                <w:b w:val="0"/>
+                <w:color w:val="000000" w:themeColor="text1"/>
+                <w:sz w:val="24"/>
+                <w:szCs w:val="24"/>
+                <w:u w:val="single"/>
+                <w:lang w:val="pt-BR"/>
+              </w:rPr>
+            </w:pPr>
+            <w:r>
+              <w:rPr>
+                <w:b w:val="0"/>
+                <w:color w:val="000000" w:themeColor="text1"/>
+                <w:sz w:val="24"/>
+                <w:szCs w:val="24"/>
+              </w:rPr>
+              <w:t>UC03</w:t>
+            </w:r>
+          </w:p>
+        </w:tc>
+        <w:tc>
+          <w:tcPr>
+            <w:tcW w:w="1681" w:type="dxa"/>
+            <w:vAlign w:val="center"/>
+          </w:tcPr>
+          <w:p>
+            <w:pPr>
+              <w:pStyle w:val="Ttulo2"/>
+              <w:keepNext w:val="0"/>
+              <w:keepLines w:val="0"/>
+              <w:jc w:val="center"/>
+              <w:outlineLvl w:val="1"/>
+              <w:rPr>
+                <w:b w:val="0"/>
+                <w:color w:val="000000" w:themeColor="text1"/>
+                <w:sz w:val="24"/>
+                <w:szCs w:val="24"/>
+                <w:u w:val="single"/>
+                <w:lang w:val="pt-BR"/>
+              </w:rPr>
+            </w:pPr>
+            <w:r>
+              <w:rPr>
+                <w:b w:val="0"/>
+                <w:color w:val="000000" w:themeColor="text1"/>
+                <w:sz w:val="24"/>
+                <w:szCs w:val="24"/>
+              </w:rPr>
+              <w:t>RN01, RN04</w:t>
+            </w:r>
+          </w:p>
+        </w:tc>
+        <w:tc>
+          <w:tcPr>
+            <w:tcW w:w="1753" w:type="dxa"/>
+            <w:vAlign w:val="center"/>
+          </w:tcPr>
+          <w:p>
+            <w:pPr>
+              <w:pStyle w:val="Ttulo2"/>
+              <w:keepNext w:val="0"/>
+              <w:keepLines w:val="0"/>
+              <w:jc w:val="center"/>
+              <w:outlineLvl w:val="1"/>
+              <w:rPr>
+                <w:b w:val="0"/>
+                <w:color w:val="000000" w:themeColor="text1"/>
+                <w:sz w:val="24"/>
+                <w:szCs w:val="24"/>
+                <w:u w:val="single"/>
+                <w:lang w:val="pt-BR"/>
+              </w:rPr>
+            </w:pPr>
+            <w:r>
+              <w:rPr>
+                <w:b w:val="0"/>
+                <w:color w:val="000000" w:themeColor="text1"/>
+                <w:sz w:val="24"/>
+                <w:szCs w:val="24"/>
+              </w:rPr>
+              <w:t>Prioridade, Triagem</w:t>
+            </w:r>
+          </w:p>
+        </w:tc>
+        <w:tc>
+          <w:tcPr>
+            <w:tcW w:w="2055" w:type="dxa"/>
+            <w:vAlign w:val="center"/>
+          </w:tcPr>
+          <w:p>
+            <w:pPr>
+              <w:pStyle w:val="Ttulo2"/>
+              <w:keepNext w:val="0"/>
+              <w:keepLines w:val="0"/>
+              <w:jc w:val="center"/>
+              <w:outlineLvl w:val="1"/>
+              <w:rPr>
+                <w:b w:val="0"/>
+                <w:color w:val="000000" w:themeColor="text1"/>
+                <w:sz w:val="24"/>
+                <w:szCs w:val="24"/>
+                <w:u w:val="single"/>
+                <w:lang w:val="pt-BR"/>
+              </w:rPr>
+            </w:pPr>
+            <w:r>
+              <w:rPr>
+                <w:b w:val="0"/>
+                <w:color w:val="000000" w:themeColor="text1"/>
+                <w:sz w:val="24"/>
+                <w:szCs w:val="24"/>
+              </w:rPr>
+              <w:t>Tela de triagem</w:t>
+            </w:r>
+          </w:p>
+        </w:tc>
+      </w:tr>
+      <w:tr>
+        <w:tc>
+          <w:tcPr>
+            <w:tcW w:w="3970" w:type="dxa"/>
+            <w:vAlign w:val="center"/>
+          </w:tcPr>
+          <w:p>
+            <w:pPr>
+              <w:pStyle w:val="Ttulo2"/>
+              <w:keepNext w:val="0"/>
+              <w:keepLines w:val="0"/>
+              <w:jc w:val="center"/>
+              <w:outlineLvl w:val="1"/>
+              <w:rPr>
+                <w:b w:val="0"/>
+                <w:color w:val="000000" w:themeColor="text1"/>
+                <w:sz w:val="24"/>
+                <w:szCs w:val="24"/>
+                <w:u w:val="single"/>
+                <w:lang w:val="pt-BR"/>
+              </w:rPr>
+            </w:pPr>
+            <w:r>
+              <w:rPr>
+                <w:b w:val="0"/>
+                <w:color w:val="000000" w:themeColor="text1"/>
+                <w:sz w:val="24"/>
+                <w:szCs w:val="24"/>
+              </w:rPr>
+              <w:t>RF05 — Ajuste manual de prioridade</w:t>
+            </w:r>
+          </w:p>
+        </w:tc>
+        <w:tc>
+          <w:tcPr>
+            <w:tcW w:w="748" w:type="dxa"/>
+            <w:vAlign w:val="center"/>
+          </w:tcPr>
+          <w:p>
+            <w:pPr>
+              <w:pStyle w:val="Ttulo2"/>
+              <w:keepNext w:val="0"/>
+              <w:keepLines w:val="0"/>
+              <w:jc w:val="center"/>
+              <w:outlineLvl w:val="1"/>
+              <w:rPr>
+                <w:b w:val="0"/>
+                <w:color w:val="000000" w:themeColor="text1"/>
+                <w:sz w:val="24"/>
+                <w:szCs w:val="24"/>
+                <w:u w:val="single"/>
+                <w:lang w:val="pt-BR"/>
+              </w:rPr>
+            </w:pPr>
+            <w:r>
+              <w:rPr>
+                <w:b w:val="0"/>
+                <w:color w:val="000000" w:themeColor="text1"/>
+                <w:sz w:val="24"/>
+                <w:szCs w:val="24"/>
+              </w:rPr>
+              <w:t>UC03</w:t>
+            </w:r>
+          </w:p>
+        </w:tc>
+        <w:tc>
+          <w:tcPr>
+            <w:tcW w:w="1681" w:type="dxa"/>
+            <w:vAlign w:val="center"/>
+          </w:tcPr>
+          <w:p>
+            <w:pPr>
+              <w:pStyle w:val="Ttulo2"/>
+              <w:keepNext w:val="0"/>
+              <w:keepLines w:val="0"/>
+              <w:jc w:val="center"/>
+              <w:outlineLvl w:val="1"/>
+              <w:rPr>
+                <w:b w:val="0"/>
+                <w:color w:val="000000" w:themeColor="text1"/>
+                <w:sz w:val="24"/>
+                <w:szCs w:val="24"/>
+                <w:u w:val="single"/>
+                <w:lang w:val="pt-BR"/>
+              </w:rPr>
+            </w:pPr>
+            <w:r>
+              <w:rPr>
+                <w:b w:val="0"/>
+                <w:color w:val="000000" w:themeColor="text1"/>
+                <w:sz w:val="24"/>
+                <w:szCs w:val="24"/>
+              </w:rPr>
+              <w:t>RN05</w:t>
+            </w:r>
+          </w:p>
+        </w:tc>
+        <w:tc>
+          <w:tcPr>
+            <w:tcW w:w="1753" w:type="dxa"/>
+            <w:vAlign w:val="center"/>
+          </w:tcPr>
+          <w:p>
+            <w:pPr>
+              <w:pStyle w:val="Ttulo2"/>
+              <w:keepNext w:val="0"/>
+              <w:keepLines w:val="0"/>
+              <w:jc w:val="center"/>
+              <w:outlineLvl w:val="1"/>
+              <w:rPr>
+                <w:b w:val="0"/>
+                <w:color w:val="000000" w:themeColor="text1"/>
+                <w:sz w:val="24"/>
+                <w:szCs w:val="24"/>
+                <w:u w:val="single"/>
+                <w:lang w:val="pt-BR"/>
+              </w:rPr>
+            </w:pPr>
+            <w:r>
+              <w:rPr>
+                <w:b w:val="0"/>
+                <w:color w:val="000000" w:themeColor="text1"/>
+                <w:sz w:val="24"/>
+                <w:szCs w:val="24"/>
+              </w:rPr>
+              <w:t>Prioridade, Enfermeiro</w:t>
+            </w:r>
+          </w:p>
+        </w:tc>
+        <w:tc>
+          <w:tcPr>
+            <w:tcW w:w="2055" w:type="dxa"/>
+            <w:vAlign w:val="center"/>
+          </w:tcPr>
+          <w:p>
+            <w:pPr>
+              <w:pStyle w:val="Ttulo2"/>
+              <w:keepNext w:val="0"/>
+              <w:keepLines w:val="0"/>
+              <w:jc w:val="center"/>
+              <w:outlineLvl w:val="1"/>
+              <w:rPr>
+                <w:b w:val="0"/>
+                <w:color w:val="000000" w:themeColor="text1"/>
+                <w:sz w:val="24"/>
+                <w:szCs w:val="24"/>
+                <w:u w:val="single"/>
+                <w:lang w:val="pt-BR"/>
+              </w:rPr>
+            </w:pPr>
+            <w:r>
+              <w:rPr>
+                <w:b w:val="0"/>
+                <w:color w:val="000000" w:themeColor="text1"/>
+                <w:sz w:val="24"/>
+                <w:szCs w:val="24"/>
+              </w:rPr>
+              <w:t>Tela de triagem</w:t>
+            </w:r>
+          </w:p>
+        </w:tc>
+      </w:tr>
+      <w:tr>
+        <w:tc>
+          <w:tcPr>
+            <w:tcW w:w="3970" w:type="dxa"/>
+            <w:vAlign w:val="center"/>
+          </w:tcPr>
+          <w:p>
+            <w:pPr>
+              <w:pStyle w:val="Ttulo2"/>
+              <w:keepNext w:val="0"/>
+              <w:keepLines w:val="0"/>
+              <w:jc w:val="center"/>
+              <w:outlineLvl w:val="1"/>
+              <w:rPr>
+                <w:b w:val="0"/>
+                <w:color w:val="000000" w:themeColor="text1"/>
+                <w:sz w:val="24"/>
+                <w:szCs w:val="24"/>
+                <w:u w:val="single"/>
+                <w:lang w:val="pt-BR"/>
+              </w:rPr>
+            </w:pPr>
+            <w:r>
+              <w:rPr>
+                <w:b w:val="0"/>
+                <w:color w:val="000000" w:themeColor="text1"/>
+                <w:sz w:val="24"/>
+                <w:szCs w:val="24"/>
+              </w:rPr>
+              <w:t>RF06 — Inserção na fila</w:t>
+            </w:r>
+          </w:p>
+        </w:tc>
+        <w:tc>
+          <w:tcPr>
+            <w:tcW w:w="748" w:type="dxa"/>
+            <w:vAlign w:val="center"/>
+          </w:tcPr>
+          <w:p>
+            <w:pPr>
+              <w:pStyle w:val="Ttulo2"/>
+              <w:keepNext w:val="0"/>
+              <w:keepLines w:val="0"/>
+              <w:jc w:val="center"/>
+              <w:outlineLvl w:val="1"/>
+              <w:rPr>
+                <w:b w:val="0"/>
+                <w:color w:val="000000" w:themeColor="text1"/>
+                <w:sz w:val="24"/>
+                <w:szCs w:val="24"/>
+                <w:u w:val="single"/>
+                <w:lang w:val="pt-BR"/>
+              </w:rPr>
+            </w:pPr>
+            <w:r>
+              <w:rPr>
+                <w:b w:val="0"/>
+                <w:color w:val="000000" w:themeColor="text1"/>
+                <w:sz w:val="24"/>
+                <w:szCs w:val="24"/>
+              </w:rPr>
+              <w:t>UC01</w:t>
+            </w:r>
+          </w:p>
+        </w:tc>
+        <w:tc>
+          <w:tcPr>
+            <w:tcW w:w="1681" w:type="dxa"/>
+            <w:vAlign w:val="center"/>
+          </w:tcPr>
+          <w:p>
+            <w:pPr>
+              <w:pStyle w:val="Ttulo2"/>
+              <w:keepNext w:val="0"/>
+              <w:keepLines w:val="0"/>
+              <w:jc w:val="center"/>
+              <w:outlineLvl w:val="1"/>
+              <w:rPr>
+                <w:b w:val="0"/>
+                <w:color w:val="000000" w:themeColor="text1"/>
+                <w:sz w:val="24"/>
+                <w:szCs w:val="24"/>
+                <w:u w:val="single"/>
+                <w:lang w:val="pt-BR"/>
+              </w:rPr>
+            </w:pPr>
+            <w:r>
+              <w:rPr>
+                <w:b w:val="0"/>
+                <w:color w:val="000000" w:themeColor="text1"/>
+                <w:sz w:val="24"/>
+                <w:szCs w:val="24"/>
+              </w:rPr>
+              <w:t>RN03</w:t>
+            </w:r>
+          </w:p>
+        </w:tc>
+        <w:tc>
+          <w:tcPr>
+            <w:tcW w:w="1753" w:type="dxa"/>
+            <w:vAlign w:val="center"/>
+          </w:tcPr>
+          <w:p>
+            <w:pPr>
+              <w:pStyle w:val="Ttulo2"/>
+              <w:keepNext w:val="0"/>
+              <w:keepLines w:val="0"/>
+              <w:jc w:val="center"/>
+              <w:outlineLvl w:val="1"/>
+              <w:rPr>
+                <w:b w:val="0"/>
+                <w:color w:val="000000" w:themeColor="text1"/>
+                <w:sz w:val="24"/>
+                <w:szCs w:val="24"/>
+                <w:u w:val="single"/>
+                <w:lang w:val="pt-BR"/>
+              </w:rPr>
+            </w:pPr>
+            <w:r>
+              <w:rPr>
+                <w:b w:val="0"/>
+                <w:color w:val="000000" w:themeColor="text1"/>
+                <w:sz w:val="24"/>
+                <w:szCs w:val="24"/>
+              </w:rPr>
+              <w:t>Fila, Paciente</w:t>
+            </w:r>
+          </w:p>
+        </w:tc>
+        <w:tc>
+          <w:tcPr>
+            <w:tcW w:w="2055" w:type="dxa"/>
+            <w:vAlign w:val="center"/>
+          </w:tcPr>
+          <w:p>
+            <w:pPr>
+              <w:pStyle w:val="Ttulo2"/>
+              <w:keepNext w:val="0"/>
+              <w:keepLines w:val="0"/>
+              <w:jc w:val="center"/>
+              <w:outlineLvl w:val="1"/>
+              <w:rPr>
+                <w:b w:val="0"/>
+                <w:color w:val="000000" w:themeColor="text1"/>
+                <w:sz w:val="24"/>
+                <w:szCs w:val="24"/>
+                <w:u w:val="single"/>
+                <w:lang w:val="pt-BR"/>
+              </w:rPr>
+            </w:pPr>
+            <w:r>
+              <w:rPr>
+                <w:b w:val="0"/>
+                <w:color w:val="000000" w:themeColor="text1"/>
+                <w:sz w:val="24"/>
+                <w:szCs w:val="24"/>
+              </w:rPr>
+              <w:t>Tela da fila</w:t>
+            </w:r>
+          </w:p>
+        </w:tc>
+      </w:tr>
+      <w:tr>
+        <w:tc>
+          <w:tcPr>
+            <w:tcW w:w="3970" w:type="dxa"/>
+            <w:vAlign w:val="center"/>
+          </w:tcPr>
+          <w:p>
+            <w:pPr>
+              <w:pStyle w:val="Ttulo2"/>
+              <w:keepNext w:val="0"/>
+              <w:keepLines w:val="0"/>
+              <w:jc w:val="center"/>
+              <w:outlineLvl w:val="1"/>
+              <w:rPr>
+                <w:b w:val="0"/>
+                <w:color w:val="000000" w:themeColor="text1"/>
+                <w:sz w:val="24"/>
+                <w:szCs w:val="24"/>
+                <w:u w:val="single"/>
+                <w:lang w:val="pt-BR"/>
+              </w:rPr>
+            </w:pPr>
+            <w:r>
+              <w:rPr>
+                <w:b w:val="0"/>
+                <w:color w:val="000000" w:themeColor="text1"/>
+                <w:sz w:val="24"/>
+                <w:szCs w:val="24"/>
+              </w:rPr>
+              <w:t>RF07 — Organização da fila</w:t>
+            </w:r>
+          </w:p>
+        </w:tc>
+        <w:tc>
+          <w:tcPr>
+            <w:tcW w:w="748" w:type="dxa"/>
+            <w:vAlign w:val="center"/>
+          </w:tcPr>
+          <w:p>
+            <w:pPr>
+              <w:pStyle w:val="Ttulo2"/>
+              <w:keepNext w:val="0"/>
+              <w:keepLines w:val="0"/>
+              <w:jc w:val="center"/>
+              <w:outlineLvl w:val="1"/>
+              <w:rPr>
+                <w:b w:val="0"/>
+                <w:color w:val="000000" w:themeColor="text1"/>
+                <w:sz w:val="24"/>
+                <w:szCs w:val="24"/>
+                <w:u w:val="single"/>
+                <w:lang w:val="pt-BR"/>
+              </w:rPr>
+            </w:pPr>
+            <w:r>
+              <w:rPr>
+                <w:b w:val="0"/>
+                <w:color w:val="000000" w:themeColor="text1"/>
+                <w:sz w:val="24"/>
+                <w:szCs w:val="24"/>
+              </w:rPr>
+              <w:t>UC01</w:t>
+            </w:r>
+          </w:p>
+        </w:tc>
+        <w:tc>
+          <w:tcPr>
+            <w:tcW w:w="1681" w:type="dxa"/>
+            <w:vAlign w:val="center"/>
+          </w:tcPr>
+          <w:p>
+            <w:pPr>
+              <w:pStyle w:val="Ttulo2"/>
+              <w:keepNext w:val="0"/>
+              <w:keepLines w:val="0"/>
+              <w:jc w:val="center"/>
+              <w:outlineLvl w:val="1"/>
+              <w:rPr>
+                <w:b w:val="0"/>
+                <w:color w:val="000000" w:themeColor="text1"/>
+                <w:sz w:val="24"/>
+                <w:szCs w:val="24"/>
+                <w:u w:val="single"/>
+                <w:lang w:val="pt-BR"/>
+              </w:rPr>
+            </w:pPr>
+            <w:r>
+              <w:rPr>
+                <w:b w:val="0"/>
+                <w:color w:val="000000" w:themeColor="text1"/>
+                <w:sz w:val="24"/>
+                <w:szCs w:val="24"/>
+              </w:rPr>
+              <w:t>RN01, RN03</w:t>
+            </w:r>
+          </w:p>
+        </w:tc>
+        <w:tc>
+          <w:tcPr>
+            <w:tcW w:w="1753" w:type="dxa"/>
+            <w:vAlign w:val="center"/>
+          </w:tcPr>
+          <w:p>
+            <w:pPr>
+              <w:pStyle w:val="Ttulo2"/>
+              <w:keepNext w:val="0"/>
+              <w:keepLines w:val="0"/>
+              <w:jc w:val="center"/>
+              <w:outlineLvl w:val="1"/>
+              <w:rPr>
+                <w:b w:val="0"/>
+                <w:color w:val="000000" w:themeColor="text1"/>
+                <w:sz w:val="24"/>
+                <w:szCs w:val="24"/>
+                <w:u w:val="single"/>
+                <w:lang w:val="pt-BR"/>
+              </w:rPr>
+            </w:pPr>
+            <w:r>
+              <w:rPr>
+                <w:b w:val="0"/>
+                <w:color w:val="000000" w:themeColor="text1"/>
+                <w:sz w:val="24"/>
+                <w:szCs w:val="24"/>
+              </w:rPr>
+              <w:t>Fila, Prioridade</w:t>
+            </w:r>
+          </w:p>
+        </w:tc>
+        <w:tc>
+          <w:tcPr>
+            <w:tcW w:w="2055" w:type="dxa"/>
+            <w:vAlign w:val="center"/>
+          </w:tcPr>
+          <w:p>
+            <w:pPr>
+              <w:pStyle w:val="Ttulo2"/>
+              <w:keepNext w:val="0"/>
+              <w:keepLines w:val="0"/>
+              <w:jc w:val="center"/>
+              <w:outlineLvl w:val="1"/>
+              <w:rPr>
+                <w:b w:val="0"/>
+                <w:color w:val="000000" w:themeColor="text1"/>
+                <w:sz w:val="24"/>
+                <w:szCs w:val="24"/>
+                <w:u w:val="single"/>
+                <w:lang w:val="pt-BR"/>
+              </w:rPr>
+            </w:pPr>
+            <w:r>
+              <w:rPr>
+                <w:b w:val="0"/>
+                <w:color w:val="000000" w:themeColor="text1"/>
+                <w:sz w:val="24"/>
+                <w:szCs w:val="24"/>
+              </w:rPr>
+              <w:t>Tela da fila</w:t>
+            </w:r>
+          </w:p>
+        </w:tc>
+      </w:tr>
+      <w:tr>
+        <w:tc>
+          <w:tcPr>
+            <w:tcW w:w="3970" w:type="dxa"/>
+            <w:vAlign w:val="center"/>
+          </w:tcPr>
+          <w:p>
+            <w:pPr>
+              <w:pStyle w:val="Ttulo2"/>
+              <w:keepNext w:val="0"/>
+              <w:keepLines w:val="0"/>
+              <w:jc w:val="center"/>
+              <w:outlineLvl w:val="1"/>
+              <w:rPr>
+                <w:b w:val="0"/>
+                <w:color w:val="000000" w:themeColor="text1"/>
+                <w:sz w:val="24"/>
+                <w:szCs w:val="24"/>
+                <w:u w:val="single"/>
+                <w:lang w:val="pt-BR"/>
+              </w:rPr>
+            </w:pPr>
+            <w:r>
+              <w:rPr>
+                <w:b w:val="0"/>
+                <w:color w:val="000000" w:themeColor="text1"/>
+                <w:sz w:val="24"/>
+                <w:szCs w:val="24"/>
+              </w:rPr>
+              <w:t>RF08 — Visualização da fila</w:t>
+            </w:r>
+          </w:p>
+        </w:tc>
+        <w:tc>
+          <w:tcPr>
+            <w:tcW w:w="748" w:type="dxa"/>
+            <w:vAlign w:val="center"/>
+          </w:tcPr>
+          <w:p>
+            <w:pPr>
+              <w:pStyle w:val="Ttulo2"/>
+              <w:keepNext w:val="0"/>
+              <w:keepLines w:val="0"/>
+              <w:jc w:val="center"/>
+              <w:outlineLvl w:val="1"/>
+              <w:rPr>
+                <w:b w:val="0"/>
+                <w:color w:val="000000" w:themeColor="text1"/>
+                <w:sz w:val="24"/>
+                <w:szCs w:val="24"/>
+                <w:u w:val="single"/>
+                <w:lang w:val="pt-BR"/>
+              </w:rPr>
+            </w:pPr>
+            <w:r>
+              <w:rPr>
+                <w:b w:val="0"/>
+                <w:color w:val="000000" w:themeColor="text1"/>
+                <w:sz w:val="24"/>
+                <w:szCs w:val="24"/>
+              </w:rPr>
+              <w:t>UC01</w:t>
+            </w:r>
+          </w:p>
+        </w:tc>
+        <w:tc>
+          <w:tcPr>
+            <w:tcW w:w="1681" w:type="dxa"/>
+            <w:vAlign w:val="center"/>
+          </w:tcPr>
+          <w:p>
+            <w:pPr>
+              <w:pStyle w:val="Ttulo2"/>
+              <w:keepNext w:val="0"/>
+              <w:keepLines w:val="0"/>
+              <w:jc w:val="center"/>
+              <w:outlineLvl w:val="1"/>
+              <w:rPr>
+                <w:b w:val="0"/>
+                <w:color w:val="000000" w:themeColor="text1"/>
+                <w:sz w:val="24"/>
+                <w:szCs w:val="24"/>
+                <w:u w:val="single"/>
+                <w:lang w:val="pt-BR"/>
+              </w:rPr>
+            </w:pPr>
+            <w:r>
+              <w:rPr>
+                <w:b w:val="0"/>
+                <w:color w:val="000000" w:themeColor="text1"/>
+                <w:sz w:val="24"/>
+                <w:szCs w:val="24"/>
+              </w:rPr>
+              <w:t>RN04</w:t>
+            </w:r>
+          </w:p>
+        </w:tc>
+        <w:tc>
+          <w:tcPr>
+            <w:tcW w:w="1753" w:type="dxa"/>
+            <w:vAlign w:val="center"/>
+          </w:tcPr>
+          <w:p>
+            <w:pPr>
+              <w:pStyle w:val="Ttulo2"/>
+              <w:keepNext w:val="0"/>
+              <w:keepLines w:val="0"/>
+              <w:jc w:val="center"/>
+              <w:outlineLvl w:val="1"/>
+              <w:rPr>
+                <w:b w:val="0"/>
+                <w:color w:val="000000" w:themeColor="text1"/>
+                <w:sz w:val="24"/>
+                <w:szCs w:val="24"/>
+                <w:u w:val="single"/>
+                <w:lang w:val="pt-BR"/>
+              </w:rPr>
+            </w:pPr>
+            <w:r>
+              <w:rPr>
+                <w:b w:val="0"/>
+                <w:color w:val="000000" w:themeColor="text1"/>
+                <w:sz w:val="24"/>
+                <w:szCs w:val="24"/>
+              </w:rPr>
+              <w:t>Fila, Médico</w:t>
+            </w:r>
+          </w:p>
+        </w:tc>
+        <w:tc>
+          <w:tcPr>
+            <w:tcW w:w="2055" w:type="dxa"/>
+            <w:vAlign w:val="center"/>
+          </w:tcPr>
+          <w:p>
+            <w:pPr>
+              <w:pStyle w:val="Ttulo2"/>
+              <w:keepNext w:val="0"/>
+              <w:keepLines w:val="0"/>
+              <w:jc w:val="center"/>
+              <w:outlineLvl w:val="1"/>
+              <w:rPr>
+                <w:b w:val="0"/>
+                <w:color w:val="000000" w:themeColor="text1"/>
+                <w:sz w:val="24"/>
+                <w:szCs w:val="24"/>
+                <w:u w:val="single"/>
+                <w:lang w:val="pt-BR"/>
+              </w:rPr>
+            </w:pPr>
+            <w:r>
+              <w:rPr>
+                <w:b w:val="0"/>
+                <w:color w:val="000000" w:themeColor="text1"/>
+                <w:sz w:val="24"/>
+                <w:szCs w:val="24"/>
+              </w:rPr>
+              <w:t>Tela do médico</w:t>
+            </w:r>
+          </w:p>
+        </w:tc>
+      </w:tr>
+      <w:tr>
+        <w:tc>
+          <w:tcPr>
+            <w:tcW w:w="3970" w:type="dxa"/>
+            <w:vAlign w:val="center"/>
+          </w:tcPr>
+          <w:p>
+            <w:pPr>
+              <w:pStyle w:val="Ttulo2"/>
+              <w:keepNext w:val="0"/>
+              <w:keepLines w:val="0"/>
+              <w:jc w:val="center"/>
+              <w:outlineLvl w:val="1"/>
+              <w:rPr>
+                <w:b w:val="0"/>
+                <w:color w:val="000000" w:themeColor="text1"/>
+                <w:sz w:val="24"/>
+                <w:szCs w:val="24"/>
+                <w:u w:val="single"/>
+                <w:lang w:val="pt-BR"/>
+              </w:rPr>
+            </w:pPr>
+            <w:r>
+              <w:rPr>
+                <w:b w:val="0"/>
+                <w:color w:val="000000" w:themeColor="text1"/>
+                <w:sz w:val="24"/>
+                <w:szCs w:val="24"/>
+              </w:rPr>
+              <w:t>RF09 — Chamada do próximo paciente</w:t>
+            </w:r>
+          </w:p>
+        </w:tc>
+        <w:tc>
+          <w:tcPr>
+            <w:tcW w:w="748" w:type="dxa"/>
+            <w:vAlign w:val="center"/>
+          </w:tcPr>
+          <w:p>
+            <w:pPr>
+              <w:pStyle w:val="Ttulo2"/>
+              <w:keepNext w:val="0"/>
+              <w:keepLines w:val="0"/>
+              <w:jc w:val="center"/>
+              <w:outlineLvl w:val="1"/>
+              <w:rPr>
+                <w:b w:val="0"/>
+                <w:color w:val="000000" w:themeColor="text1"/>
+                <w:sz w:val="24"/>
+                <w:szCs w:val="24"/>
+                <w:u w:val="single"/>
+                <w:lang w:val="pt-BR"/>
+              </w:rPr>
+            </w:pPr>
+            <w:r>
+              <w:rPr>
+                <w:b w:val="0"/>
+                <w:color w:val="000000" w:themeColor="text1"/>
+                <w:sz w:val="24"/>
+                <w:szCs w:val="24"/>
+              </w:rPr>
+              <w:t>UC01</w:t>
+            </w:r>
+          </w:p>
+        </w:tc>
+        <w:tc>
+          <w:tcPr>
+            <w:tcW w:w="1681" w:type="dxa"/>
+            <w:vAlign w:val="center"/>
+          </w:tcPr>
+          <w:p>
+            <w:pPr>
+              <w:pStyle w:val="Ttulo2"/>
+              <w:keepNext w:val="0"/>
+              <w:keepLines w:val="0"/>
+              <w:jc w:val="center"/>
+              <w:outlineLvl w:val="1"/>
+              <w:rPr>
+                <w:b w:val="0"/>
+                <w:color w:val="000000" w:themeColor="text1"/>
+                <w:sz w:val="24"/>
+                <w:szCs w:val="24"/>
+                <w:u w:val="single"/>
+                <w:lang w:val="pt-BR"/>
+              </w:rPr>
+            </w:pPr>
+            <w:r>
+              <w:rPr>
+                <w:b w:val="0"/>
+                <w:color w:val="000000" w:themeColor="text1"/>
+                <w:sz w:val="24"/>
+                <w:szCs w:val="24"/>
+              </w:rPr>
+              <w:t>RN04</w:t>
+            </w:r>
+          </w:p>
+        </w:tc>
+        <w:tc>
+          <w:tcPr>
+            <w:tcW w:w="1753" w:type="dxa"/>
+            <w:vAlign w:val="center"/>
+          </w:tcPr>
+          <w:p>
+            <w:pPr>
+              <w:pStyle w:val="Ttulo2"/>
+              <w:keepNext w:val="0"/>
+              <w:keepLines w:val="0"/>
+              <w:jc w:val="center"/>
+              <w:outlineLvl w:val="1"/>
+              <w:rPr>
+                <w:b w:val="0"/>
+                <w:color w:val="000000" w:themeColor="text1"/>
+                <w:sz w:val="24"/>
+                <w:szCs w:val="24"/>
+                <w:u w:val="single"/>
+                <w:lang w:val="pt-BR"/>
+              </w:rPr>
+            </w:pPr>
+            <w:r>
+              <w:rPr>
+                <w:b w:val="0"/>
+                <w:color w:val="000000" w:themeColor="text1"/>
+                <w:sz w:val="24"/>
+                <w:szCs w:val="24"/>
+              </w:rPr>
+              <w:t>Atendimento, Médico</w:t>
+            </w:r>
+          </w:p>
+        </w:tc>
+        <w:tc>
+          <w:tcPr>
+            <w:tcW w:w="2055" w:type="dxa"/>
+            <w:vAlign w:val="center"/>
+          </w:tcPr>
+          <w:p>
+            <w:pPr>
+              <w:pStyle w:val="Ttulo2"/>
+              <w:keepNext w:val="0"/>
+              <w:keepLines w:val="0"/>
+              <w:jc w:val="center"/>
+              <w:outlineLvl w:val="1"/>
+              <w:rPr>
+                <w:b w:val="0"/>
+                <w:color w:val="000000" w:themeColor="text1"/>
+                <w:sz w:val="24"/>
+                <w:szCs w:val="24"/>
+                <w:u w:val="single"/>
+                <w:lang w:val="pt-BR"/>
+              </w:rPr>
+            </w:pPr>
+            <w:r>
+              <w:rPr>
+                <w:b w:val="0"/>
+                <w:color w:val="000000" w:themeColor="text1"/>
+                <w:sz w:val="24"/>
+                <w:szCs w:val="24"/>
+              </w:rPr>
+              <w:t>Tela do médico</w:t>
+            </w:r>
+          </w:p>
+        </w:tc>
+      </w:tr>
+      <w:tr>
+        <w:tc>
+          <w:tcPr>
+            <w:tcW w:w="3970" w:type="dxa"/>
+            <w:vAlign w:val="center"/>
+          </w:tcPr>
+          <w:p>
+            <w:pPr>
+              <w:pStyle w:val="Ttulo2"/>
+              <w:keepNext w:val="0"/>
+              <w:keepLines w:val="0"/>
+              <w:jc w:val="center"/>
+              <w:outlineLvl w:val="1"/>
+              <w:rPr>
+                <w:b w:val="0"/>
+                <w:color w:val="000000" w:themeColor="text1"/>
+                <w:sz w:val="24"/>
+                <w:szCs w:val="24"/>
+                <w:u w:val="single"/>
+                <w:lang w:val="pt-BR"/>
+              </w:rPr>
+            </w:pPr>
+            <w:r>
+              <w:rPr>
+                <w:b w:val="0"/>
+                <w:color w:val="000000" w:themeColor="text1"/>
+                <w:sz w:val="24"/>
+                <w:szCs w:val="24"/>
+              </w:rPr>
+              <w:lastRenderedPageBreak/>
+              <w:t>RF10 — Registro de atendimento</w:t>
+            </w:r>
+          </w:p>
+        </w:tc>
+        <w:tc>
+          <w:tcPr>
+            <w:tcW w:w="748" w:type="dxa"/>
+            <w:vAlign w:val="center"/>
+          </w:tcPr>
+          <w:p>
+            <w:pPr>
+              <w:pStyle w:val="Ttulo2"/>
+              <w:keepNext w:val="0"/>
+              <w:keepLines w:val="0"/>
+              <w:jc w:val="center"/>
+              <w:outlineLvl w:val="1"/>
+              <w:rPr>
+                <w:b w:val="0"/>
+                <w:color w:val="000000" w:themeColor="text1"/>
+                <w:sz w:val="24"/>
+                <w:szCs w:val="24"/>
+                <w:u w:val="single"/>
+                <w:lang w:val="pt-BR"/>
+              </w:rPr>
+            </w:pPr>
+            <w:r>
+              <w:rPr>
+                <w:b w:val="0"/>
+                <w:color w:val="000000" w:themeColor="text1"/>
+                <w:sz w:val="24"/>
+                <w:szCs w:val="24"/>
+              </w:rPr>
+              <w:t>UC01</w:t>
+            </w:r>
+          </w:p>
+        </w:tc>
+        <w:tc>
+          <w:tcPr>
+            <w:tcW w:w="1681" w:type="dxa"/>
+            <w:vAlign w:val="center"/>
+          </w:tcPr>
+          <w:p>
+            <w:pPr>
+              <w:pStyle w:val="Ttulo2"/>
+              <w:keepNext w:val="0"/>
+              <w:keepLines w:val="0"/>
+              <w:jc w:val="center"/>
+              <w:outlineLvl w:val="1"/>
+              <w:rPr>
+                <w:b w:val="0"/>
+                <w:color w:val="000000" w:themeColor="text1"/>
+                <w:sz w:val="24"/>
+                <w:szCs w:val="24"/>
+                <w:u w:val="single"/>
+                <w:lang w:val="pt-BR"/>
+              </w:rPr>
+            </w:pPr>
+            <w:r>
+              <w:rPr>
+                <w:b w:val="0"/>
+                <w:color w:val="000000" w:themeColor="text1"/>
+                <w:sz w:val="24"/>
+                <w:szCs w:val="24"/>
+              </w:rPr>
+              <w:t>RN06</w:t>
+            </w:r>
+          </w:p>
+        </w:tc>
+        <w:tc>
+          <w:tcPr>
+            <w:tcW w:w="1753" w:type="dxa"/>
+            <w:vAlign w:val="center"/>
+          </w:tcPr>
+          <w:p>
+            <w:pPr>
+              <w:pStyle w:val="Ttulo2"/>
+              <w:keepNext w:val="0"/>
+              <w:keepLines w:val="0"/>
+              <w:jc w:val="center"/>
+              <w:outlineLvl w:val="1"/>
+              <w:rPr>
+                <w:b w:val="0"/>
+                <w:color w:val="000000" w:themeColor="text1"/>
+                <w:sz w:val="24"/>
+                <w:szCs w:val="24"/>
+                <w:u w:val="single"/>
+                <w:lang w:val="pt-BR"/>
+              </w:rPr>
+            </w:pPr>
+            <w:r>
+              <w:rPr>
+                <w:b w:val="0"/>
+                <w:color w:val="000000" w:themeColor="text1"/>
+                <w:sz w:val="24"/>
+                <w:szCs w:val="24"/>
+              </w:rPr>
+              <w:t>Atendimento</w:t>
+            </w:r>
+          </w:p>
+        </w:tc>
+        <w:tc>
+          <w:tcPr>
+            <w:tcW w:w="2055" w:type="dxa"/>
+            <w:vAlign w:val="center"/>
+          </w:tcPr>
+          <w:p>
+            <w:pPr>
+              <w:pStyle w:val="Ttulo2"/>
+              <w:keepNext w:val="0"/>
+              <w:keepLines w:val="0"/>
+              <w:jc w:val="center"/>
+              <w:outlineLvl w:val="1"/>
+              <w:rPr>
+                <w:b w:val="0"/>
+                <w:color w:val="000000" w:themeColor="text1"/>
+                <w:sz w:val="24"/>
+                <w:szCs w:val="24"/>
+                <w:u w:val="single"/>
+                <w:lang w:val="pt-BR"/>
+              </w:rPr>
+            </w:pPr>
+            <w:r>
+              <w:rPr>
+                <w:b w:val="0"/>
+                <w:color w:val="000000" w:themeColor="text1"/>
+                <w:sz w:val="24"/>
+                <w:szCs w:val="24"/>
+              </w:rPr>
+              <w:t>Tela do médico</w:t>
+            </w:r>
+          </w:p>
+        </w:tc>
+      </w:tr>
+      <w:tr>
+        <w:tc>
+          <w:tcPr>
+            <w:tcW w:w="3970" w:type="dxa"/>
+            <w:vAlign w:val="center"/>
+          </w:tcPr>
+          <w:p>
+            <w:pPr>
+              <w:pStyle w:val="Ttulo2"/>
+              <w:keepNext w:val="0"/>
+              <w:keepLines w:val="0"/>
+              <w:jc w:val="center"/>
+              <w:outlineLvl w:val="1"/>
+              <w:rPr>
+                <w:b w:val="0"/>
+                <w:color w:val="000000" w:themeColor="text1"/>
+                <w:sz w:val="24"/>
+                <w:szCs w:val="24"/>
+                <w:u w:val="single"/>
+                <w:lang w:val="pt-BR"/>
+              </w:rPr>
+            </w:pPr>
+            <w:r>
+              <w:rPr>
+                <w:b w:val="0"/>
+                <w:color w:val="000000" w:themeColor="text1"/>
+                <w:sz w:val="24"/>
+                <w:szCs w:val="24"/>
+              </w:rPr>
+              <w:t>RF11 — Consulta do tempo estimado</w:t>
+            </w:r>
+          </w:p>
+        </w:tc>
+        <w:tc>
+          <w:tcPr>
+            <w:tcW w:w="748" w:type="dxa"/>
+            <w:vAlign w:val="center"/>
+          </w:tcPr>
+          <w:p>
+            <w:pPr>
+              <w:pStyle w:val="Ttulo2"/>
+              <w:keepNext w:val="0"/>
+              <w:keepLines w:val="0"/>
+              <w:jc w:val="center"/>
+              <w:outlineLvl w:val="1"/>
+              <w:rPr>
+                <w:b w:val="0"/>
+                <w:color w:val="000000" w:themeColor="text1"/>
+                <w:sz w:val="24"/>
+                <w:szCs w:val="24"/>
+                <w:u w:val="single"/>
+                <w:lang w:val="pt-BR"/>
+              </w:rPr>
+            </w:pPr>
+            <w:r>
+              <w:rPr>
+                <w:b w:val="0"/>
+                <w:color w:val="000000" w:themeColor="text1"/>
+                <w:sz w:val="24"/>
+                <w:szCs w:val="24"/>
+              </w:rPr>
+              <w:t>UC01</w:t>
+            </w:r>
+          </w:p>
+        </w:tc>
+        <w:tc>
+          <w:tcPr>
+            <w:tcW w:w="1681" w:type="dxa"/>
+            <w:vAlign w:val="center"/>
+          </w:tcPr>
+          <w:p>
+            <w:pPr>
+              <w:pStyle w:val="Ttulo2"/>
+              <w:keepNext w:val="0"/>
+              <w:keepLines w:val="0"/>
+              <w:jc w:val="center"/>
+              <w:outlineLvl w:val="1"/>
+              <w:rPr>
+                <w:b w:val="0"/>
+                <w:color w:val="000000" w:themeColor="text1"/>
+                <w:sz w:val="24"/>
+                <w:szCs w:val="24"/>
+                <w:u w:val="single"/>
+                <w:lang w:val="pt-BR"/>
+              </w:rPr>
+            </w:pPr>
+            <w:r>
+              <w:rPr>
+                <w:b w:val="0"/>
+                <w:color w:val="000000" w:themeColor="text1"/>
+                <w:sz w:val="24"/>
+                <w:szCs w:val="24"/>
+              </w:rPr>
+              <w:t>RN07</w:t>
+            </w:r>
+          </w:p>
+        </w:tc>
+        <w:tc>
+          <w:tcPr>
+            <w:tcW w:w="1753" w:type="dxa"/>
+            <w:vAlign w:val="center"/>
+          </w:tcPr>
+          <w:p>
+            <w:pPr>
+              <w:pStyle w:val="Ttulo2"/>
+              <w:keepNext w:val="0"/>
+              <w:keepLines w:val="0"/>
+              <w:jc w:val="center"/>
+              <w:outlineLvl w:val="1"/>
+              <w:rPr>
+                <w:b w:val="0"/>
+                <w:color w:val="000000" w:themeColor="text1"/>
+                <w:sz w:val="24"/>
+                <w:szCs w:val="24"/>
+                <w:u w:val="single"/>
+                <w:lang w:val="pt-BR"/>
+              </w:rPr>
+            </w:pPr>
+            <w:r>
+              <w:rPr>
+                <w:b w:val="0"/>
+                <w:color w:val="000000" w:themeColor="text1"/>
+                <w:sz w:val="24"/>
+                <w:szCs w:val="24"/>
+              </w:rPr>
+              <w:t>Fila</w:t>
+            </w:r>
+          </w:p>
+        </w:tc>
+        <w:tc>
+          <w:tcPr>
+            <w:tcW w:w="2055" w:type="dxa"/>
+            <w:vAlign w:val="center"/>
+          </w:tcPr>
+          <w:p>
+            <w:pPr>
+              <w:pStyle w:val="Ttulo2"/>
+              <w:keepNext w:val="0"/>
+              <w:keepLines w:val="0"/>
+              <w:jc w:val="center"/>
+              <w:outlineLvl w:val="1"/>
+              <w:rPr>
+                <w:b w:val="0"/>
+                <w:color w:val="000000" w:themeColor="text1"/>
+                <w:sz w:val="24"/>
+                <w:szCs w:val="24"/>
+                <w:u w:val="single"/>
+                <w:lang w:val="pt-BR"/>
+              </w:rPr>
+            </w:pPr>
+            <w:r>
+              <w:rPr>
+                <w:b w:val="0"/>
+                <w:color w:val="000000" w:themeColor="text1"/>
+                <w:sz w:val="24"/>
+                <w:szCs w:val="24"/>
+              </w:rPr>
+              <w:t>Tela da fila</w:t>
+            </w:r>
+          </w:p>
+        </w:tc>
+      </w:tr>
+      <w:tr>
+        <w:tc>
+          <w:tcPr>
+            <w:tcW w:w="3970" w:type="dxa"/>
+            <w:vAlign w:val="center"/>
+          </w:tcPr>
+          <w:p>
+            <w:pPr>
+              <w:pStyle w:val="Ttulo2"/>
+              <w:keepNext w:val="0"/>
+              <w:keepLines w:val="0"/>
+              <w:jc w:val="center"/>
+              <w:outlineLvl w:val="1"/>
+              <w:rPr>
+                <w:b w:val="0"/>
+                <w:color w:val="000000" w:themeColor="text1"/>
+                <w:sz w:val="24"/>
+                <w:szCs w:val="24"/>
+                <w:u w:val="single"/>
+                <w:lang w:val="pt-BR"/>
+              </w:rPr>
+            </w:pPr>
+            <w:r>
+              <w:rPr>
+                <w:b w:val="0"/>
+                <w:color w:val="000000" w:themeColor="text1"/>
+                <w:sz w:val="24"/>
+                <w:szCs w:val="24"/>
+              </w:rPr>
+              <w:t>RF12 — Geração de relatórios</w:t>
+            </w:r>
+          </w:p>
+        </w:tc>
+        <w:tc>
+          <w:tcPr>
+            <w:tcW w:w="748" w:type="dxa"/>
+            <w:vAlign w:val="center"/>
+          </w:tcPr>
+          <w:p>
+            <w:pPr>
+              <w:pStyle w:val="Ttulo2"/>
+              <w:keepNext w:val="0"/>
+              <w:keepLines w:val="0"/>
+              <w:jc w:val="center"/>
+              <w:outlineLvl w:val="1"/>
+              <w:rPr>
+                <w:b w:val="0"/>
+                <w:color w:val="000000" w:themeColor="text1"/>
+                <w:sz w:val="24"/>
+                <w:szCs w:val="24"/>
+                <w:u w:val="single"/>
+                <w:lang w:val="pt-BR"/>
+              </w:rPr>
+            </w:pPr>
+            <w:r>
+              <w:rPr>
+                <w:b w:val="0"/>
+                <w:color w:val="000000" w:themeColor="text1"/>
+                <w:sz w:val="24"/>
+                <w:szCs w:val="24"/>
+              </w:rPr>
+              <w:t>UC03</w:t>
+            </w:r>
+          </w:p>
+        </w:tc>
+        <w:tc>
+          <w:tcPr>
+            <w:tcW w:w="1681" w:type="dxa"/>
+            <w:vAlign w:val="center"/>
+          </w:tcPr>
+          <w:p>
+            <w:pPr>
+              <w:pStyle w:val="Ttulo2"/>
+              <w:keepNext w:val="0"/>
+              <w:keepLines w:val="0"/>
+              <w:jc w:val="center"/>
+              <w:outlineLvl w:val="1"/>
+              <w:rPr>
+                <w:b w:val="0"/>
+                <w:color w:val="000000" w:themeColor="text1"/>
+                <w:sz w:val="24"/>
+                <w:szCs w:val="24"/>
+                <w:u w:val="single"/>
+                <w:lang w:val="pt-BR"/>
+              </w:rPr>
+            </w:pPr>
+            <w:r>
+              <w:rPr>
+                <w:b w:val="0"/>
+                <w:color w:val="000000" w:themeColor="text1"/>
+                <w:sz w:val="24"/>
+                <w:szCs w:val="24"/>
+              </w:rPr>
+              <w:t>RN06</w:t>
+            </w:r>
+          </w:p>
+        </w:tc>
+        <w:tc>
+          <w:tcPr>
+            <w:tcW w:w="1753" w:type="dxa"/>
+            <w:vAlign w:val="center"/>
+          </w:tcPr>
+          <w:p>
+            <w:pPr>
+              <w:pStyle w:val="Ttulo2"/>
+              <w:keepNext w:val="0"/>
+              <w:keepLines w:val="0"/>
+              <w:jc w:val="center"/>
+              <w:outlineLvl w:val="1"/>
+              <w:rPr>
+                <w:b w:val="0"/>
+                <w:color w:val="000000" w:themeColor="text1"/>
+                <w:sz w:val="24"/>
+                <w:szCs w:val="24"/>
+                <w:u w:val="single"/>
+                <w:lang w:val="pt-BR"/>
+              </w:rPr>
+            </w:pPr>
+            <w:r>
+              <w:rPr>
+                <w:b w:val="0"/>
+                <w:color w:val="000000" w:themeColor="text1"/>
+                <w:sz w:val="24"/>
+                <w:szCs w:val="24"/>
+              </w:rPr>
+              <w:t>Atendimento</w:t>
+            </w:r>
+          </w:p>
+        </w:tc>
+        <w:tc>
+          <w:tcPr>
+            <w:tcW w:w="2055" w:type="dxa"/>
+            <w:vAlign w:val="center"/>
+          </w:tcPr>
+          <w:p>
+            <w:pPr>
+              <w:pStyle w:val="Ttulo2"/>
+              <w:keepNext w:val="0"/>
+              <w:keepLines w:val="0"/>
+              <w:jc w:val="center"/>
+              <w:outlineLvl w:val="1"/>
+              <w:rPr>
+                <w:b w:val="0"/>
+                <w:color w:val="000000" w:themeColor="text1"/>
+                <w:sz w:val="24"/>
+                <w:szCs w:val="24"/>
+                <w:u w:val="single"/>
+                <w:lang w:val="pt-BR"/>
+              </w:rPr>
+            </w:pPr>
+            <w:r>
+              <w:rPr>
+                <w:b w:val="0"/>
+                <w:color w:val="000000" w:themeColor="text1"/>
+                <w:sz w:val="24"/>
+                <w:szCs w:val="24"/>
+              </w:rPr>
+              <w:t>Tela de relatórios</w:t>
+            </w:r>
+          </w:p>
+        </w:tc>
+      </w:tr>
+    </w:tbl>
+    <w:p>
+      <w:pPr>
+        <w:pStyle w:val="Ttulo2"/>
+        <w:keepNext w:val="0"/>
+        <w:keepLines w:val="0"/>
+        <w:rPr>
+          <w:u w:val="single"/>
+          <w:lang w:val="pt-BR"/>
+        </w:rPr>
+      </w:pPr>
+    </w:p>
+    <w:p>
+      <w:pPr>
+        <w:pStyle w:val="Ttulo2"/>
+        <w:keepNext w:val="0"/>
+        <w:keepLines w:val="0"/>
+        <w:rPr>
+          <w:lang w:val="pt-BR"/>
+        </w:rPr>
+      </w:pPr>
+    </w:p>
+    <w:p>
+      <w:pPr>
+        <w:pStyle w:val="Ttulo2"/>
+        <w:keepNext w:val="0"/>
+        <w:keepLines w:val="0"/>
+        <w:rPr>
+          <w:lang w:val="pt-BR"/>
+        </w:rPr>
+      </w:pPr>
+      <w:r>
+        <w:rPr>
+          <w:lang w:val="pt-BR"/>
+        </w:rPr>
+        <w:t xml:space="preserve">6.0 Modelo de </w:t>
+      </w:r>
+      <w:r>
+        <w:rPr>
+          <w:lang w:val="pt-BR"/>
+        </w:rPr>
+        <w:t>Dominio</w:t>
+      </w:r>
+    </w:p>
+    <w:p>
+      <w:pPr>
+        <w:rPr>
+          <w:lang w:val="pt-BR"/>
+        </w:rPr>
+      </w:pPr>
+      <w:r>
+        <w:rPr>
+          <w:lang w:val="pt-BR"/>
+        </w:rPr>
+        <w:pict w14:anchorId="0269D5D7">
+          <v:shapetype id="_x0000_t75" coordsize="21600,21600" o:spt="75" o:preferrelative="t" path="m@4@5l@4@11@9@11@9@5xe" filled="f" stroked="f">
+            <v:stroke joinstyle="miter"/>
+            <v:formulas>
+              <v:f eqn="if lineDrawn pixelLineWidth 0"/>
+              <v:f eqn="sum @0 1 0"/>
+              <v:f eqn="sum 0 0 @1"/>
+              <v:f eqn="prod @2 1 2"/>
+              <v:f eqn="prod @3 21600 pixelWidth"/>
+              <v:f eqn="prod @3 21600 pixelHeight"/>
+              <v:f eqn="sum @0 0 1"/>
+              <v:f eqn="prod @6 1 2"/>
+              <v:f eqn="prod @7 21600 pixelWidth"/>
+              <v:f eqn="sum @8 21600 0"/>
+              <v:f eqn="prod @7 21600 pixelHeight"/>
+              <v:f eqn="sum @10 21600 0"/>
+            </v:formulas>
+            <v:path o:extrusionok="f" gradientshapeok="t" o:connecttype="rect"/>
+            <o:lock v:ext="edit" aspectratio="t"/>
+          </v:shapetype>
+          <v:shape id="_x0000_i1027" type="#_x0000_t75" style="width:441.75pt;height:191.25pt">
+            <v:imagedata r:id="rId10" o:title="6_Modelo_de_Dominio"/>
+          </v:shape>
+        </w:pict>
+      </w:r>
+    </w:p>
+    <w:p>
+      <w:pPr>
+        <w:pStyle w:val="Ttulo2"/>
+        <w:keepNext w:val="0"/>
+        <w:keepLines w:val="0"/>
+        <w:rPr>
+          <w:lang w:val="pt-BR"/>
+        </w:rPr>
+      </w:pPr>
+      <w:r>
+        <w:rPr>
+          <w:lang w:val="pt-BR"/>
+        </w:rPr>
+        <w:t xml:space="preserve">7.0 Classes de </w:t>
+      </w:r>
+      <w:r>
+        <w:rPr>
+          <w:lang w:val="pt-BR"/>
+        </w:rPr>
+        <w:t>recorte</w:t>
+      </w:r>
+      <w:r>
+        <w:rPr>
+          <w:lang w:val="pt-BR"/>
+        </w:rPr>
+        <w:t xml:space="preserve"> </w:t>
+      </w:r>
+      <w:r>
+        <w:rPr>
+          <w:lang w:val="pt-BR"/>
+        </w:rPr>
+        <w:pict w14:anchorId="54D75CB1">
+          <v:shape id="_x0000_i1028" type="#_x0000_t75" style="width:441pt;height:123.75pt">
+            <v:imagedata r:id="rId11" o:title="7_Classes_de_recorte"/>
+          </v:shape>
+        </w:pict>
+      </w:r>
+    </w:p>
+    <w:p>
+      <w:pPr>
+        <w:pStyle w:val="Ttulo2"/>
+        <w:keepNext w:val="0"/>
+        <w:keepLines w:val="0"/>
+        <w:rPr>
+          <w:lang w:val="pt-BR"/>
+        </w:rPr>
+      </w:pPr>
+      <w:r>
+        <w:rPr>
+          <w:lang w:val="pt-BR"/>
+        </w:rPr>
+        <w:t>8</w:t>
+      </w:r>
+      <w:r>
+        <w:rPr>
+          <w:lang w:val="pt-BR"/>
+        </w:rPr>
+        <w:t>.0 Demonstração da aplicação</w:t>
       </w:r>
     </w:p>
     <w:p>
@@ -6628,7 +8879,7 @@
           <w:szCs w:val="20"/>
         </w:rPr>
       </w:pPr>
-      <w:hyperlink r:id="rId10" w:history="1">
+      <w:hyperlink r:id="rId12" w:history="1">
         <w:r>
           <w:rPr>
             <w:rStyle w:val="Hyperlink"/>
@@ -6648,8 +8899,6 @@
       </w:pPr>
       <w:r>
         <w:br/>
-      </w:r>
-      <w:r>
         <w:t xml:space="preserve"> </w:t>
       </w:r>
     </w:p>
@@ -6660,6 +8909,7 @@
       <w:r>
         <w:rPr>
           <w:noProof/>
+          <w:lang w:val="pt-BR" w:eastAsia="pt-BR"/>
         </w:rPr>
         <w:lastRenderedPageBreak/>
         <w:drawing>
@@ -6678,7 +8928,7 @@
                     <pic:cNvPicPr/>
                   </pic:nvPicPr>
                   <pic:blipFill>
-                    <a:blip r:embed="rId11"/>
+                    <a:blip r:embed="rId13"/>
                     <a:stretch>
                       <a:fillRect/>
                     </a:stretch>
@@ -6701,6 +8951,7 @@
       <w:r>
         <w:rPr>
           <w:noProof/>
+          <w:lang w:val="pt-BR" w:eastAsia="pt-BR"/>
         </w:rPr>
         <w:lastRenderedPageBreak/>
         <w:drawing>
@@ -6719,7 +8970,7 @@
                     <pic:cNvPicPr/>
                   </pic:nvPicPr>
                   <pic:blipFill>
-                    <a:blip r:embed="rId12"/>
+                    <a:blip r:embed="rId14"/>
                     <a:stretch>
                       <a:fillRect/>
                     </a:stretch>
@@ -6750,6 +9001,7 @@
       <w:r>
         <w:rPr>
           <w:noProof/>
+          <w:lang w:val="pt-BR" w:eastAsia="pt-BR"/>
         </w:rPr>
         <w:drawing>
           <wp:inline distT="0" distB="0" distL="0" distR="0" wp14:anchorId="16AEDB16" wp14:editId="6E8C4A85">
@@ -6767,7 +9019,7 @@
                     <pic:cNvPicPr/>
                   </pic:nvPicPr>
                   <pic:blipFill>
-                    <a:blip r:embed="rId13"/>
+                    <a:blip r:embed="rId15"/>
                     <a:stretch>
                       <a:fillRect/>
                     </a:stretch>
@@ -6795,6 +9047,7 @@
       <w:r>
         <w:rPr>
           <w:noProof/>
+          <w:lang w:val="pt-BR" w:eastAsia="pt-BR"/>
         </w:rPr>
         <w:lastRenderedPageBreak/>
         <w:drawing>
@@ -6813,7 +9066,7 @@
                     <pic:cNvPicPr/>
                   </pic:nvPicPr>
                   <pic:blipFill>
-                    <a:blip r:embed="rId14"/>
+                    <a:blip r:embed="rId16"/>
                     <a:stretch>
                       <a:fillRect/>
                     </a:stretch>
@@ -6844,6 +9097,7 @@
       <w:r>
         <w:rPr>
           <w:noProof/>
+          <w:lang w:val="pt-BR" w:eastAsia="pt-BR"/>
         </w:rPr>
         <w:drawing>
           <wp:inline distT="0" distB="0" distL="0" distR="0" wp14:anchorId="72E88704" wp14:editId="661DC874">
@@ -6861,7 +9115,7 @@
                     <pic:cNvPicPr/>
                   </pic:nvPicPr>
                   <pic:blipFill>
-                    <a:blip r:embed="rId15"/>
+                    <a:blip r:embed="rId17"/>
                     <a:stretch>
                       <a:fillRect/>
                     </a:stretch>
@@ -6893,7 +9147,7 @@
 </file>
 
 <file path=word/numbering.xml><?xml version="1.0" encoding="utf-8"?>
-<w:numbering xmlns:wpc="http://schemas.microsoft.com/office/word/2010/wordprocessingCanvas" xmlns:cx="http://schemas.microsoft.com/office/drawing/2014/chartex" xmlns:cx1="http://schemas.microsoft.com/office/drawing/2015/9/8/chartex" xmlns:cx2="http://schemas.microsoft.com/office/drawing/2015/10/21/chartex" xmlns:cx3="http://schemas.microsoft.com/office/drawing/2016/5/9/chartex" xmlns:cx4="http://schemas.microsoft.com/office/drawing/2016/5/10/chartex" xmlns:cx5="http://schemas.microsoft.com/office/drawing/2016/5/11/chartex" xmlns:cx6="http://schemas.microsoft.com/office/drawing/2016/5/12/chartex" xmlns:cx7="http://schemas.microsoft.com/office/drawing/2016/5/13/chartex" xmlns:cx8="http://schemas.microsoft.com/office/drawing/2016/5/14/chartex" xmlns:mc="http://schemas.openxmlformats.org/markup-compatibility/2006" xmlns:aink="http://schemas.microsoft.com/office/drawing/2016/ink" xmlns:am3d="http://schemas.microsoft.com/office/drawing/2017/model3d" xmlns:o="urn:schemas-microsoft-com:office:office" xmlns:oel="http://schemas.microsoft.com/office/2019/extlst" xmlns:r="http://schemas.openxmlformats.org/officeDocument/2006/relationships" xmlns:m="http://schemas.openxmlformats.org/officeDocument/2006/math" xmlns:v="urn:schemas-microsoft-com:vml" xmlns:wp14="http://schemas.microsoft.com/office/word/2010/wordprocessingDrawing" xmlns:wp="http://schemas.openxmlformats.org/drawingml/2006/wordprocessingDrawing" xmlns:w10="urn:schemas-microsoft-com:office:word" xmlns:w="http://schemas.openxmlformats.org/wordprocessingml/2006/main" xmlns:w14="http://schemas.microsoft.com/office/word/2010/wordml" xmlns:w15="http://schemas.microsoft.com/office/word/2012/wordml" xmlns:w16cex="http://schemas.microsoft.com/office/word/2018/wordml/cex" xmlns:w16cid="http://schemas.microsoft.com/office/word/2016/wordml/cid" xmlns:w16="http://schemas.microsoft.com/office/word/2018/wordml" xmlns:w16du="http://schemas.microsoft.com/office/word/2023/wordml/word16du" xmlns:w16sdtdh="http://schemas.microsoft.com/office/word/2020/wordml/sdtdatahash" xmlns:w16sdtfl="http://schemas.microsoft.com/office/word/2024/wordml/sdtformatlock" xmlns:w16se="http://schemas.microsoft.com/office/word/2015/wordml/symex" xmlns:wpg="http://schemas.microsoft.com/office/word/2010/wordprocessingGroup" xmlns:wpi="http://schemas.microsoft.com/office/word/2010/wordprocessingInk" xmlns:wne="http://schemas.microsoft.com/office/word/2006/wordml" xmlns:wps="http://schemas.microsoft.com/office/word/2010/wordprocessingShape" mc:Ignorable="w14 w15 w16se w16cid w16 w16cex w16sdtdh w16sdtfl w16du wp14">
+<w:numbering xmlns:wpc="http://schemas.microsoft.com/office/word/2010/wordprocessingCanvas" xmlns:cx="http://schemas.microsoft.com/office/drawing/2014/chartex" xmlns:mc="http://schemas.openxmlformats.org/markup-compatibility/2006" xmlns:o="urn:schemas-microsoft-com:office:office" xmlns:r="http://schemas.openxmlformats.org/officeDocument/2006/relationships" xmlns:m="http://schemas.openxmlformats.org/officeDocument/2006/math" xmlns:v="urn:schemas-microsoft-com:vml" xmlns:wp14="http://schemas.microsoft.com/office/word/2010/wordprocessingDrawing" xmlns:wp="http://schemas.openxmlformats.org/drawingml/2006/wordprocessingDrawing" xmlns:w10="urn:schemas-microsoft-com:office:word" xmlns:w="http://schemas.openxmlformats.org/wordprocessingml/2006/main" xmlns:w14="http://schemas.microsoft.com/office/word/2010/wordml" xmlns:w15="http://schemas.microsoft.com/office/word/2012/wordml" xmlns:w16se="http://schemas.microsoft.com/office/word/2015/wordml/symex" xmlns:wpg="http://schemas.microsoft.com/office/word/2010/wordprocessingGroup" xmlns:wpi="http://schemas.microsoft.com/office/word/2010/wordprocessingInk" xmlns:wne="http://schemas.microsoft.com/office/word/2006/wordml" xmlns:wps="http://schemas.microsoft.com/office/word/2010/wordprocessingShape" mc:Ignorable="w14 w15 w16se wp14">
   <w:abstractNum w:abstractNumId="0" w15:restartNumberingAfterBreak="0">
     <w:nsid w:val="FFFFFF7C"/>
     <w:multiLevelType w:val="singleLevel"/>
@@ -10312,107 +12566,107 @@
       </w:rPr>
     </w:lvl>
   </w:abstractNum>
-  <w:num w:numId="1" w16cid:durableId="113796165">
+  <w:num w:numId="1">
     <w:abstractNumId w:val="8"/>
   </w:num>
-  <w:num w:numId="2" w16cid:durableId="2125610831">
+  <w:num w:numId="2">
     <w:abstractNumId w:val="6"/>
   </w:num>
-  <w:num w:numId="3" w16cid:durableId="1484615683">
+  <w:num w:numId="3">
     <w:abstractNumId w:val="5"/>
   </w:num>
-  <w:num w:numId="4" w16cid:durableId="2071687276">
+  <w:num w:numId="4">
     <w:abstractNumId w:val="4"/>
   </w:num>
-  <w:num w:numId="5" w16cid:durableId="1347367992">
+  <w:num w:numId="5">
     <w:abstractNumId w:val="7"/>
   </w:num>
-  <w:num w:numId="6" w16cid:durableId="1751808489">
+  <w:num w:numId="6">
     <w:abstractNumId w:val="3"/>
   </w:num>
-  <w:num w:numId="7" w16cid:durableId="279456403">
+  <w:num w:numId="7">
     <w:abstractNumId w:val="2"/>
   </w:num>
-  <w:num w:numId="8" w16cid:durableId="161438325">
+  <w:num w:numId="8">
     <w:abstractNumId w:val="1"/>
   </w:num>
-  <w:num w:numId="9" w16cid:durableId="1664626881">
+  <w:num w:numId="9">
     <w:abstractNumId w:val="0"/>
   </w:num>
-  <w:num w:numId="10" w16cid:durableId="939065543">
+  <w:num w:numId="10">
     <w:abstractNumId w:val="31"/>
   </w:num>
-  <w:num w:numId="11" w16cid:durableId="1986621082">
+  <w:num w:numId="11">
     <w:abstractNumId w:val="26"/>
   </w:num>
-  <w:num w:numId="12" w16cid:durableId="507714539">
+  <w:num w:numId="12">
     <w:abstractNumId w:val="12"/>
   </w:num>
-  <w:num w:numId="13" w16cid:durableId="191462264">
+  <w:num w:numId="13">
     <w:abstractNumId w:val="19"/>
   </w:num>
-  <w:num w:numId="14" w16cid:durableId="1792357140">
+  <w:num w:numId="14">
     <w:abstractNumId w:val="10"/>
   </w:num>
-  <w:num w:numId="15" w16cid:durableId="150222394">
+  <w:num w:numId="15">
     <w:abstractNumId w:val="17"/>
   </w:num>
-  <w:num w:numId="16" w16cid:durableId="551186641">
+  <w:num w:numId="16">
     <w:abstractNumId w:val="11"/>
   </w:num>
-  <w:num w:numId="17" w16cid:durableId="490102495">
+  <w:num w:numId="17">
     <w:abstractNumId w:val="21"/>
   </w:num>
-  <w:num w:numId="18" w16cid:durableId="1225070313">
+  <w:num w:numId="18">
     <w:abstractNumId w:val="28"/>
   </w:num>
-  <w:num w:numId="19" w16cid:durableId="1850950211">
+  <w:num w:numId="19">
     <w:abstractNumId w:val="15"/>
   </w:num>
-  <w:num w:numId="20" w16cid:durableId="924529886">
+  <w:num w:numId="20">
     <w:abstractNumId w:val="20"/>
   </w:num>
-  <w:num w:numId="21" w16cid:durableId="1017122785">
+  <w:num w:numId="21">
     <w:abstractNumId w:val="30"/>
   </w:num>
-  <w:num w:numId="22" w16cid:durableId="994606957">
+  <w:num w:numId="22">
     <w:abstractNumId w:val="27"/>
   </w:num>
-  <w:num w:numId="23" w16cid:durableId="1357776662">
+  <w:num w:numId="23">
     <w:abstractNumId w:val="23"/>
   </w:num>
-  <w:num w:numId="24" w16cid:durableId="1595898928">
+  <w:num w:numId="24">
     <w:abstractNumId w:val="9"/>
   </w:num>
-  <w:num w:numId="25" w16cid:durableId="1263301147">
+  <w:num w:numId="25">
     <w:abstractNumId w:val="14"/>
   </w:num>
-  <w:num w:numId="26" w16cid:durableId="505243755">
+  <w:num w:numId="26">
     <w:abstractNumId w:val="24"/>
   </w:num>
-  <w:num w:numId="27" w16cid:durableId="2131707524">
+  <w:num w:numId="27">
     <w:abstractNumId w:val="13"/>
   </w:num>
-  <w:num w:numId="28" w16cid:durableId="2002078682">
+  <w:num w:numId="28">
     <w:abstractNumId w:val="29"/>
   </w:num>
-  <w:num w:numId="29" w16cid:durableId="1158231915">
+  <w:num w:numId="29">
     <w:abstractNumId w:val="16"/>
   </w:num>
-  <w:num w:numId="30" w16cid:durableId="871380593">
+  <w:num w:numId="30">
     <w:abstractNumId w:val="22"/>
   </w:num>
-  <w:num w:numId="31" w16cid:durableId="1458181800">
+  <w:num w:numId="31">
     <w:abstractNumId w:val="18"/>
   </w:num>
-  <w:num w:numId="32" w16cid:durableId="1198739028">
+  <w:num w:numId="32">
     <w:abstractNumId w:val="25"/>
   </w:num>
 </w:numbering>
 </file>
 
 <file path=word/styles.xml><?xml version="1.0" encoding="utf-8"?>
-<w:styles xmlns:mc="http://schemas.openxmlformats.org/markup-compatibility/2006" xmlns:r="http://schemas.openxmlformats.org/officeDocument/2006/relationships" xmlns:w="http://schemas.openxmlformats.org/wordprocessingml/2006/main" xmlns:w14="http://schemas.microsoft.com/office/word/2010/wordml" xmlns:w15="http://schemas.microsoft.com/office/word/2012/wordml" xmlns:w16cex="http://schemas.microsoft.com/office/word/2018/wordml/cex" xmlns:w16cid="http://schemas.microsoft.com/office/word/2016/wordml/cid" xmlns:w16="http://schemas.microsoft.com/office/word/2018/wordml" xmlns:w16du="http://schemas.microsoft.com/office/word/2023/wordml/word16du" xmlns:w16sdtdh="http://schemas.microsoft.com/office/word/2020/wordml/sdtdatahash" xmlns:w16sdtfl="http://schemas.microsoft.com/office/word/2024/wordml/sdtformatlock" xmlns:w16se="http://schemas.microsoft.com/office/word/2015/wordml/symex" mc:Ignorable="w14 w15 w16se w16cid w16 w16cex w16sdtdh w16sdtfl w16du">
+<w:styles xmlns:mc="http://schemas.openxmlformats.org/markup-compatibility/2006" xmlns:r="http://schemas.openxmlformats.org/officeDocument/2006/relationships" xmlns:w="http://schemas.openxmlformats.org/wordprocessingml/2006/main" xmlns:w14="http://schemas.microsoft.com/office/word/2010/wordml" xmlns:w15="http://schemas.microsoft.com/office/word/2012/wordml" xmlns:w16se="http://schemas.microsoft.com/office/word/2015/wordml/symex" mc:Ignorable="w14 w15 w16se">
   <w:docDefaults>
     <w:rPrDefault>
       <w:rPr>
@@ -10428,7 +12682,7 @@
       </w:pPr>
     </w:pPrDefault>
   </w:docDefaults>
-  <w:latentStyles w:defLockedState="0" w:defUIPriority="99" w:defSemiHidden="0" w:defUnhideWhenUsed="0" w:defQFormat="0" w:count="376">
+  <w:latentStyles w:defLockedState="0" w:defUIPriority="99" w:defSemiHidden="0" w:defUnhideWhenUsed="0" w:defQFormat="0" w:count="371">
     <w:lsdException w:name="Normal" w:uiPriority="0" w:qFormat="1"/>
     <w:lsdException w:name="heading 1" w:uiPriority="9" w:qFormat="1"/>
     <w:lsdException w:name="heading 2" w:semiHidden="1" w:uiPriority="9" w:unhideWhenUsed="1" w:qFormat="1"/>
@@ -10791,11 +13045,6 @@
     <w:lsdException w:name="List Table 5 Dark Accent 6" w:uiPriority="50"/>
     <w:lsdException w:name="List Table 6 Colorful Accent 6" w:uiPriority="51"/>
     <w:lsdException w:name="List Table 7 Colorful Accent 6" w:uiPriority="52"/>
-    <w:lsdException w:name="Mention" w:semiHidden="1" w:unhideWhenUsed="1"/>
-    <w:lsdException w:name="Smart Hyperlink" w:semiHidden="1" w:unhideWhenUsed="1"/>
-    <w:lsdException w:name="Hashtag" w:semiHidden="1" w:unhideWhenUsed="1"/>
-    <w:lsdException w:name="Unresolved Mention" w:semiHidden="1" w:unhideWhenUsed="1"/>
-    <w:lsdException w:name="Smart Link" w:semiHidden="1" w:unhideWhenUsed="1"/>
   </w:latentStyles>
   <w:style w:type="paragraph" w:default="1" w:styleId="Normal">
     <w:name w:val="Normal"/>
@@ -21819,7 +24068,7 @@
       <w:lang w:val="pt-BR" w:eastAsia="pt-BR"/>
     </w:rPr>
   </w:style>
-  <w:style w:type="character" w:styleId="MenoPendente">
+  <w:style w:type="character" w:customStyle="1" w:styleId="UnresolvedMention">
     <w:name w:val="Unresolved Mention"/>
     <w:basedOn w:val="Fontepargpadro"/>
     <w:uiPriority w:val="99"/>
@@ -22159,7 +24408,7 @@
 </file>
 
 <file path=customXml/itemProps1.xml><?xml version="1.0" encoding="utf-8"?>
-<ds:datastoreItem xmlns:ds="http://schemas.openxmlformats.org/officeDocument/2006/customXml" ds:itemID="{CC8A2444-8CA1-4448-A6CE-8064BF0305B0}">
+<ds:datastoreItem xmlns:ds="http://schemas.openxmlformats.org/officeDocument/2006/customXml" ds:itemID="{684EA06F-3395-49D9-9E6B-32AB594D2125}">
   <ds:schemaRefs>
     <ds:schemaRef ds:uri="http://schemas.openxmlformats.org/officeDocument/2006/bibliography"/>
   </ds:schemaRefs>

</xml_diff>

<commit_message>
Add usos de I.A. no final
</commit_message>
<xml_diff>
--- a/Engenharia_de_Software/Trabalho_m1/Docs_V2/Trabalho_V2.docx
+++ b/Engenharia_de_Software/Trabalho_m1/Docs_V2/Trabalho_V2.docx
@@ -6629,8 +6629,6 @@
                 <w:lang w:val="pt-BR"/>
               </w:rPr>
             </w:pPr>
-            <w:bookmarkStart w:id="5" w:name="_GoBack"/>
-            <w:bookmarkEnd w:id="5"/>
             <w:r>
               <w:rPr>
                 <w:bCs w:val="0"/>
@@ -9136,6 +9134,416 @@
         </w:drawing>
       </w:r>
     </w:p>
+    <w:p>
+      <w:pPr>
+        <w:pStyle w:val="Ttulo2"/>
+        <w:keepNext w:val="0"/>
+        <w:keepLines w:val="0"/>
+        <w:rPr>
+          <w:lang w:val="pt-BR"/>
+        </w:rPr>
+      </w:pPr>
+      <w:r>
+        <w:rPr>
+          <w:lang w:val="pt-BR"/>
+        </w:rPr>
+        <w:t>9</w:t>
+      </w:r>
+      <w:r>
+        <w:rPr>
+          <w:lang w:val="pt-BR"/>
+        </w:rPr>
+        <w:t xml:space="preserve">.0 </w:t>
+      </w:r>
+      <w:r>
+        <w:rPr>
+          <w:lang w:val="pt-BR"/>
+        </w:rPr>
+        <w:t>Uso de I.A.</w:t>
+      </w:r>
+    </w:p>
+    <w:p>
+      <w:pPr>
+        <w:rPr>
+          <w:lang w:val="pt-BR"/>
+        </w:rPr>
+      </w:pPr>
+    </w:p>
+    <w:p>
+      <w:pPr>
+        <w:pStyle w:val="Ttulo2"/>
+      </w:pPr>
+      <w:r>
+        <w:t>F</w:t>
+      </w:r>
+      <w:r>
+        <w:t>erramenta utilizada</w:t>
+      </w:r>
+      <w:r>
+        <w:t xml:space="preserve"> </w:t>
+      </w:r>
+      <w:r>
+        <w:t>–</w:t>
+      </w:r>
+      <w:r>
+        <w:t xml:space="preserve"> CHATGPT</w:t>
+      </w:r>
+      <w:r>
+        <w:t xml:space="preserve"> – Gemini – Claude</w:t>
+      </w:r>
+      <w:bookmarkStart w:id="5" w:name="_GoBack"/>
+      <w:bookmarkEnd w:id="5"/>
+    </w:p>
+    <w:p>
+      <w:pPr>
+        <w:pStyle w:val="NormalWeb"/>
+      </w:pPr>
+      <w:r>
+        <w:t>Foi utilizada uma ferramenta de Inteligência Artificial generativa como apoio complementar durante o desenvolvimento do trabalho acadêmico.</w:t>
+      </w:r>
+    </w:p>
+    <w:p>
+      <w:r>
+        <w:lastRenderedPageBreak/>
+        <w:pict w14:anchorId="244BFE07">
+          <v:rect id="_x0000_i1029" style="width:0;height:1.5pt" o:hralign="center" o:hrstd="t" o:hr="t" fillcolor="#a0a0a0" stroked="f"/>
+        </w:pict>
+      </w:r>
+    </w:p>
+    <w:p>
+      <w:pPr>
+        <w:pStyle w:val="Ttulo2"/>
+      </w:pPr>
+      <w:r>
+        <w:t>Forma de utilização</w:t>
+      </w:r>
+    </w:p>
+    <w:p>
+      <w:pPr>
+        <w:pStyle w:val="NormalWeb"/>
+      </w:pPr>
+      <w:r>
+        <w:t>A IA foi utilizada principalmente para:</w:t>
+      </w:r>
+    </w:p>
+    <w:p>
+      <w:pPr>
+        <w:numPr>
+          <w:ilvl w:val="0"/>
+          <w:numId w:val="33"/>
+        </w:numPr>
+        <w:spacing w:before="100" w:beforeAutospacing="1" w:after="100" w:afterAutospacing="1" w:line="240" w:lineRule="auto"/>
+      </w:pPr>
+      <w:r>
+        <w:t xml:space="preserve">apoio na revisão textual e ortográfica; </w:t>
+      </w:r>
+    </w:p>
+    <w:p>
+      <w:pPr>
+        <w:numPr>
+          <w:ilvl w:val="0"/>
+          <w:numId w:val="33"/>
+        </w:numPr>
+        <w:spacing w:before="100" w:beforeAutospacing="1" w:after="100" w:afterAutospacing="1" w:line="240" w:lineRule="auto"/>
+      </w:pPr>
+      <w:r>
+        <w:t xml:space="preserve">auxílio na organização estrutural do documento; </w:t>
+      </w:r>
+    </w:p>
+    <w:p>
+      <w:pPr>
+        <w:numPr>
+          <w:ilvl w:val="0"/>
+          <w:numId w:val="33"/>
+        </w:numPr>
+        <w:spacing w:before="100" w:beforeAutospacing="1" w:after="100" w:afterAutospacing="1" w:line="240" w:lineRule="auto"/>
+      </w:pPr>
+      <w:r>
+        <w:t xml:space="preserve">sugestões de melhorias em requisitos funcionais e regras de negócio; </w:t>
+      </w:r>
+    </w:p>
+    <w:p>
+      <w:pPr>
+        <w:numPr>
+          <w:ilvl w:val="0"/>
+          <w:numId w:val="33"/>
+        </w:numPr>
+        <w:spacing w:before="100" w:beforeAutospacing="1" w:after="100" w:afterAutospacing="1" w:line="240" w:lineRule="auto"/>
+      </w:pPr>
+      <w:r>
+        <w:t xml:space="preserve">apoio na padronização de diagramas UML e BPMN; </w:t>
+      </w:r>
+    </w:p>
+    <w:p>
+      <w:pPr>
+        <w:numPr>
+          <w:ilvl w:val="0"/>
+          <w:numId w:val="33"/>
+        </w:numPr>
+        <w:spacing w:before="100" w:beforeAutospacing="1" w:after="100" w:afterAutospacing="1" w:line="240" w:lineRule="auto"/>
+      </w:pPr>
+      <w:r>
+        <w:t xml:space="preserve">geração de exemplos iniciais para refinamento pela equipe; </w:t>
+      </w:r>
+    </w:p>
+    <w:p>
+      <w:pPr>
+        <w:numPr>
+          <w:ilvl w:val="0"/>
+          <w:numId w:val="33"/>
+        </w:numPr>
+        <w:spacing w:before="100" w:beforeAutospacing="1" w:after="100" w:afterAutospacing="1" w:line="240" w:lineRule="auto"/>
+      </w:pPr>
+      <w:r>
+        <w:t xml:space="preserve">auxílio na adequação do documento ao template solicitado pela disciplina. </w:t>
+      </w:r>
+    </w:p>
+    <w:p>
+      <w:pPr>
+        <w:spacing w:after="0"/>
+      </w:pPr>
+      <w:r>
+        <w:pict w14:anchorId="125D2139">
+          <v:rect id="_x0000_i1030" style="width:0;height:1.5pt" o:hralign="center" o:hrstd="t" o:hr="t" fillcolor="#a0a0a0" stroked="f"/>
+        </w:pict>
+      </w:r>
+    </w:p>
+    <w:p>
+      <w:pPr>
+        <w:pStyle w:val="Ttulo2"/>
+      </w:pPr>
+      <w:r>
+        <w:t>Participação da equipe</w:t>
+      </w:r>
+    </w:p>
+    <w:p>
+      <w:pPr>
+        <w:pStyle w:val="NormalWeb"/>
+      </w:pPr>
+      <w:r>
+        <w:t>Todo o conteúdo gerado com auxílio da IA foi revisado, validado e adaptado pelos integrantes do grupo antes da inclusão na versão final do projeto.</w:t>
+      </w:r>
+    </w:p>
+    <w:p>
+      <w:pPr>
+        <w:pStyle w:val="NormalWeb"/>
+      </w:pPr>
+      <w:r>
+        <w:t>A equipe realizou:</w:t>
+      </w:r>
+    </w:p>
+    <w:p>
+      <w:pPr>
+        <w:numPr>
+          <w:ilvl w:val="0"/>
+          <w:numId w:val="34"/>
+        </w:numPr>
+        <w:spacing w:before="100" w:beforeAutospacing="1" w:after="100" w:afterAutospacing="1" w:line="240" w:lineRule="auto"/>
+      </w:pPr>
+      <w:r>
+        <w:t xml:space="preserve">correções conceituais; </w:t>
+      </w:r>
+    </w:p>
+    <w:p>
+      <w:pPr>
+        <w:numPr>
+          <w:ilvl w:val="0"/>
+          <w:numId w:val="34"/>
+        </w:numPr>
+        <w:spacing w:before="100" w:beforeAutospacing="1" w:after="100" w:afterAutospacing="1" w:line="240" w:lineRule="auto"/>
+      </w:pPr>
+      <w:r>
+        <w:t xml:space="preserve">ajustes de modelagem; </w:t>
+      </w:r>
+    </w:p>
+    <w:p>
+      <w:pPr>
+        <w:numPr>
+          <w:ilvl w:val="0"/>
+          <w:numId w:val="34"/>
+        </w:numPr>
+        <w:spacing w:before="100" w:beforeAutospacing="1" w:after="100" w:afterAutospacing="1" w:line="240" w:lineRule="auto"/>
+      </w:pPr>
+      <w:r>
+        <w:t xml:space="preserve">reorganização de requisitos; </w:t>
+      </w:r>
+    </w:p>
+    <w:p>
+      <w:pPr>
+        <w:numPr>
+          <w:ilvl w:val="0"/>
+          <w:numId w:val="34"/>
+        </w:numPr>
+        <w:spacing w:before="100" w:beforeAutospacing="1" w:after="100" w:afterAutospacing="1" w:line="240" w:lineRule="auto"/>
+      </w:pPr>
+      <w:r>
+        <w:t xml:space="preserve">revisão dos diagramas; </w:t>
+      </w:r>
+    </w:p>
+    <w:p>
+      <w:pPr>
+        <w:numPr>
+          <w:ilvl w:val="0"/>
+          <w:numId w:val="34"/>
+        </w:numPr>
+        <w:spacing w:before="100" w:beforeAutospacing="1" w:after="100" w:afterAutospacing="1" w:line="240" w:lineRule="auto"/>
+      </w:pPr>
+      <w:r>
+        <w:t xml:space="preserve">adaptação ao contexto do projeto de extensão; </w:t>
+      </w:r>
+    </w:p>
+    <w:p>
+      <w:pPr>
+        <w:numPr>
+          <w:ilvl w:val="0"/>
+          <w:numId w:val="34"/>
+        </w:numPr>
+        <w:spacing w:before="100" w:beforeAutospacing="1" w:after="100" w:afterAutospacing="1" w:line="240" w:lineRule="auto"/>
+      </w:pPr>
+      <w:r>
+        <w:t xml:space="preserve">validação dos artefatos produzidos. </w:t>
+      </w:r>
+    </w:p>
+    <w:p>
+      <w:pPr>
+        <w:spacing w:after="0"/>
+      </w:pPr>
+      <w:r>
+        <w:pict w14:anchorId="19D0308C">
+          <v:rect id="_x0000_i1031" style="width:0;height:1.5pt" o:hralign="center" o:hrstd="t" o:hr="t" fillcolor="#a0a0a0" stroked="f"/>
+        </w:pict>
+      </w:r>
+    </w:p>
+    <w:p>
+      <w:pPr>
+        <w:pStyle w:val="Ttulo2"/>
+      </w:pPr>
+      <w:r>
+        <w:t>Artefatos com apoio parcial de IA</w:t>
+      </w:r>
+    </w:p>
+    <w:p>
+      <w:pPr>
+        <w:pStyle w:val="NormalWeb"/>
+      </w:pPr>
+      <w:r>
+        <w:t>Os seguintes itens tiveram apoio parcial de IA durante o desenvolvimento:</w:t>
+      </w:r>
+    </w:p>
+    <w:p>
+      <w:pPr>
+        <w:numPr>
+          <w:ilvl w:val="0"/>
+          <w:numId w:val="35"/>
+        </w:numPr>
+        <w:spacing w:before="100" w:beforeAutospacing="1" w:after="100" w:afterAutospacing="1" w:line="240" w:lineRule="auto"/>
+      </w:pPr>
+      <w:r>
+        <w:t xml:space="preserve">Visão Geral e Escopo; </w:t>
+      </w:r>
+    </w:p>
+    <w:p>
+      <w:pPr>
+        <w:numPr>
+          <w:ilvl w:val="0"/>
+          <w:numId w:val="35"/>
+        </w:numPr>
+        <w:spacing w:before="100" w:beforeAutospacing="1" w:after="100" w:afterAutospacing="1" w:line="240" w:lineRule="auto"/>
+      </w:pPr>
+      <w:r>
+        <w:t xml:space="preserve">Requisitos Funcionais e Não Funcionais; </w:t>
+      </w:r>
+    </w:p>
+    <w:p>
+      <w:pPr>
+        <w:numPr>
+          <w:ilvl w:val="0"/>
+          <w:numId w:val="35"/>
+        </w:numPr>
+        <w:spacing w:before="100" w:beforeAutospacing="1" w:after="100" w:afterAutospacing="1" w:line="240" w:lineRule="auto"/>
+      </w:pPr>
+      <w:r>
+        <w:t xml:space="preserve">Regras de Negócio; </w:t>
+      </w:r>
+    </w:p>
+    <w:p>
+      <w:pPr>
+        <w:numPr>
+          <w:ilvl w:val="0"/>
+          <w:numId w:val="35"/>
+        </w:numPr>
+        <w:spacing w:before="100" w:beforeAutospacing="1" w:after="100" w:afterAutospacing="1" w:line="240" w:lineRule="auto"/>
+      </w:pPr>
+      <w:r>
+        <w:t xml:space="preserve">Especificações de Casos de Uso; </w:t>
+      </w:r>
+    </w:p>
+    <w:p>
+      <w:pPr>
+        <w:numPr>
+          <w:ilvl w:val="0"/>
+          <w:numId w:val="35"/>
+        </w:numPr>
+        <w:spacing w:before="100" w:beforeAutospacing="1" w:after="100" w:afterAutospacing="1" w:line="240" w:lineRule="auto"/>
+      </w:pPr>
+      <w:r>
+        <w:t xml:space="preserve">Revisão textual do documento; </w:t>
+      </w:r>
+    </w:p>
+    <w:p>
+      <w:pPr>
+        <w:numPr>
+          <w:ilvl w:val="0"/>
+          <w:numId w:val="35"/>
+        </w:numPr>
+        <w:spacing w:before="100" w:beforeAutospacing="1" w:after="100" w:afterAutospacing="1" w:line="240" w:lineRule="auto"/>
+      </w:pPr>
+      <w:r>
+        <w:t xml:space="preserve">Sugestões de estrutura para diagramas UML e BPMN. </w:t>
+      </w:r>
+    </w:p>
+    <w:p>
+      <w:pPr>
+        <w:spacing w:after="0"/>
+      </w:pPr>
+      <w:r>
+        <w:pict w14:anchorId="62E31E1C">
+          <v:rect id="_x0000_i1032" style="width:0;height:1.5pt" o:hralign="center" o:hrstd="t" o:hr="t" fillcolor="#a0a0a0" stroked="f"/>
+        </w:pict>
+      </w:r>
+    </w:p>
+    <w:p>
+      <w:pPr>
+        <w:pStyle w:val="Ttulo2"/>
+      </w:pPr>
+      <w:r>
+        <w:lastRenderedPageBreak/>
+        <w:t>Observação</w:t>
+      </w:r>
+    </w:p>
+    <w:p>
+      <w:pPr>
+        <w:pStyle w:val="NormalWeb"/>
+      </w:pPr>
+      <w:r>
+        <w:t>A Inteligência Artificial foi utilizada apenas como ferramenta de apoio acadêmico, não substituindo a participação ativa dos integrantes na análise, modelagem, revisão e construção do trabalho.</w:t>
+      </w:r>
+    </w:p>
+    <w:p>
+      <w:pPr>
+        <w:rPr>
+          <w:lang w:val="pt-BR"/>
+        </w:rPr>
+      </w:pPr>
+    </w:p>
+    <w:p>
+      <w:pPr>
+        <w:spacing w:before="240" w:after="240"/>
+        <w:rPr>
+          <w:u w:val="single"/>
+        </w:rPr>
+      </w:pPr>
+    </w:p>
     <w:sectPr>
       <w:pgSz w:w="12240" w:h="15840"/>
       <w:pgMar w:top="1417" w:right="1701" w:bottom="1417" w:left="1701" w:header="720" w:footer="720" w:gutter="0"/>
@@ -9469,6 +9877,155 @@
     </w:lvl>
   </w:abstractNum>
   <w:abstractNum w:abstractNumId="10" w15:restartNumberingAfterBreak="0">
+    <w:nsid w:val="0AAF1122"/>
+    <w:multiLevelType w:val="multilevel"/>
+    <w:tmpl w:val="D0BC410C"/>
+    <w:lvl w:ilvl="0">
+      <w:start w:val="1"/>
+      <w:numFmt w:val="bullet"/>
+      <w:lvlText w:val=""/>
+      <w:lvlJc w:val="left"/>
+      <w:pPr>
+        <w:tabs>
+          <w:tab w:val="num" w:pos="720"/>
+        </w:tabs>
+        <w:ind w:left="720" w:hanging="360"/>
+      </w:pPr>
+      <w:rPr>
+        <w:rFonts w:ascii="Symbol" w:hAnsi="Symbol" w:hint="default"/>
+        <w:sz w:val="20"/>
+      </w:rPr>
+    </w:lvl>
+    <w:lvl w:ilvl="1" w:tentative="1">
+      <w:start w:val="1"/>
+      <w:numFmt w:val="bullet"/>
+      <w:lvlText w:val="o"/>
+      <w:lvlJc w:val="left"/>
+      <w:pPr>
+        <w:tabs>
+          <w:tab w:val="num" w:pos="1440"/>
+        </w:tabs>
+        <w:ind w:left="1440" w:hanging="360"/>
+      </w:pPr>
+      <w:rPr>
+        <w:rFonts w:ascii="Courier New" w:hAnsi="Courier New" w:hint="default"/>
+        <w:sz w:val="20"/>
+      </w:rPr>
+    </w:lvl>
+    <w:lvl w:ilvl="2" w:tentative="1">
+      <w:start w:val="1"/>
+      <w:numFmt w:val="bullet"/>
+      <w:lvlText w:val=""/>
+      <w:lvlJc w:val="left"/>
+      <w:pPr>
+        <w:tabs>
+          <w:tab w:val="num" w:pos="2160"/>
+        </w:tabs>
+        <w:ind w:left="2160" w:hanging="360"/>
+      </w:pPr>
+      <w:rPr>
+        <w:rFonts w:ascii="Wingdings" w:hAnsi="Wingdings" w:hint="default"/>
+        <w:sz w:val="20"/>
+      </w:rPr>
+    </w:lvl>
+    <w:lvl w:ilvl="3" w:tentative="1">
+      <w:start w:val="1"/>
+      <w:numFmt w:val="bullet"/>
+      <w:lvlText w:val=""/>
+      <w:lvlJc w:val="left"/>
+      <w:pPr>
+        <w:tabs>
+          <w:tab w:val="num" w:pos="2880"/>
+        </w:tabs>
+        <w:ind w:left="2880" w:hanging="360"/>
+      </w:pPr>
+      <w:rPr>
+        <w:rFonts w:ascii="Wingdings" w:hAnsi="Wingdings" w:hint="default"/>
+        <w:sz w:val="20"/>
+      </w:rPr>
+    </w:lvl>
+    <w:lvl w:ilvl="4" w:tentative="1">
+      <w:start w:val="1"/>
+      <w:numFmt w:val="bullet"/>
+      <w:lvlText w:val=""/>
+      <w:lvlJc w:val="left"/>
+      <w:pPr>
+        <w:tabs>
+          <w:tab w:val="num" w:pos="3600"/>
+        </w:tabs>
+        <w:ind w:left="3600" w:hanging="360"/>
+      </w:pPr>
+      <w:rPr>
+        <w:rFonts w:ascii="Wingdings" w:hAnsi="Wingdings" w:hint="default"/>
+        <w:sz w:val="20"/>
+      </w:rPr>
+    </w:lvl>
+    <w:lvl w:ilvl="5" w:tentative="1">
+      <w:start w:val="1"/>
+      <w:numFmt w:val="bullet"/>
+      <w:lvlText w:val=""/>
+      <w:lvlJc w:val="left"/>
+      <w:pPr>
+        <w:tabs>
+          <w:tab w:val="num" w:pos="4320"/>
+        </w:tabs>
+        <w:ind w:left="4320" w:hanging="360"/>
+      </w:pPr>
+      <w:rPr>
+        <w:rFonts w:ascii="Wingdings" w:hAnsi="Wingdings" w:hint="default"/>
+        <w:sz w:val="20"/>
+      </w:rPr>
+    </w:lvl>
+    <w:lvl w:ilvl="6" w:tentative="1">
+      <w:start w:val="1"/>
+      <w:numFmt w:val="bullet"/>
+      <w:lvlText w:val=""/>
+      <w:lvlJc w:val="left"/>
+      <w:pPr>
+        <w:tabs>
+          <w:tab w:val="num" w:pos="5040"/>
+        </w:tabs>
+        <w:ind w:left="5040" w:hanging="360"/>
+      </w:pPr>
+      <w:rPr>
+        <w:rFonts w:ascii="Wingdings" w:hAnsi="Wingdings" w:hint="default"/>
+        <w:sz w:val="20"/>
+      </w:rPr>
+    </w:lvl>
+    <w:lvl w:ilvl="7" w:tentative="1">
+      <w:start w:val="1"/>
+      <w:numFmt w:val="bullet"/>
+      <w:lvlText w:val=""/>
+      <w:lvlJc w:val="left"/>
+      <w:pPr>
+        <w:tabs>
+          <w:tab w:val="num" w:pos="5760"/>
+        </w:tabs>
+        <w:ind w:left="5760" w:hanging="360"/>
+      </w:pPr>
+      <w:rPr>
+        <w:rFonts w:ascii="Wingdings" w:hAnsi="Wingdings" w:hint="default"/>
+        <w:sz w:val="20"/>
+      </w:rPr>
+    </w:lvl>
+    <w:lvl w:ilvl="8" w:tentative="1">
+      <w:start w:val="1"/>
+      <w:numFmt w:val="bullet"/>
+      <w:lvlText w:val=""/>
+      <w:lvlJc w:val="left"/>
+      <w:pPr>
+        <w:tabs>
+          <w:tab w:val="num" w:pos="6480"/>
+        </w:tabs>
+        <w:ind w:left="6480" w:hanging="360"/>
+      </w:pPr>
+      <w:rPr>
+        <w:rFonts w:ascii="Wingdings" w:hAnsi="Wingdings" w:hint="default"/>
+        <w:sz w:val="20"/>
+      </w:rPr>
+    </w:lvl>
+  </w:abstractNum>
+  <w:abstractNum w:abstractNumId="11" w15:restartNumberingAfterBreak="0">
     <w:nsid w:val="0D761D2C"/>
     <w:multiLevelType w:val="multilevel"/>
     <w:tmpl w:val="956E22AE"/>
@@ -9617,7 +10174,7 @@
       </w:rPr>
     </w:lvl>
   </w:abstractNum>
-  <w:abstractNum w:abstractNumId="11" w15:restartNumberingAfterBreak="0">
+  <w:abstractNum w:abstractNumId="12" w15:restartNumberingAfterBreak="0">
     <w:nsid w:val="127C57B8"/>
     <w:multiLevelType w:val="multilevel"/>
     <w:tmpl w:val="C72454A8"/>
@@ -9766,7 +10323,7 @@
       </w:rPr>
     </w:lvl>
   </w:abstractNum>
-  <w:abstractNum w:abstractNumId="12" w15:restartNumberingAfterBreak="0">
+  <w:abstractNum w:abstractNumId="13" w15:restartNumberingAfterBreak="0">
     <w:nsid w:val="168E700B"/>
     <w:multiLevelType w:val="multilevel"/>
     <w:tmpl w:val="53509C8C"/>
@@ -9915,7 +10472,7 @@
       </w:rPr>
     </w:lvl>
   </w:abstractNum>
-  <w:abstractNum w:abstractNumId="13" w15:restartNumberingAfterBreak="0">
+  <w:abstractNum w:abstractNumId="14" w15:restartNumberingAfterBreak="0">
     <w:nsid w:val="17CA6321"/>
     <w:multiLevelType w:val="multilevel"/>
     <w:tmpl w:val="7D06DEDA"/>
@@ -10064,7 +10621,7 @@
       </w:rPr>
     </w:lvl>
   </w:abstractNum>
-  <w:abstractNum w:abstractNumId="14" w15:restartNumberingAfterBreak="0">
+  <w:abstractNum w:abstractNumId="15" w15:restartNumberingAfterBreak="0">
     <w:nsid w:val="210A388D"/>
     <w:multiLevelType w:val="multilevel"/>
     <w:tmpl w:val="69A6919C"/>
@@ -10213,7 +10770,7 @@
       </w:rPr>
     </w:lvl>
   </w:abstractNum>
-  <w:abstractNum w:abstractNumId="15" w15:restartNumberingAfterBreak="0">
+  <w:abstractNum w:abstractNumId="16" w15:restartNumberingAfterBreak="0">
     <w:nsid w:val="243C4A87"/>
     <w:multiLevelType w:val="multilevel"/>
     <w:tmpl w:val="E23818F6"/>
@@ -10362,7 +10919,7 @@
       </w:rPr>
     </w:lvl>
   </w:abstractNum>
-  <w:abstractNum w:abstractNumId="16" w15:restartNumberingAfterBreak="0">
+  <w:abstractNum w:abstractNumId="17" w15:restartNumberingAfterBreak="0">
     <w:nsid w:val="34BB3A9E"/>
     <w:multiLevelType w:val="multilevel"/>
     <w:tmpl w:val="01AC873C"/>
@@ -10475,7 +11032,7 @@
       </w:pPr>
     </w:lvl>
   </w:abstractNum>
-  <w:abstractNum w:abstractNumId="17" w15:restartNumberingAfterBreak="0">
+  <w:abstractNum w:abstractNumId="18" w15:restartNumberingAfterBreak="0">
     <w:nsid w:val="359D144D"/>
     <w:multiLevelType w:val="multilevel"/>
     <w:tmpl w:val="022495B0"/>
@@ -10588,7 +11145,7 @@
       </w:pPr>
     </w:lvl>
   </w:abstractNum>
-  <w:abstractNum w:abstractNumId="18" w15:restartNumberingAfterBreak="0">
+  <w:abstractNum w:abstractNumId="19" w15:restartNumberingAfterBreak="0">
     <w:nsid w:val="3E673974"/>
     <w:multiLevelType w:val="multilevel"/>
     <w:tmpl w:val="990E3398"/>
@@ -10737,7 +11294,7 @@
       </w:rPr>
     </w:lvl>
   </w:abstractNum>
-  <w:abstractNum w:abstractNumId="19" w15:restartNumberingAfterBreak="0">
+  <w:abstractNum w:abstractNumId="20" w15:restartNumberingAfterBreak="0">
     <w:nsid w:val="42C66480"/>
     <w:multiLevelType w:val="multilevel"/>
     <w:tmpl w:val="B5343FDA"/>
@@ -10886,7 +11443,7 @@
       </w:rPr>
     </w:lvl>
   </w:abstractNum>
-  <w:abstractNum w:abstractNumId="20" w15:restartNumberingAfterBreak="0">
+  <w:abstractNum w:abstractNumId="21" w15:restartNumberingAfterBreak="0">
     <w:nsid w:val="4E443BBD"/>
     <w:multiLevelType w:val="multilevel"/>
     <w:tmpl w:val="0622B17C"/>
@@ -11035,7 +11592,7 @@
       </w:rPr>
     </w:lvl>
   </w:abstractNum>
-  <w:abstractNum w:abstractNumId="21" w15:restartNumberingAfterBreak="0">
+  <w:abstractNum w:abstractNumId="22" w15:restartNumberingAfterBreak="0">
     <w:nsid w:val="4EC82643"/>
     <w:multiLevelType w:val="multilevel"/>
     <w:tmpl w:val="25EE6990"/>
@@ -11184,7 +11741,7 @@
       </w:rPr>
     </w:lvl>
   </w:abstractNum>
-  <w:abstractNum w:abstractNumId="22" w15:restartNumberingAfterBreak="0">
+  <w:abstractNum w:abstractNumId="23" w15:restartNumberingAfterBreak="0">
     <w:nsid w:val="53BA554B"/>
     <w:multiLevelType w:val="multilevel"/>
     <w:tmpl w:val="B846F180"/>
@@ -11333,7 +11890,7 @@
       </w:rPr>
     </w:lvl>
   </w:abstractNum>
-  <w:abstractNum w:abstractNumId="23" w15:restartNumberingAfterBreak="0">
+  <w:abstractNum w:abstractNumId="24" w15:restartNumberingAfterBreak="0">
     <w:nsid w:val="54D42318"/>
     <w:multiLevelType w:val="multilevel"/>
     <w:tmpl w:val="EE0E1BA4"/>
@@ -11482,7 +12039,7 @@
       </w:rPr>
     </w:lvl>
   </w:abstractNum>
-  <w:abstractNum w:abstractNumId="24" w15:restartNumberingAfterBreak="0">
+  <w:abstractNum w:abstractNumId="25" w15:restartNumberingAfterBreak="0">
     <w:nsid w:val="57E40F0F"/>
     <w:multiLevelType w:val="multilevel"/>
     <w:tmpl w:val="CDC6BB3A"/>
@@ -11631,7 +12188,7 @@
       </w:rPr>
     </w:lvl>
   </w:abstractNum>
-  <w:abstractNum w:abstractNumId="25" w15:restartNumberingAfterBreak="0">
+  <w:abstractNum w:abstractNumId="26" w15:restartNumberingAfterBreak="0">
     <w:nsid w:val="59F55827"/>
     <w:multiLevelType w:val="multilevel"/>
     <w:tmpl w:val="42F664A6"/>
@@ -11780,7 +12337,7 @@
       </w:rPr>
     </w:lvl>
   </w:abstractNum>
-  <w:abstractNum w:abstractNumId="26" w15:restartNumberingAfterBreak="0">
+  <w:abstractNum w:abstractNumId="27" w15:restartNumberingAfterBreak="0">
     <w:nsid w:val="5ED14307"/>
     <w:multiLevelType w:val="multilevel"/>
     <w:tmpl w:val="6CA2E042"/>
@@ -11893,7 +12450,7 @@
       </w:rPr>
     </w:lvl>
   </w:abstractNum>
-  <w:abstractNum w:abstractNumId="27" w15:restartNumberingAfterBreak="0">
+  <w:abstractNum w:abstractNumId="28" w15:restartNumberingAfterBreak="0">
     <w:nsid w:val="69D61493"/>
     <w:multiLevelType w:val="multilevel"/>
     <w:tmpl w:val="F3245FBE"/>
@@ -12006,7 +12563,7 @@
       </w:pPr>
     </w:lvl>
   </w:abstractNum>
-  <w:abstractNum w:abstractNumId="28" w15:restartNumberingAfterBreak="0">
+  <w:abstractNum w:abstractNumId="29" w15:restartNumberingAfterBreak="0">
     <w:nsid w:val="6A5045EE"/>
     <w:multiLevelType w:val="multilevel"/>
     <w:tmpl w:val="EAC8A29A"/>
@@ -12155,7 +12712,7 @@
       </w:rPr>
     </w:lvl>
   </w:abstractNum>
-  <w:abstractNum w:abstractNumId="29" w15:restartNumberingAfterBreak="0">
+  <w:abstractNum w:abstractNumId="30" w15:restartNumberingAfterBreak="0">
     <w:nsid w:val="6F5428CA"/>
     <w:multiLevelType w:val="multilevel"/>
     <w:tmpl w:val="FD7893F0"/>
@@ -12304,7 +12861,156 @@
       </w:rPr>
     </w:lvl>
   </w:abstractNum>
-  <w:abstractNum w:abstractNumId="30" w15:restartNumberingAfterBreak="0">
+  <w:abstractNum w:abstractNumId="31" w15:restartNumberingAfterBreak="0">
+    <w:nsid w:val="723352D2"/>
+    <w:multiLevelType w:val="multilevel"/>
+    <w:tmpl w:val="2092C1AA"/>
+    <w:lvl w:ilvl="0">
+      <w:start w:val="1"/>
+      <w:numFmt w:val="bullet"/>
+      <w:lvlText w:val=""/>
+      <w:lvlJc w:val="left"/>
+      <w:pPr>
+        <w:tabs>
+          <w:tab w:val="num" w:pos="720"/>
+        </w:tabs>
+        <w:ind w:left="720" w:hanging="360"/>
+      </w:pPr>
+      <w:rPr>
+        <w:rFonts w:ascii="Symbol" w:hAnsi="Symbol" w:hint="default"/>
+        <w:sz w:val="20"/>
+      </w:rPr>
+    </w:lvl>
+    <w:lvl w:ilvl="1" w:tentative="1">
+      <w:start w:val="1"/>
+      <w:numFmt w:val="bullet"/>
+      <w:lvlText w:val="o"/>
+      <w:lvlJc w:val="left"/>
+      <w:pPr>
+        <w:tabs>
+          <w:tab w:val="num" w:pos="1440"/>
+        </w:tabs>
+        <w:ind w:left="1440" w:hanging="360"/>
+      </w:pPr>
+      <w:rPr>
+        <w:rFonts w:ascii="Courier New" w:hAnsi="Courier New" w:hint="default"/>
+        <w:sz w:val="20"/>
+      </w:rPr>
+    </w:lvl>
+    <w:lvl w:ilvl="2" w:tentative="1">
+      <w:start w:val="1"/>
+      <w:numFmt w:val="bullet"/>
+      <w:lvlText w:val=""/>
+      <w:lvlJc w:val="left"/>
+      <w:pPr>
+        <w:tabs>
+          <w:tab w:val="num" w:pos="2160"/>
+        </w:tabs>
+        <w:ind w:left="2160" w:hanging="360"/>
+      </w:pPr>
+      <w:rPr>
+        <w:rFonts w:ascii="Wingdings" w:hAnsi="Wingdings" w:hint="default"/>
+        <w:sz w:val="20"/>
+      </w:rPr>
+    </w:lvl>
+    <w:lvl w:ilvl="3" w:tentative="1">
+      <w:start w:val="1"/>
+      <w:numFmt w:val="bullet"/>
+      <w:lvlText w:val=""/>
+      <w:lvlJc w:val="left"/>
+      <w:pPr>
+        <w:tabs>
+          <w:tab w:val="num" w:pos="2880"/>
+        </w:tabs>
+        <w:ind w:left="2880" w:hanging="360"/>
+      </w:pPr>
+      <w:rPr>
+        <w:rFonts w:ascii="Wingdings" w:hAnsi="Wingdings" w:hint="default"/>
+        <w:sz w:val="20"/>
+      </w:rPr>
+    </w:lvl>
+    <w:lvl w:ilvl="4" w:tentative="1">
+      <w:start w:val="1"/>
+      <w:numFmt w:val="bullet"/>
+      <w:lvlText w:val=""/>
+      <w:lvlJc w:val="left"/>
+      <w:pPr>
+        <w:tabs>
+          <w:tab w:val="num" w:pos="3600"/>
+        </w:tabs>
+        <w:ind w:left="3600" w:hanging="360"/>
+      </w:pPr>
+      <w:rPr>
+        <w:rFonts w:ascii="Wingdings" w:hAnsi="Wingdings" w:hint="default"/>
+        <w:sz w:val="20"/>
+      </w:rPr>
+    </w:lvl>
+    <w:lvl w:ilvl="5" w:tentative="1">
+      <w:start w:val="1"/>
+      <w:numFmt w:val="bullet"/>
+      <w:lvlText w:val=""/>
+      <w:lvlJc w:val="left"/>
+      <w:pPr>
+        <w:tabs>
+          <w:tab w:val="num" w:pos="4320"/>
+        </w:tabs>
+        <w:ind w:left="4320" w:hanging="360"/>
+      </w:pPr>
+      <w:rPr>
+        <w:rFonts w:ascii="Wingdings" w:hAnsi="Wingdings" w:hint="default"/>
+        <w:sz w:val="20"/>
+      </w:rPr>
+    </w:lvl>
+    <w:lvl w:ilvl="6" w:tentative="1">
+      <w:start w:val="1"/>
+      <w:numFmt w:val="bullet"/>
+      <w:lvlText w:val=""/>
+      <w:lvlJc w:val="left"/>
+      <w:pPr>
+        <w:tabs>
+          <w:tab w:val="num" w:pos="5040"/>
+        </w:tabs>
+        <w:ind w:left="5040" w:hanging="360"/>
+      </w:pPr>
+      <w:rPr>
+        <w:rFonts w:ascii="Wingdings" w:hAnsi="Wingdings" w:hint="default"/>
+        <w:sz w:val="20"/>
+      </w:rPr>
+    </w:lvl>
+    <w:lvl w:ilvl="7" w:tentative="1">
+      <w:start w:val="1"/>
+      <w:numFmt w:val="bullet"/>
+      <w:lvlText w:val=""/>
+      <w:lvlJc w:val="left"/>
+      <w:pPr>
+        <w:tabs>
+          <w:tab w:val="num" w:pos="5760"/>
+        </w:tabs>
+        <w:ind w:left="5760" w:hanging="360"/>
+      </w:pPr>
+      <w:rPr>
+        <w:rFonts w:ascii="Wingdings" w:hAnsi="Wingdings" w:hint="default"/>
+        <w:sz w:val="20"/>
+      </w:rPr>
+    </w:lvl>
+    <w:lvl w:ilvl="8" w:tentative="1">
+      <w:start w:val="1"/>
+      <w:numFmt w:val="bullet"/>
+      <w:lvlText w:val=""/>
+      <w:lvlJc w:val="left"/>
+      <w:pPr>
+        <w:tabs>
+          <w:tab w:val="num" w:pos="6480"/>
+        </w:tabs>
+        <w:ind w:left="6480" w:hanging="360"/>
+      </w:pPr>
+      <w:rPr>
+        <w:rFonts w:ascii="Wingdings" w:hAnsi="Wingdings" w:hint="default"/>
+        <w:sz w:val="20"/>
+      </w:rPr>
+    </w:lvl>
+  </w:abstractNum>
+  <w:abstractNum w:abstractNumId="32" w15:restartNumberingAfterBreak="0">
     <w:nsid w:val="74EA74B4"/>
     <w:multiLevelType w:val="multilevel"/>
     <w:tmpl w:val="BF721100"/>
@@ -12453,7 +13159,7 @@
       </w:rPr>
     </w:lvl>
   </w:abstractNum>
-  <w:abstractNum w:abstractNumId="31" w15:restartNumberingAfterBreak="0">
+  <w:abstractNum w:abstractNumId="33" w15:restartNumberingAfterBreak="0">
     <w:nsid w:val="763343AA"/>
     <w:multiLevelType w:val="multilevel"/>
     <w:tmpl w:val="15CEC9DE"/>
@@ -12563,6 +13269,155 @@
       </w:pPr>
       <w:rPr>
         <w:u w:val="none"/>
+      </w:rPr>
+    </w:lvl>
+  </w:abstractNum>
+  <w:abstractNum w:abstractNumId="34" w15:restartNumberingAfterBreak="0">
+    <w:nsid w:val="77960452"/>
+    <w:multiLevelType w:val="multilevel"/>
+    <w:tmpl w:val="C142891E"/>
+    <w:lvl w:ilvl="0">
+      <w:start w:val="1"/>
+      <w:numFmt w:val="bullet"/>
+      <w:lvlText w:val=""/>
+      <w:lvlJc w:val="left"/>
+      <w:pPr>
+        <w:tabs>
+          <w:tab w:val="num" w:pos="720"/>
+        </w:tabs>
+        <w:ind w:left="720" w:hanging="360"/>
+      </w:pPr>
+      <w:rPr>
+        <w:rFonts w:ascii="Symbol" w:hAnsi="Symbol" w:hint="default"/>
+        <w:sz w:val="20"/>
+      </w:rPr>
+    </w:lvl>
+    <w:lvl w:ilvl="1" w:tentative="1">
+      <w:start w:val="1"/>
+      <w:numFmt w:val="bullet"/>
+      <w:lvlText w:val="o"/>
+      <w:lvlJc w:val="left"/>
+      <w:pPr>
+        <w:tabs>
+          <w:tab w:val="num" w:pos="1440"/>
+        </w:tabs>
+        <w:ind w:left="1440" w:hanging="360"/>
+      </w:pPr>
+      <w:rPr>
+        <w:rFonts w:ascii="Courier New" w:hAnsi="Courier New" w:hint="default"/>
+        <w:sz w:val="20"/>
+      </w:rPr>
+    </w:lvl>
+    <w:lvl w:ilvl="2" w:tentative="1">
+      <w:start w:val="1"/>
+      <w:numFmt w:val="bullet"/>
+      <w:lvlText w:val=""/>
+      <w:lvlJc w:val="left"/>
+      <w:pPr>
+        <w:tabs>
+          <w:tab w:val="num" w:pos="2160"/>
+        </w:tabs>
+        <w:ind w:left="2160" w:hanging="360"/>
+      </w:pPr>
+      <w:rPr>
+        <w:rFonts w:ascii="Wingdings" w:hAnsi="Wingdings" w:hint="default"/>
+        <w:sz w:val="20"/>
+      </w:rPr>
+    </w:lvl>
+    <w:lvl w:ilvl="3" w:tentative="1">
+      <w:start w:val="1"/>
+      <w:numFmt w:val="bullet"/>
+      <w:lvlText w:val=""/>
+      <w:lvlJc w:val="left"/>
+      <w:pPr>
+        <w:tabs>
+          <w:tab w:val="num" w:pos="2880"/>
+        </w:tabs>
+        <w:ind w:left="2880" w:hanging="360"/>
+      </w:pPr>
+      <w:rPr>
+        <w:rFonts w:ascii="Wingdings" w:hAnsi="Wingdings" w:hint="default"/>
+        <w:sz w:val="20"/>
+      </w:rPr>
+    </w:lvl>
+    <w:lvl w:ilvl="4" w:tentative="1">
+      <w:start w:val="1"/>
+      <w:numFmt w:val="bullet"/>
+      <w:lvlText w:val=""/>
+      <w:lvlJc w:val="left"/>
+      <w:pPr>
+        <w:tabs>
+          <w:tab w:val="num" w:pos="3600"/>
+        </w:tabs>
+        <w:ind w:left="3600" w:hanging="360"/>
+      </w:pPr>
+      <w:rPr>
+        <w:rFonts w:ascii="Wingdings" w:hAnsi="Wingdings" w:hint="default"/>
+        <w:sz w:val="20"/>
+      </w:rPr>
+    </w:lvl>
+    <w:lvl w:ilvl="5" w:tentative="1">
+      <w:start w:val="1"/>
+      <w:numFmt w:val="bullet"/>
+      <w:lvlText w:val=""/>
+      <w:lvlJc w:val="left"/>
+      <w:pPr>
+        <w:tabs>
+          <w:tab w:val="num" w:pos="4320"/>
+        </w:tabs>
+        <w:ind w:left="4320" w:hanging="360"/>
+      </w:pPr>
+      <w:rPr>
+        <w:rFonts w:ascii="Wingdings" w:hAnsi="Wingdings" w:hint="default"/>
+        <w:sz w:val="20"/>
+      </w:rPr>
+    </w:lvl>
+    <w:lvl w:ilvl="6" w:tentative="1">
+      <w:start w:val="1"/>
+      <w:numFmt w:val="bullet"/>
+      <w:lvlText w:val=""/>
+      <w:lvlJc w:val="left"/>
+      <w:pPr>
+        <w:tabs>
+          <w:tab w:val="num" w:pos="5040"/>
+        </w:tabs>
+        <w:ind w:left="5040" w:hanging="360"/>
+      </w:pPr>
+      <w:rPr>
+        <w:rFonts w:ascii="Wingdings" w:hAnsi="Wingdings" w:hint="default"/>
+        <w:sz w:val="20"/>
+      </w:rPr>
+    </w:lvl>
+    <w:lvl w:ilvl="7" w:tentative="1">
+      <w:start w:val="1"/>
+      <w:numFmt w:val="bullet"/>
+      <w:lvlText w:val=""/>
+      <w:lvlJc w:val="left"/>
+      <w:pPr>
+        <w:tabs>
+          <w:tab w:val="num" w:pos="5760"/>
+        </w:tabs>
+        <w:ind w:left="5760" w:hanging="360"/>
+      </w:pPr>
+      <w:rPr>
+        <w:rFonts w:ascii="Wingdings" w:hAnsi="Wingdings" w:hint="default"/>
+        <w:sz w:val="20"/>
+      </w:rPr>
+    </w:lvl>
+    <w:lvl w:ilvl="8" w:tentative="1">
+      <w:start w:val="1"/>
+      <w:numFmt w:val="bullet"/>
+      <w:lvlText w:val=""/>
+      <w:lvlJc w:val="left"/>
+      <w:pPr>
+        <w:tabs>
+          <w:tab w:val="num" w:pos="6480"/>
+        </w:tabs>
+        <w:ind w:left="6480" w:hanging="360"/>
+      </w:pPr>
+      <w:rPr>
+        <w:rFonts w:ascii="Wingdings" w:hAnsi="Wingdings" w:hint="default"/>
+        <w:sz w:val="20"/>
       </w:rPr>
     </w:lvl>
   </w:abstractNum>
@@ -12594,73 +13449,82 @@
     <w:abstractNumId w:val="0"/>
   </w:num>
   <w:num w:numId="10">
-    <w:abstractNumId w:val="31"/>
+    <w:abstractNumId w:val="33"/>
   </w:num>
   <w:num w:numId="11">
-    <w:abstractNumId w:val="26"/>
+    <w:abstractNumId w:val="27"/>
   </w:num>
   <w:num w:numId="12">
+    <w:abstractNumId w:val="13"/>
+  </w:num>
+  <w:num w:numId="13">
+    <w:abstractNumId w:val="20"/>
+  </w:num>
+  <w:num w:numId="14">
+    <w:abstractNumId w:val="11"/>
+  </w:num>
+  <w:num w:numId="15">
+    <w:abstractNumId w:val="18"/>
+  </w:num>
+  <w:num w:numId="16">
     <w:abstractNumId w:val="12"/>
   </w:num>
-  <w:num w:numId="13">
-    <w:abstractNumId w:val="19"/>
+  <w:num w:numId="17">
+    <w:abstractNumId w:val="22"/>
   </w:num>
-  <w:num w:numId="14">
-    <w:abstractNumId w:val="10"/>
+  <w:num w:numId="18">
+    <w:abstractNumId w:val="29"/>
   </w:num>
-  <w:num w:numId="15">
-    <w:abstractNumId w:val="17"/>
+  <w:num w:numId="19">
+    <w:abstractNumId w:val="16"/>
   </w:num>
-  <w:num w:numId="16">
-    <w:abstractNumId w:val="11"/>
-  </w:num>
-  <w:num w:numId="17">
+  <w:num w:numId="20">
     <w:abstractNumId w:val="21"/>
   </w:num>
-  <w:num w:numId="18">
+  <w:num w:numId="21">
+    <w:abstractNumId w:val="32"/>
+  </w:num>
+  <w:num w:numId="22">
     <w:abstractNumId w:val="28"/>
   </w:num>
-  <w:num w:numId="19">
-    <w:abstractNumId w:val="15"/>
-  </w:num>
-  <w:num w:numId="20">
-    <w:abstractNumId w:val="20"/>
-  </w:num>
-  <w:num w:numId="21">
-    <w:abstractNumId w:val="30"/>
-  </w:num>
-  <w:num w:numId="22">
-    <w:abstractNumId w:val="27"/>
-  </w:num>
   <w:num w:numId="23">
-    <w:abstractNumId w:val="23"/>
+    <w:abstractNumId w:val="24"/>
   </w:num>
   <w:num w:numId="24">
     <w:abstractNumId w:val="9"/>
   </w:num>
   <w:num w:numId="25">
+    <w:abstractNumId w:val="15"/>
+  </w:num>
+  <w:num w:numId="26">
+    <w:abstractNumId w:val="25"/>
+  </w:num>
+  <w:num w:numId="27">
     <w:abstractNumId w:val="14"/>
   </w:num>
-  <w:num w:numId="26">
-    <w:abstractNumId w:val="24"/>
-  </w:num>
-  <w:num w:numId="27">
-    <w:abstractNumId w:val="13"/>
-  </w:num>
   <w:num w:numId="28">
-    <w:abstractNumId w:val="29"/>
+    <w:abstractNumId w:val="30"/>
   </w:num>
   <w:num w:numId="29">
-    <w:abstractNumId w:val="16"/>
+    <w:abstractNumId w:val="17"/>
   </w:num>
   <w:num w:numId="30">
-    <w:abstractNumId w:val="22"/>
+    <w:abstractNumId w:val="23"/>
   </w:num>
   <w:num w:numId="31">
-    <w:abstractNumId w:val="18"/>
+    <w:abstractNumId w:val="19"/>
   </w:num>
   <w:num w:numId="32">
-    <w:abstractNumId w:val="25"/>
+    <w:abstractNumId w:val="26"/>
+  </w:num>
+  <w:num w:numId="33">
+    <w:abstractNumId w:val="31"/>
+  </w:num>
+  <w:num w:numId="34">
+    <w:abstractNumId w:val="10"/>
+  </w:num>
+  <w:num w:numId="35">
+    <w:abstractNumId w:val="34"/>
   </w:num>
 </w:numbering>
 </file>
@@ -24408,7 +25272,7 @@
 </file>
 
 <file path=customXml/itemProps1.xml><?xml version="1.0" encoding="utf-8"?>
-<ds:datastoreItem xmlns:ds="http://schemas.openxmlformats.org/officeDocument/2006/customXml" ds:itemID="{684EA06F-3395-49D9-9E6B-32AB594D2125}">
+<ds:datastoreItem xmlns:ds="http://schemas.openxmlformats.org/officeDocument/2006/customXml" ds:itemID="{782C2C20-E347-49D5-83E7-64EB2D3ACAEC}">
   <ds:schemaRefs>
     <ds:schemaRef ds:uri="http://schemas.openxmlformats.org/officeDocument/2006/bibliography"/>
   </ds:schemaRefs>

</xml_diff>